<commit_message>
refactor: exact 3 targets x 4 questions (12 slides), remove wireframe artifacts, add direct jump bar
</commit_message>
<xml_diff>
--- a/SDG14_Official_Speaker_Script.docx
+++ b/SDG14_Official_Speaker_Script.docx
@@ -13,7 +13,7 @@
           <w:color w:val="0284C7"/>
           <w:sz w:val="40"/>
         </w:rPr>
-        <w:t>UNITED NATIONS SDG 14: LIFE BELOW WATER</w:t>
+        <w:t>SDG 14: LIFE BELOW WATER — OFFICIAL 6-SPEAKER SCRIPT</w:t>
       </w:r>
     </w:p>
     <w:p>
@@ -23,210 +23,27 @@
       <w:r>
         <w:rPr>
           <w:rFonts w:ascii="Arial" w:hAnsi="Arial"/>
-          <w:color w:val="64748B"/>
+          <w:i/>
           <w:sz w:val="22"/>
         </w:rPr>
-        <w:t>Official 6-Speaker Rehearsal Dossier &amp; Slide-by-Slide Script</w:t>
-        <w:br/>
-        <w:t>Targets 14.1, 14.2 &amp; 14.3 | Total Duration: 15:00 (2:30 per speaker)</w:t>
+        <w:t>Framework: 3 Targets × 4 Core Questions • 12 Slides Total • 15 Minutes (02:30 per Speaker)</w:t>
       </w:r>
     </w:p>
     <w:p>
       <w:pPr>
-        <w:spacing w:after="240"/>
-      </w:pPr>
-    </w:p>
-    <w:p>
-      <w:pPr>
-        <w:pStyle w:val="Heading1"/>
+        <w:jc w:val="center"/>
       </w:pPr>
       <w:r>
         <w:rPr>
-          <w:rFonts w:ascii="Arial" w:hAnsi="Arial"/>
-          <w:b/>
-          <w:color w:val="0284C7"/>
-          <w:sz w:val="28"/>
+          <w:color w:val="64748B"/>
+          <w:sz w:val="19"/>
         </w:rPr>
-        <w:t>TAB / SECTION: SPEAKER 1: THE BIG PICTURE &amp; CAUSAL CHAIN</w:t>
-      </w:r>
-    </w:p>
-    <w:tbl>
-      <w:tblPr>
-        <w:tblW w:type="auto" w:w="0"/>
-        <w:jc w:val="center"/>
-        <w:tblLayout w:type="fixed"/>
-        <w:tblLook w:firstColumn="1" w:firstRow="1" w:lastColumn="0" w:lastRow="0" w:noHBand="0" w:noVBand="1" w:val="04A0"/>
-      </w:tblPr>
-      <w:tblGrid>
-        <w:gridCol w:w="4824"/>
-        <w:gridCol w:w="4824"/>
-      </w:tblGrid>
-      <w:tr>
-        <w:tc>
-          <w:tcPr>
-            <w:tcW w:type="dxa" w:w="2592"/>
-            <w:shd w:fill="F1F5F9"/>
-          </w:tcPr>
-          <w:p>
-            <w:r>
-              <w:rPr>
-                <w:b/>
-              </w:rPr>
-              <w:t>Allocated Time:</w:t>
-            </w:r>
-          </w:p>
-        </w:tc>
-        <w:tc>
-          <w:tcPr>
-            <w:tcW w:type="dxa" w:w="7488"/>
-            <w:shd w:fill="FFFFFF"/>
-          </w:tcPr>
-          <w:p>
-            <w:r>
-              <w:t>00:00 - 02:30 (Target: 2 min 20 sec)</w:t>
-            </w:r>
-          </w:p>
-        </w:tc>
-      </w:tr>
-      <w:tr>
-        <w:tc>
-          <w:tcPr>
-            <w:tcW w:type="dxa" w:w="2592"/>
-            <w:shd w:fill="F1F5F9"/>
-          </w:tcPr>
-          <w:p>
-            <w:r>
-              <w:rPr>
-                <w:b/>
-              </w:rPr>
-              <w:t>Slides Covered:</w:t>
-            </w:r>
-          </w:p>
-        </w:tc>
-        <w:tc>
-          <w:tcPr>
-            <w:tcW w:type="dxa" w:w="7488"/>
-            <w:shd w:fill="FFFFFF"/>
-          </w:tcPr>
-          <w:p>
-            <w:r>
-              <w:t>Slide 1 &amp; Slide 2</w:t>
-            </w:r>
-          </w:p>
-        </w:tc>
-      </w:tr>
-      <w:tr>
-        <w:tc>
-          <w:tcPr>
-            <w:tcW w:type="dxa" w:w="2592"/>
-            <w:shd w:fill="F1F5F9"/>
-          </w:tcPr>
-          <w:p>
-            <w:r>
-              <w:rPr>
-                <w:b/>
-              </w:rPr>
-              <w:t>Core Focus:</w:t>
-            </w:r>
-          </w:p>
-        </w:tc>
-        <w:tc>
-          <w:tcPr>
-            <w:tcW w:type="dxa" w:w="7488"/>
-            <w:shd w:fill="FFFFFF"/>
-          </w:tcPr>
-          <w:p>
-            <w:r>
-              <w:t>Opening Hook, Overview of Targets 14.1-14.3, The 4 Core Questions, The Upstream-to-Abyss Risk Cascade</w:t>
-            </w:r>
-          </w:p>
-        </w:tc>
-      </w:tr>
-    </w:tbl>
-    <w:p>
-      <w:pPr>
-        <w:spacing w:after="160"/>
-      </w:pPr>
-    </w:p>
-    <w:p>
-      <w:pPr>
-        <w:pStyle w:val="Heading2"/>
-      </w:pPr>
-      <w:r>
-        <w:rPr>
-          <w:rFonts w:ascii="Arial" w:hAnsi="Arial"/>
-          <w:color w:val="0F172A"/>
-          <w:sz w:val="24"/>
-        </w:rPr>
-        <w:t>Verbatim Spoken English Script (Read Naturally):</w:t>
-      </w:r>
-    </w:p>
-    <w:p>
-      <w:pPr>
-        <w:spacing w:line="300" w:lineRule="auto" w:after="240"/>
-      </w:pPr>
-      <w:r>
-        <w:rPr>
-          <w:rFonts w:ascii="Arial" w:hAnsi="Arial"/>
-          <w:sz w:val="21"/>
-        </w:rPr>
-        <w:t>Good morning, professor and fellow classmates. Today, our team is presenting United Nations Sustainable Development Goal 14: Life Below Water.</w:t>
-        <w:br/>
-        <w:br/>
-        <w:t>The ocean generates over 50 percent of the oxygen we breathe, absorbs a quarter of all global carbon dioxide emissions, and directly sustains the livelihoods of over three billion human beings. Yet today, marine systems face unprecedented ecological disruption.</w:t>
-        <w:br/>
-        <w:br/>
-        <w:t>Our team focuses on three foundational targets: Target 14.1 on Marine Pollution; Target 14.2 on Ecosystem Resilience; and Target 14.3 on Ocean Acidification.</w:t>
-        <w:br/>
-        <w:br/>
-        <w:t>For each target, we systematically address four non-negotiable questions: First, what does the target aim to achieve? Second, what official indicators monitor global progress? Third, how are these indicators measured scientifically? And fourth, what international institutions and governance treaties enforce compliance?</w:t>
-        <w:br/>
-        <w:br/>
-        <w:t>[PAUSE — ADVANCE TO SLIDE 2]</w:t>
-        <w:br/>
-        <w:br/>
-        <w:t>Before diving into each target individually, look at how they connect. They do not operate in silos; they form an unbroken causal chain of risk.</w:t>
-        <w:br/>
-        <w:br/>
-        <w:t>It starts upstream under Target 14.1: agricultural fertilizers and city plastics exert massive pressure on coastal waters. That pressure travels into Target 14.2, where fragile coral reefs and mangrove nurseries suffer habitat degradation. And simultaneously, Target 14.3 monitors global ocean chemistry as excess atmospheric CO2 permanently alters the pH balance of the entire water column.</w:t>
-        <w:br/>
-        <w:br/>
-        <w:t>To understand the first line of defense, I now pass the floor to Speaker 2 to break down Target 14.1.</w:t>
+        <w:t>Prepared for: skrongdattv1@gmail.com (Kiris) • Formatted with Heading 1 for Google Docs Document Tabs</w:t>
       </w:r>
     </w:p>
     <w:p>
       <w:r>
-        <w:rPr>
-          <w:b/>
-          <w:color w:val="0284C7"/>
-        </w:rPr>
-        <w:t xml:space="preserve">Pronunciation Quick Guide: </w:t>
-      </w:r>
-      <w:r>
-        <w:rPr>
-          <w:i/>
-        </w:rPr>
-        <w:t>Ecosystem -&gt; [EE-koh-sis-tuhm] | Indicator -&gt; [IN-dih-kay-ter] | Acidification -&gt; [uh-sid-uh-fuh-KAY-shun]</w:t>
-      </w:r>
-    </w:p>
-    <w:p>
-      <w:r>
-        <w:rPr>
-          <w:b/>
-          <w:color w:val="E11D48"/>
-        </w:rPr>
-        <w:t xml:space="preserve">Handoff Cue: </w:t>
-      </w:r>
-      <w:r>
-        <w:rPr>
-          <w:b/>
-        </w:rPr>
-        <w:t>"I now hand over to Speaker 2, who will examine the source of marine pollution under Target 14.1."</w:t>
-      </w:r>
-    </w:p>
-    <w:p>
-      <w:r>
-        <w:br w:type="page"/>
+        <w:t>―――――――――――――――――――――――――――――――――――――――――――――――――――――――</w:t>
       </w:r>
     </w:p>
     <w:p>
@@ -238,168 +55,141 @@
           <w:rFonts w:ascii="Arial" w:hAnsi="Arial"/>
           <w:b/>
           <w:color w:val="0284C7"/>
-          <w:sz w:val="28"/>
+          <w:sz w:val="32"/>
         </w:rPr>
-        <w:t>TAB / SECTION: SPEAKER 2: TARGET 14.1 &amp; THE DUAL INDICATORS</w:t>
-      </w:r>
-    </w:p>
-    <w:tbl>
-      <w:tblPr>
-        <w:tblW w:type="auto" w:w="0"/>
-        <w:jc w:val="center"/>
-        <w:tblLayout w:type="fixed"/>
-        <w:tblLook w:firstColumn="1" w:firstRow="1" w:lastColumn="0" w:lastRow="0" w:noHBand="0" w:noVBand="1" w:val="04A0"/>
-      </w:tblPr>
-      <w:tblGrid>
-        <w:gridCol w:w="4824"/>
-        <w:gridCol w:w="4824"/>
-      </w:tblGrid>
-      <w:tr>
-        <w:tc>
-          <w:tcPr>
-            <w:tcW w:type="dxa" w:w="2592"/>
-            <w:shd w:fill="F1F5F9"/>
-          </w:tcPr>
-          <w:p>
-            <w:r>
-              <w:rPr>
-                <w:b/>
-              </w:rPr>
-              <w:t>Allocated Time:</w:t>
-            </w:r>
-          </w:p>
-        </w:tc>
-        <w:tc>
-          <w:tcPr>
-            <w:tcW w:type="dxa" w:w="7488"/>
-            <w:shd w:fill="FFFFFF"/>
-          </w:tcPr>
-          <w:p>
-            <w:r>
-              <w:t>02:30 - 05:00 (Target: 2 min 20 sec)</w:t>
-            </w:r>
-          </w:p>
-        </w:tc>
-      </w:tr>
-      <w:tr>
-        <w:tc>
-          <w:tcPr>
-            <w:tcW w:type="dxa" w:w="2592"/>
-            <w:shd w:fill="F1F5F9"/>
-          </w:tcPr>
-          <w:p>
-            <w:r>
-              <w:rPr>
-                <w:b/>
-              </w:rPr>
-              <w:t>Slides Covered:</w:t>
-            </w:r>
-          </w:p>
-        </w:tc>
-        <w:tc>
-          <w:tcPr>
-            <w:tcW w:type="dxa" w:w="7488"/>
-            <w:shd w:fill="FFFFFF"/>
-          </w:tcPr>
-          <w:p>
-            <w:r>
-              <w:t>Slide 3 &amp; Slide 4</w:t>
-            </w:r>
-          </w:p>
-        </w:tc>
-      </w:tr>
-      <w:tr>
-        <w:tc>
-          <w:tcPr>
-            <w:tcW w:type="dxa" w:w="2592"/>
-            <w:shd w:fill="F1F5F9"/>
-          </w:tcPr>
-          <w:p>
-            <w:r>
-              <w:rPr>
-                <w:b/>
-              </w:rPr>
-              <w:t>Core Focus:</w:t>
-            </w:r>
-          </w:p>
-        </w:tc>
-        <w:tc>
-          <w:tcPr>
-            <w:tcW w:type="dxa" w:w="7488"/>
-            <w:shd w:fill="FFFFFF"/>
-          </w:tcPr>
-          <w:p>
-            <w:r>
-              <w:t>Target 14.1 Mandate, The 80% Land-Based Origin, 2025 Deadline, Indicator 14.1.1(a) vs 14.1.1(b)</w:t>
-            </w:r>
-          </w:p>
-        </w:tc>
-      </w:tr>
-    </w:tbl>
-    <w:p>
-      <w:pPr>
-        <w:spacing w:after="160"/>
-      </w:pPr>
-    </w:p>
-    <w:p>
-      <w:pPr>
-        <w:pStyle w:val="Heading2"/>
-      </w:pPr>
-      <w:r>
-        <w:rPr>
-          <w:rFonts w:ascii="Arial" w:hAnsi="Arial"/>
-          <w:color w:val="0F172A"/>
-          <w:sz w:val="24"/>
-        </w:rPr>
-        <w:t>Verbatim Spoken English Script (Read Naturally):</w:t>
-      </w:r>
-    </w:p>
-    <w:p>
-      <w:pPr>
-        <w:spacing w:line="300" w:lineRule="auto" w:after="240"/>
-      </w:pPr>
-      <w:r>
-        <w:rPr>
-          <w:rFonts w:ascii="Arial" w:hAnsi="Arial"/>
-          <w:sz w:val="21"/>
-        </w:rPr>
-        <w:t>Thank you, Speaker 1. Hello everyone, I am Speaker 2.</w:t>
-        <w:br/>
-        <w:br/>
-        <w:t>Target 14.1 is the frontline defense of marine conservation. Its official mandate is clear: by 2025, prevent and significantly reduce marine pollution of all kinds, in particular from land-based activities.</w:t>
-        <w:br/>
-        <w:br/>
-        <w:t>Notice two critical facts here: First, up to 80 percent of all marine litter and pollution originates on dry land—through agricultural fertilizer runoff, untreated municipal wastewater, and mismanaged municipal solid waste flowing into river basins. Second, the official target deadline was set for 2025. That means we are already operating past the original timeline, making accelerated monitoring vital.</w:t>
-        <w:br/>
-        <w:br/>
-        <w:t>[PAUSE — ADVANCE TO SLIDE 4]</w:t>
-        <w:br/>
-        <w:br/>
-        <w:t>To monitor Target 14.1, the United Nations established Indicator 14.1.1, split into two distinct pathways.</w:t>
-        <w:br/>
-        <w:br/>
-        <w:t>Sub-indicator 14.1.1(a) is the Index of Coastal Eutrophication, or ICEP. This monitors invisible chemical pollution—specifically nitrogen and phosphorus from fertilizers. When excess nutrients wash into coastal seas, they cause catastrophic algal blooms that suck oxygen out of the water, creating suffocating dead zones.</w:t>
-        <w:br/>
-        <w:br/>
-        <w:t>Sub-indicator 14.1.1(b) is Plastic Debris Density. This monitors solid waste accumulation across two realms: floating macro- and micro-plastics in surface waters, and plastic trash accumulating along shorelines.</w:t>
-        <w:br/>
-        <w:br/>
-        <w:t>Now, how do scientists actually measure invisible fertilizer runoff and tons of scattered plastic? Speaker 3 will explain the scientific measurement methods and governance.</w:t>
+        <w:t>Speaker 1 — Target 14.1 Aim &amp; Indicators (Slides 1 &amp; 2)</w:t>
       </w:r>
     </w:p>
     <w:p>
       <w:r>
         <w:rPr>
           <w:b/>
-          <w:color w:val="0284C7"/>
+          <w:color w:val="475569"/>
+          <w:sz w:val="20"/>
         </w:rPr>
-        <w:t xml:space="preserve">Pronunciation Quick Guide: </w:t>
+        <w:t>Time Window: 00:00 to 02:30 (02:30 Target) • Role: Speaker 1 (Opening &amp; Target 14.1 Fundamentals)</w:t>
+      </w:r>
+    </w:p>
+    <w:p>
+      <w:r>
+        <w:rPr>
+          <w:b/>
+          <w:sz w:val="20"/>
+        </w:rPr>
+        <w:t xml:space="preserve">Pronunciation Guide: </w:t>
       </w:r>
       <w:r>
         <w:rPr>
           <w:i/>
+          <w:sz w:val="20"/>
         </w:rPr>
-        <w:t>Eutrophication -&gt; [yoo-truh-fuh-KAY-shun] | Phosphorus -&gt; [FOS-fuh-ruhs] | Debris -&gt; [duh-BREE (silent s)]</w:t>
+        <w:t>Eutrophication [yoo-truh-fuh-KAY-shun] | Phosphorus [FOS-fuh-ruhs] | Hypoxic [hy-POK-sik]</w:t>
+      </w:r>
+    </w:p>
+    <w:p>
+      <w:pPr>
+        <w:spacing w:line="300" w:lineRule="auto" w:after="120"/>
+      </w:pPr>
+      <w:r>
+        <w:rPr>
+          <w:rFonts w:ascii="Arial" w:hAnsi="Arial"/>
+          <w:b/>
+          <w:color w:val="0284C7"/>
+          <w:sz w:val="22"/>
+        </w:rPr>
+        <w:t>[ON SLIDE 01 — TARGET 14.1 AIM]</w:t>
+      </w:r>
+    </w:p>
+    <w:p>
+      <w:pPr>
+        <w:spacing w:line="300" w:lineRule="auto" w:after="120"/>
+      </w:pPr>
+      <w:r>
+        <w:rPr>
+          <w:rFonts w:ascii="Arial" w:hAnsi="Arial"/>
+          <w:color w:val="0F172A"/>
+          <w:sz w:val="22"/>
+        </w:rPr>
+        <w:t>Good morning, professor and fellow classmates. Today, our team is presenting United Nations Sustainable Development Goal 14: Life Below Water. Our study is built upon a rigorous matrix: three foundational targets examined across four essential questions.</w:t>
+      </w:r>
+    </w:p>
+    <w:p>
+      <w:pPr>
+        <w:spacing w:line="300" w:lineRule="auto" w:after="120"/>
+      </w:pPr>
+      <w:r>
+        <w:rPr>
+          <w:rFonts w:ascii="Arial" w:hAnsi="Arial"/>
+          <w:color w:val="0F172A"/>
+          <w:sz w:val="22"/>
+        </w:rPr>
+        <w:t>I begin with Target 14.1: Marine Pollution. Question 1 asks: What does this target aim to achieve?</w:t>
+      </w:r>
+    </w:p>
+    <w:p>
+      <w:pPr>
+        <w:spacing w:line="300" w:lineRule="auto" w:after="120"/>
+      </w:pPr>
+      <w:r>
+        <w:rPr>
+          <w:rFonts w:ascii="Arial" w:hAnsi="Arial"/>
+          <w:color w:val="0F172A"/>
+          <w:sz w:val="22"/>
+        </w:rPr>
+        <w:t>The official UN mandate is unequivocal: by 2025, prevent and significantly reduce marine pollution of all kinds, in particular from land-based activities. Notice two vital dimensions: First, up to 80 percent of all marine litter originates inland—carried by river basins from agricultural runoff and municipal solid waste. Second, 2025 was the original deadline, meaning global implementation is operating under severe time pressure.</w:t>
+      </w:r>
+    </w:p>
+    <w:p>
+      <w:pPr>
+        <w:spacing w:line="300" w:lineRule="auto" w:after="120"/>
+      </w:pPr>
+      <w:r>
+        <w:rPr>
+          <w:rFonts w:ascii="Arial" w:hAnsi="Arial"/>
+          <w:b/>
+          <w:color w:val="0284C7"/>
+          <w:sz w:val="22"/>
+        </w:rPr>
+        <w:t>[ADVANCE TO SLIDE 02 — INDICATOR 14.1.1]</w:t>
+      </w:r>
+    </w:p>
+    <w:p>
+      <w:pPr>
+        <w:spacing w:line="300" w:lineRule="auto" w:after="120"/>
+      </w:pPr>
+      <w:r>
+        <w:rPr>
+          <w:rFonts w:ascii="Arial" w:hAnsi="Arial"/>
+          <w:color w:val="0F172A"/>
+          <w:sz w:val="22"/>
+        </w:rPr>
+        <w:t>Question 2: What official indicators track this progress?</w:t>
+      </w:r>
+    </w:p>
+    <w:p>
+      <w:pPr>
+        <w:spacing w:line="300" w:lineRule="auto" w:after="120"/>
+      </w:pPr>
+      <w:r>
+        <w:rPr>
+          <w:rFonts w:ascii="Arial" w:hAnsi="Arial"/>
+          <w:color w:val="0F172A"/>
+          <w:sz w:val="22"/>
+        </w:rPr>
+        <w:t>The UN designated Indicator 14.1.1, split into two complementary monitoring pathways. Sub-indicator 14.1.1(a) is the Index of Coastal Eutrophication Potential, or ICEP. It tracks invisible chemical pollution—specifically nitrogen and phosphorus fertilizers. When excess nutrients wash into coastal waters, they spark massive algal blooms that consume dissolved oxygen, resulting in over 500 oceanic dead zones worldwide.</w:t>
+      </w:r>
+    </w:p>
+    <w:p>
+      <w:pPr>
+        <w:spacing w:line="300" w:lineRule="auto" w:after="120"/>
+      </w:pPr>
+      <w:r>
+        <w:rPr>
+          <w:rFonts w:ascii="Arial" w:hAnsi="Arial"/>
+          <w:color w:val="0F172A"/>
+          <w:sz w:val="22"/>
+        </w:rPr>
+        <w:t>Sub-indicator 14.1.1(b) is Plastic Debris Density, measuring both floating macro- and micro-plastics in surface waters and solid waste accumulation per kilometer of coastline.</w:t>
       </w:r>
     </w:p>
     <w:p>
@@ -408,18 +198,19 @@
           <w:b/>
           <w:color w:val="E11D48"/>
         </w:rPr>
-        <w:t xml:space="preserve">Handoff Cue: </w:t>
+        <w:t xml:space="preserve">🤝 Transition / Handoff Cue: </w:t>
       </w:r>
       <w:r>
         <w:rPr>
           <w:b/>
+          <w:i/>
         </w:rPr>
-        <w:t>"Speaker 3 will now walk us through how satellites and beach surveys turn these indicators into concrete global data."</w:t>
+        <w:t>"Speaker 2 will now explain how scientists measure this pollution from space and how international treaties govern it."</w:t>
       </w:r>
     </w:p>
     <w:p>
       <w:r>
-        <w:br w:type="page"/>
+        <w:t>―――――――――――――――――――――――――――――――――――――――――――――――――――――――</w:t>
       </w:r>
     </w:p>
     <w:p>
@@ -431,168 +222,154 @@
           <w:rFonts w:ascii="Arial" w:hAnsi="Arial"/>
           <w:b/>
           <w:color w:val="0284C7"/>
-          <w:sz w:val="28"/>
+          <w:sz w:val="32"/>
         </w:rPr>
-        <w:t>TAB / SECTION: SPEAKER 3: MEASUREMENT &amp; GOVERNANCE OF 14.1</w:t>
-      </w:r>
-    </w:p>
-    <w:tbl>
-      <w:tblPr>
-        <w:tblW w:type="auto" w:w="0"/>
-        <w:jc w:val="center"/>
-        <w:tblLayout w:type="fixed"/>
-        <w:tblLook w:firstColumn="1" w:firstRow="1" w:lastColumn="0" w:lastRow="0" w:noHBand="0" w:noVBand="1" w:val="04A0"/>
-      </w:tblPr>
-      <w:tblGrid>
-        <w:gridCol w:w="4824"/>
-        <w:gridCol w:w="4824"/>
-      </w:tblGrid>
-      <w:tr>
-        <w:tc>
-          <w:tcPr>
-            <w:tcW w:type="dxa" w:w="2592"/>
-            <w:shd w:fill="F1F5F9"/>
-          </w:tcPr>
-          <w:p>
-            <w:r>
-              <w:rPr>
-                <w:b/>
-              </w:rPr>
-              <w:t>Allocated Time:</w:t>
-            </w:r>
-          </w:p>
-        </w:tc>
-        <w:tc>
-          <w:tcPr>
-            <w:tcW w:type="dxa" w:w="7488"/>
-            <w:shd w:fill="FFFFFF"/>
-          </w:tcPr>
-          <w:p>
-            <w:r>
-              <w:t>05:00 - 07:30 (Target: 2 min 20 sec)</w:t>
-            </w:r>
-          </w:p>
-        </w:tc>
-      </w:tr>
-      <w:tr>
-        <w:tc>
-          <w:tcPr>
-            <w:tcW w:type="dxa" w:w="2592"/>
-            <w:shd w:fill="F1F5F9"/>
-          </w:tcPr>
-          <w:p>
-            <w:r>
-              <w:rPr>
-                <w:b/>
-              </w:rPr>
-              <w:t>Slides Covered:</w:t>
-            </w:r>
-          </w:p>
-        </w:tc>
-        <w:tc>
-          <w:tcPr>
-            <w:tcW w:type="dxa" w:w="7488"/>
-            <w:shd w:fill="FFFFFF"/>
-          </w:tcPr>
-          <w:p>
-            <w:r>
-              <w:t>Slide 5 &amp; Slide 6</w:t>
-            </w:r>
-          </w:p>
-        </w:tc>
-      </w:tr>
-      <w:tr>
-        <w:tc>
-          <w:tcPr>
-            <w:tcW w:type="dxa" w:w="2592"/>
-            <w:shd w:fill="F1F5F9"/>
-          </w:tcPr>
-          <w:p>
-            <w:r>
-              <w:rPr>
-                <w:b/>
-              </w:rPr>
-              <w:t>Core Focus:</w:t>
-            </w:r>
-          </w:p>
-        </w:tc>
-        <w:tc>
-          <w:tcPr>
-            <w:tcW w:type="dxa" w:w="7488"/>
-            <w:shd w:fill="FFFFFF"/>
-          </w:tcPr>
-          <w:p>
-            <w:r>
-              <w:t>Satellite Optical Sensing, Chlorophyll-a Anomalies, 100m Beach Transects, UNEP Custodian, INC Global Plastics Treaty</w:t>
-            </w:r>
-          </w:p>
-        </w:tc>
-      </w:tr>
-    </w:tbl>
-    <w:p>
-      <w:pPr>
-        <w:spacing w:after="160"/>
-      </w:pPr>
-    </w:p>
-    <w:p>
-      <w:pPr>
-        <w:pStyle w:val="Heading2"/>
-      </w:pPr>
-      <w:r>
-        <w:rPr>
-          <w:rFonts w:ascii="Arial" w:hAnsi="Arial"/>
-          <w:color w:val="0F172A"/>
-          <w:sz w:val="24"/>
-        </w:rPr>
-        <w:t>Verbatim Spoken English Script (Read Naturally):</w:t>
-      </w:r>
-    </w:p>
-    <w:p>
-      <w:pPr>
-        <w:spacing w:line="300" w:lineRule="auto" w:after="240"/>
-      </w:pPr>
-      <w:r>
-        <w:rPr>
-          <w:rFonts w:ascii="Arial" w:hAnsi="Arial"/>
-          <w:sz w:val="21"/>
-        </w:rPr>
-        <w:t>Thank you, Speaker 2. Hello everyone, I am Speaker 3.</w:t>
-        <w:br/>
-        <w:br/>
-        <w:t>Measuring pollution across hundreds of millions of square miles of open ocean requires two complementary scientific techniques.</w:t>
-        <w:br/>
-        <w:br/>
-        <w:t>For coastal eutrophication, marine scientists use satellite remote sensing. NASA’s MODIS and the European Space Agency’s Sentinel-3 satellites continuously scan ocean surface color from orbit. They calculate Chlorophyll-a concentration anomalies. When chlorophyll levels spike far above the historical baseline, it proves that agricultural nutrient pollution has triggered an abnormal algal bloom.</w:t>
-        <w:br/>
-        <w:br/>
-        <w:t>For plastic debris density, scientists use standardized 100-meter beach transects and manta trawl surface nets. Citizen science groups and environmental agencies count, weigh, and categorize every plastic item along designated 100-meter strips of shoreline.</w:t>
-        <w:br/>
-        <w:br/>
-        <w:t>[PAUSE — ADVANCE TO SLIDE 6]</w:t>
-        <w:br/>
-        <w:br/>
-        <w:t>Now, who governs Target 14.1? The United Nations Environment Programme, or UNEP, serves as the official global custodian agency. UNEP standardizes country reporting and aggregates national data.</w:t>
-        <w:br/>
-        <w:br/>
-        <w:t>At the international policy level, the most important breakthrough is the ongoing negotiation of the Intergovernmental Negotiating Committee—the INC Global Plastics Treaty. This treaty aims to establish a legally binding international instrument addressing the full lifecycle of plastics, from chemical design to marine leakage.</w:t>
-        <w:br/>
-        <w:br/>
-        <w:t>Having tackled marine pollution, we now move downstream to living habitats. Speaker 4 will introduce Target 14.2.</w:t>
+        <w:t>Speaker 2 — Target 14.1 Measurement &amp; Governance (Slides 3 &amp; 4)</w:t>
       </w:r>
     </w:p>
     <w:p>
       <w:r>
         <w:rPr>
           <w:b/>
-          <w:color w:val="0284C7"/>
+          <w:color w:val="475569"/>
+          <w:sz w:val="20"/>
         </w:rPr>
-        <w:t xml:space="preserve">Pronunciation Quick Guide: </w:t>
+        <w:t>Time Window: 02:30 to 05:00 (02:30 Target) • Role: Speaker 2 (Scientific Measurement &amp; Marine Law)</w:t>
+      </w:r>
+    </w:p>
+    <w:p>
+      <w:r>
+        <w:rPr>
+          <w:b/>
+          <w:sz w:val="20"/>
+        </w:rPr>
+        <w:t xml:space="preserve">Pronunciation Guide: </w:t>
       </w:r>
       <w:r>
         <w:rPr>
           <w:i/>
+          <w:sz w:val="20"/>
         </w:rPr>
-        <w:t>Chlorophyll -&gt; [KLOR-uh-fil] | Transects -&gt; [TRAN-sekts] | Custodian -&gt; [kuh-STOH-dee-uhn]</w:t>
+        <w:t>Chlorophyll [KLOR-uh-fil] | Transects [TRAN-sekts] | Custodian [kuh-STOH-dee-uhn]</w:t>
+      </w:r>
+    </w:p>
+    <w:p>
+      <w:pPr>
+        <w:spacing w:line="300" w:lineRule="auto" w:after="120"/>
+      </w:pPr>
+      <w:r>
+        <w:rPr>
+          <w:rFonts w:ascii="Arial" w:hAnsi="Arial"/>
+          <w:b/>
+          <w:color w:val="0284C7"/>
+          <w:sz w:val="22"/>
+        </w:rPr>
+        <w:t>[ON SLIDE 03 — MEASUREMENT 14.1]</w:t>
+      </w:r>
+    </w:p>
+    <w:p>
+      <w:pPr>
+        <w:spacing w:line="300" w:lineRule="auto" w:after="120"/>
+      </w:pPr>
+      <w:r>
+        <w:rPr>
+          <w:rFonts w:ascii="Arial" w:hAnsi="Arial"/>
+          <w:color w:val="0F172A"/>
+          <w:sz w:val="22"/>
+        </w:rPr>
+        <w:t>Thank you, Speaker 1. Hello everyone, I am Speaker 2.</w:t>
+      </w:r>
+    </w:p>
+    <w:p>
+      <w:pPr>
+        <w:spacing w:line="300" w:lineRule="auto" w:after="120"/>
+      </w:pPr>
+      <w:r>
+        <w:rPr>
+          <w:rFonts w:ascii="Arial" w:hAnsi="Arial"/>
+          <w:color w:val="0F172A"/>
+          <w:sz w:val="22"/>
+        </w:rPr>
+        <w:t>Question 3 asks: How is marine pollution measured scientifically?</w:t>
+      </w:r>
+    </w:p>
+    <w:p>
+      <w:pPr>
+        <w:spacing w:line="300" w:lineRule="auto" w:after="120"/>
+      </w:pPr>
+      <w:r>
+        <w:rPr>
+          <w:rFonts w:ascii="Arial" w:hAnsi="Arial"/>
+          <w:color w:val="0F172A"/>
+          <w:sz w:val="22"/>
+        </w:rPr>
+        <w:t>Tracking pollution across millions of square kilometers requires orbital remote sensing paired with shoreline surveys. For coastal eutrophication, ESA’s Sentinel-3 and NASA’s MODIS satellites scan ocean surface reflectance to detect Chlorophyll-a anomalies. When chlorophyll concentrations surge above normal baselines, algorithms flag active algal blooms.</w:t>
+      </w:r>
+    </w:p>
+    <w:p>
+      <w:pPr>
+        <w:spacing w:line="300" w:lineRule="auto" w:after="120"/>
+      </w:pPr>
+      <w:r>
+        <w:rPr>
+          <w:rFonts w:ascii="Arial" w:hAnsi="Arial"/>
+          <w:color w:val="0F172A"/>
+          <w:sz w:val="22"/>
+        </w:rPr>
+        <w:t>For plastics, scientists use two methodologies: surface manta trawl nets with 333-micrometer mesh to capture floating microplastics, and standardized 100-meter shoreline transects where researchers categorize, count, and weigh litter deposits per square meter.</w:t>
+      </w:r>
+    </w:p>
+    <w:p>
+      <w:pPr>
+        <w:spacing w:line="300" w:lineRule="auto" w:after="120"/>
+      </w:pPr>
+      <w:r>
+        <w:rPr>
+          <w:rFonts w:ascii="Arial" w:hAnsi="Arial"/>
+          <w:b/>
+          <w:color w:val="0284C7"/>
+          <w:sz w:val="22"/>
+        </w:rPr>
+        <w:t>[ADVANCE TO SLIDE 04 — GOVERNANCE 14.1]</w:t>
+      </w:r>
+    </w:p>
+    <w:p>
+      <w:pPr>
+        <w:spacing w:line="300" w:lineRule="auto" w:after="120"/>
+      </w:pPr>
+      <w:r>
+        <w:rPr>
+          <w:rFonts w:ascii="Arial" w:hAnsi="Arial"/>
+          <w:color w:val="0F172A"/>
+          <w:sz w:val="22"/>
+        </w:rPr>
+        <w:t>Question 4: What institutions and governance frameworks enforce compliance?</w:t>
+      </w:r>
+    </w:p>
+    <w:p>
+      <w:pPr>
+        <w:spacing w:line="300" w:lineRule="auto" w:after="120"/>
+      </w:pPr>
+      <w:r>
+        <w:rPr>
+          <w:rFonts w:ascii="Arial" w:hAnsi="Arial"/>
+          <w:color w:val="0F172A"/>
+          <w:sz w:val="22"/>
+        </w:rPr>
+        <w:t>The official global custodian agency is the United Nations Environment Programme (UNEP). UNEP standardizes national data reporting and methodologies across member states.</w:t>
+      </w:r>
+    </w:p>
+    <w:p>
+      <w:pPr>
+        <w:spacing w:line="300" w:lineRule="auto" w:after="120"/>
+      </w:pPr>
+      <w:r>
+        <w:rPr>
+          <w:rFonts w:ascii="Arial" w:hAnsi="Arial"/>
+          <w:color w:val="0F172A"/>
+          <w:sz w:val="22"/>
+        </w:rPr>
+        <w:t>On the legal front, the most critical breakthrough is the Intergovernmental Negotiating Committee (INC) Global Plastics Treaty—mandated to become a legally binding international treaty addressing the full lifecycle of plastics. At sea, MARPOL Annex V under the International Maritime Organization strictly prohibits commercial vessels from discharging any plastics into the marine environment.</w:t>
       </w:r>
     </w:p>
     <w:p>
@@ -601,18 +378,19 @@
           <w:b/>
           <w:color w:val="E11D48"/>
         </w:rPr>
-        <w:t xml:space="preserve">Handoff Cue: </w:t>
+        <w:t xml:space="preserve">🤝 Transition / Handoff Cue: </w:t>
       </w:r>
       <w:r>
         <w:rPr>
           <w:b/>
+          <w:i/>
         </w:rPr>
-        <w:t>"I now hand over to Speaker 4 to examine marine ecosystem resilience and Target 14.2."</w:t>
+        <w:t>"I now pass the floor to Speaker 3 to dive into Target 14.2 on living coastal ecosystems."</w:t>
       </w:r>
     </w:p>
     <w:p>
       <w:r>
-        <w:br w:type="page"/>
+        <w:t>―――――――――――――――――――――――――――――――――――――――――――――――――――――――</w:t>
       </w:r>
     </w:p>
     <w:p>
@@ -624,168 +402,141 @@
           <w:rFonts w:ascii="Arial" w:hAnsi="Arial"/>
           <w:b/>
           <w:color w:val="0284C7"/>
-          <w:sz w:val="28"/>
+          <w:sz w:val="32"/>
         </w:rPr>
-        <w:t>TAB / SECTION: SPEAKER 4: TARGET 14.2 &amp; THE CRITICAL BLINDSPOT</w:t>
-      </w:r>
-    </w:p>
-    <w:tbl>
-      <w:tblPr>
-        <w:tblW w:type="auto" w:w="0"/>
-        <w:jc w:val="center"/>
-        <w:tblLayout w:type="fixed"/>
-        <w:tblLook w:firstColumn="1" w:firstRow="1" w:lastColumn="0" w:lastRow="0" w:noHBand="0" w:noVBand="1" w:val="04A0"/>
-      </w:tblPr>
-      <w:tblGrid>
-        <w:gridCol w:w="4824"/>
-        <w:gridCol w:w="4824"/>
-      </w:tblGrid>
-      <w:tr>
-        <w:tc>
-          <w:tcPr>
-            <w:tcW w:type="dxa" w:w="2592"/>
-            <w:shd w:fill="F1F5F9"/>
-          </w:tcPr>
-          <w:p>
-            <w:r>
-              <w:rPr>
-                <w:b/>
-              </w:rPr>
-              <w:t>Allocated Time:</w:t>
-            </w:r>
-          </w:p>
-        </w:tc>
-        <w:tc>
-          <w:tcPr>
-            <w:tcW w:type="dxa" w:w="7488"/>
-            <w:shd w:fill="FFFFFF"/>
-          </w:tcPr>
-          <w:p>
-            <w:r>
-              <w:t>07:30 - 10:00 (Target: 2 min 20 sec)</w:t>
-            </w:r>
-          </w:p>
-        </w:tc>
-      </w:tr>
-      <w:tr>
-        <w:tc>
-          <w:tcPr>
-            <w:tcW w:type="dxa" w:w="2592"/>
-            <w:shd w:fill="F1F5F9"/>
-          </w:tcPr>
-          <w:p>
-            <w:r>
-              <w:rPr>
-                <w:b/>
-              </w:rPr>
-              <w:t>Slides Covered:</w:t>
-            </w:r>
-          </w:p>
-        </w:tc>
-        <w:tc>
-          <w:tcPr>
-            <w:tcW w:type="dxa" w:w="7488"/>
-            <w:shd w:fill="FFFFFF"/>
-          </w:tcPr>
-          <w:p>
-            <w:r>
-              <w:t>Slide 7 &amp; Slide 8</w:t>
-            </w:r>
-          </w:p>
-        </w:tc>
-      </w:tr>
-      <w:tr>
-        <w:tc>
-          <w:tcPr>
-            <w:tcW w:type="dxa" w:w="2592"/>
-            <w:shd w:fill="F1F5F9"/>
-          </w:tcPr>
-          <w:p>
-            <w:r>
-              <w:rPr>
-                <w:b/>
-              </w:rPr>
-              <w:t>Core Focus:</w:t>
-            </w:r>
-          </w:p>
-        </w:tc>
-        <w:tc>
-          <w:tcPr>
-            <w:tcW w:type="dxa" w:w="7488"/>
-            <w:shd w:fill="FFFFFF"/>
-          </w:tcPr>
-          <w:p>
-            <w:r>
-              <w:t>Target 14.2 Mandate, Ecosystem-Based Management (EBM), Indicator 14.2.1, Critical Evaluation (Process vs Outcome Metric)</w:t>
-            </w:r>
-          </w:p>
-        </w:tc>
-      </w:tr>
-    </w:tbl>
-    <w:p>
-      <w:pPr>
-        <w:spacing w:after="160"/>
-      </w:pPr>
-    </w:p>
-    <w:p>
-      <w:pPr>
-        <w:pStyle w:val="Heading2"/>
-      </w:pPr>
-      <w:r>
-        <w:rPr>
-          <w:rFonts w:ascii="Arial" w:hAnsi="Arial"/>
-          <w:color w:val="0F172A"/>
-          <w:sz w:val="24"/>
-        </w:rPr>
-        <w:t>Verbatim Spoken English Script (Read Naturally):</w:t>
-      </w:r>
-    </w:p>
-    <w:p>
-      <w:pPr>
-        <w:spacing w:line="300" w:lineRule="auto" w:after="240"/>
-      </w:pPr>
-      <w:r>
-        <w:rPr>
-          <w:rFonts w:ascii="Arial" w:hAnsi="Arial"/>
-          <w:sz w:val="21"/>
-        </w:rPr>
-        <w:t>Thank you, Speaker 3. Hello everyone, I am Speaker 4.</w:t>
-        <w:br/>
-        <w:br/>
-        <w:t>Target 14.2 shifts our focus from waste management to living ecological resilience. Its mandate is to sustainably manage and protect marine and coastal ecosystems to avoid significant adverse impacts, and take action for their restoration.</w:t>
-        <w:br/>
-        <w:br/>
-        <w:t>The core philosophy of Target 14.2 is Ecosystem-Based Management, or EBM. Historically, humans managed oceans in isolated silos: fishing ministries regulated fish, transport ministries regulated shipping, and energy departments leased offshore oil. EBM breaks down these silos. It recognizes that corals, seagrasses, mangroves, fish stocks, and human coastal economies are all part of one interconnected living web.</w:t>
-        <w:br/>
-        <w:br/>
-        <w:t>[PAUSE — ADVANCE TO SLIDE 8]</w:t>
-        <w:br/>
-        <w:br/>
-        <w:t>To monitor progress, the UN established Indicator 14.2.1: the number of countries using ecosystem-based approaches to manage marine areas.</w:t>
-        <w:br/>
-        <w:br/>
-        <w:t>Measurement is conducted through national self-reporting surveys verified by UNEP. Countries receive credit if they enact legally recognized Marine Spatial Plans and establish Marine Protected Areas.</w:t>
-        <w:br/>
-        <w:br/>
-        <w:t>However, our team must highlight a critical analytical limitation: Indicator 14.2.1 is a process indicator, not an outcome indicator. It measures whether a government passed a planning policy on paper. It does not prove whether coral cover increased, whether fish biomass recovered, or whether enforcement actually stops illegal bottom trawling. Many designated zones risk remaining 'paper parks'.</w:t>
-        <w:br/>
-        <w:br/>
-        <w:t>Speaker 5 will now explore the global treaties governing 14.2 and introduce the chemistry of Target 14.3.</w:t>
+        <w:t>Speaker 3 — Target 14.2 Aim &amp; Indicators (Slides 5 &amp; 6)</w:t>
       </w:r>
     </w:p>
     <w:p>
       <w:r>
         <w:rPr>
           <w:b/>
-          <w:color w:val="0284C7"/>
+          <w:color w:val="475569"/>
+          <w:sz w:val="20"/>
         </w:rPr>
-        <w:t xml:space="preserve">Pronunciation Quick Guide: </w:t>
+        <w:t>Time Window: 05:00 to 07:30 (02:30 Target) • Role: Speaker 3 (Living Habitats &amp; Policy Evaluation)</w:t>
+      </w:r>
+    </w:p>
+    <w:p>
+      <w:r>
+        <w:rPr>
+          <w:b/>
+          <w:sz w:val="20"/>
+        </w:rPr>
+        <w:t xml:space="preserve">Pronunciation Guide: </w:t>
       </w:r>
       <w:r>
         <w:rPr>
           <w:i/>
+          <w:sz w:val="20"/>
         </w:rPr>
-        <w:t>Resilience -&gt; [rih-ZIL-yuhnss] | Biomass -&gt; [BY-oh-mass] | Ecosystem-based -&gt; [EE-koh-sis-tuhm bayst]</w:t>
+        <w:t>Resilience [rih-ZIL-yuhnss] | Ecosystem-based [EE-koh-sis-tuhm bayst] | Spatial [SPAY-shuhl]</w:t>
+      </w:r>
+    </w:p>
+    <w:p>
+      <w:pPr>
+        <w:spacing w:line="300" w:lineRule="auto" w:after="120"/>
+      </w:pPr>
+      <w:r>
+        <w:rPr>
+          <w:rFonts w:ascii="Arial" w:hAnsi="Arial"/>
+          <w:b/>
+          <w:color w:val="0284C7"/>
+          <w:sz w:val="22"/>
+        </w:rPr>
+        <w:t>[ON SLIDE 05 — TARGET 14.2 AIM]</w:t>
+      </w:r>
+    </w:p>
+    <w:p>
+      <w:pPr>
+        <w:spacing w:line="300" w:lineRule="auto" w:after="120"/>
+      </w:pPr>
+      <w:r>
+        <w:rPr>
+          <w:rFonts w:ascii="Arial" w:hAnsi="Arial"/>
+          <w:color w:val="0F172A"/>
+          <w:sz w:val="22"/>
+        </w:rPr>
+        <w:t>Thank you, Speaker 2. Hello everyone, I am Speaker 3.</w:t>
+      </w:r>
+    </w:p>
+    <w:p>
+      <w:pPr>
+        <w:spacing w:line="300" w:lineRule="auto" w:after="120"/>
+      </w:pPr>
+      <w:r>
+        <w:rPr>
+          <w:rFonts w:ascii="Arial" w:hAnsi="Arial"/>
+          <w:color w:val="0F172A"/>
+          <w:sz w:val="22"/>
+        </w:rPr>
+        <w:t>We now transition to Target 14.2: Marine Ecosystem Resilience. Question 1: What is the aim?</w:t>
+      </w:r>
+    </w:p>
+    <w:p>
+      <w:pPr>
+        <w:spacing w:line="300" w:lineRule="auto" w:after="120"/>
+      </w:pPr>
+      <w:r>
+        <w:rPr>
+          <w:rFonts w:ascii="Arial" w:hAnsi="Arial"/>
+          <w:color w:val="0F172A"/>
+          <w:sz w:val="22"/>
+        </w:rPr>
+        <w:t>The mandate requires countries to sustainably manage and protect marine and coastal ecosystems to avoid significant adverse impacts, including by strengthening their resilience and taking action for their restoration. The core principle is Ecosystem-Based Management (EBM). Historically, humans managed oceans in silos: fisheries departments regulated fish, while transport ministries regulated shipping. EBM breaks these silos down, managing corals, seagrass meadows, mangroves, and fishing as one interconnected biological web.</w:t>
+      </w:r>
+    </w:p>
+    <w:p>
+      <w:pPr>
+        <w:spacing w:line="300" w:lineRule="auto" w:after="120"/>
+      </w:pPr>
+      <w:r>
+        <w:rPr>
+          <w:rFonts w:ascii="Arial" w:hAnsi="Arial"/>
+          <w:b/>
+          <w:color w:val="0284C7"/>
+          <w:sz w:val="22"/>
+        </w:rPr>
+        <w:t>[ADVANCE TO SLIDE 06 — INDICATOR 14.2.1]</w:t>
+      </w:r>
+    </w:p>
+    <w:p>
+      <w:pPr>
+        <w:spacing w:line="300" w:lineRule="auto" w:after="120"/>
+      </w:pPr>
+      <w:r>
+        <w:rPr>
+          <w:rFonts w:ascii="Arial" w:hAnsi="Arial"/>
+          <w:color w:val="0F172A"/>
+          <w:sz w:val="22"/>
+        </w:rPr>
+        <w:t>Question 2: What is the official indicator?</w:t>
+      </w:r>
+    </w:p>
+    <w:p>
+      <w:pPr>
+        <w:spacing w:line="300" w:lineRule="auto" w:after="120"/>
+      </w:pPr>
+      <w:r>
+        <w:rPr>
+          <w:rFonts w:ascii="Arial" w:hAnsi="Arial"/>
+          <w:color w:val="0F172A"/>
+          <w:sz w:val="22"/>
+        </w:rPr>
+        <w:t>The UN established Indicator 14.2.1: the number of countries using ecosystem-based approaches to manage marine areas. Governments report whether they have established Marine Spatial Planning (MSP) and Integrated Coastal Zone Management (ICZM) frameworks.</w:t>
+      </w:r>
+    </w:p>
+    <w:p>
+      <w:pPr>
+        <w:spacing w:line="300" w:lineRule="auto" w:after="120"/>
+      </w:pPr>
+      <w:r>
+        <w:rPr>
+          <w:rFonts w:ascii="Arial" w:hAnsi="Arial"/>
+          <w:color w:val="0F172A"/>
+          <w:sz w:val="22"/>
+        </w:rPr>
+        <w:t>However, our team highlights a major analytical limitation: Indicator 14.2.1 is a process indicator, not an outcome metric. It records whether a government enacted a management law on paper. It does not verify whether coral cover grew, whether fish biomass recovered, or whether patrol boats stop illegal trawling. This creates the acute risk of 'paper parks'—zones protected on maps but neglected in reality.</w:t>
       </w:r>
     </w:p>
     <w:p>
@@ -794,18 +545,19 @@
           <w:b/>
           <w:color w:val="E11D48"/>
         </w:rPr>
-        <w:t xml:space="preserve">Handoff Cue: </w:t>
+        <w:t xml:space="preserve">🤝 Transition / Handoff Cue: </w:t>
       </w:r>
       <w:r>
         <w:rPr>
           <w:b/>
+          <w:i/>
         </w:rPr>
-        <w:t>"Speaker 5 will now explain the 30x30 global target and take us into the deep chemical shift of Target 14.3."</w:t>
+        <w:t>"Speaker 4 will now examine how scientists audit real marine ecology and the global treaties enforcing 14.2."</w:t>
       </w:r>
     </w:p>
     <w:p>
       <w:r>
-        <w:br w:type="page"/>
+        <w:t>―――――――――――――――――――――――――――――――――――――――――――――――――――――――</w:t>
       </w:r>
     </w:p>
     <w:p>
@@ -817,168 +569,154 @@
           <w:rFonts w:ascii="Arial" w:hAnsi="Arial"/>
           <w:b/>
           <w:color w:val="0284C7"/>
-          <w:sz w:val="28"/>
+          <w:sz w:val="32"/>
         </w:rPr>
-        <w:t>TAB / SECTION: SPEAKER 5: GOVERNANCE OF 14.2 &amp; TARGET 14.3 ACIDIFICATION</w:t>
-      </w:r>
-    </w:p>
-    <w:tbl>
-      <w:tblPr>
-        <w:tblW w:type="auto" w:w="0"/>
-        <w:jc w:val="center"/>
-        <w:tblLayout w:type="fixed"/>
-        <w:tblLook w:firstColumn="1" w:firstRow="1" w:lastColumn="0" w:lastRow="0" w:noHBand="0" w:noVBand="1" w:val="04A0"/>
-      </w:tblPr>
-      <w:tblGrid>
-        <w:gridCol w:w="4824"/>
-        <w:gridCol w:w="4824"/>
-      </w:tblGrid>
-      <w:tr>
-        <w:tc>
-          <w:tcPr>
-            <w:tcW w:type="dxa" w:w="2592"/>
-            <w:shd w:fill="F1F5F9"/>
-          </w:tcPr>
-          <w:p>
-            <w:r>
-              <w:rPr>
-                <w:b/>
-              </w:rPr>
-              <w:t>Allocated Time:</w:t>
-            </w:r>
-          </w:p>
-        </w:tc>
-        <w:tc>
-          <w:tcPr>
-            <w:tcW w:type="dxa" w:w="7488"/>
-            <w:shd w:fill="FFFFFF"/>
-          </w:tcPr>
-          <w:p>
-            <w:r>
-              <w:t>10:00 - 12:30 (Target: 2 min 20 sec)</w:t>
-            </w:r>
-          </w:p>
-        </w:tc>
-      </w:tr>
-      <w:tr>
-        <w:tc>
-          <w:tcPr>
-            <w:tcW w:type="dxa" w:w="2592"/>
-            <w:shd w:fill="F1F5F9"/>
-          </w:tcPr>
-          <w:p>
-            <w:r>
-              <w:rPr>
-                <w:b/>
-              </w:rPr>
-              <w:t>Slides Covered:</w:t>
-            </w:r>
-          </w:p>
-        </w:tc>
-        <w:tc>
-          <w:tcPr>
-            <w:tcW w:type="dxa" w:w="7488"/>
-            <w:shd w:fill="FFFFFF"/>
-          </w:tcPr>
-          <w:p>
-            <w:r>
-              <w:t>Slide 9 &amp; Slide 10</w:t>
-            </w:r>
-          </w:p>
-        </w:tc>
-      </w:tr>
-      <w:tr>
-        <w:tc>
-          <w:tcPr>
-            <w:tcW w:type="dxa" w:w="2592"/>
-            <w:shd w:fill="F1F5F9"/>
-          </w:tcPr>
-          <w:p>
-            <w:r>
-              <w:rPr>
-                <w:b/>
-              </w:rPr>
-              <w:t>Core Focus:</w:t>
-            </w:r>
-          </w:p>
-        </w:tc>
-        <w:tc>
-          <w:tcPr>
-            <w:tcW w:type="dxa" w:w="7488"/>
-            <w:shd w:fill="FFFFFF"/>
-          </w:tcPr>
-          <w:p>
-            <w:r>
-              <w:t>Kunming-Montreal 30x30 Target, BBNJ High Seas Treaty, Target 14.3 Mandate, The 30% Acidity Surge, CO2 Chemical Mechanics</w:t>
-            </w:r>
-          </w:p>
-        </w:tc>
-      </w:tr>
-    </w:tbl>
-    <w:p>
-      <w:pPr>
-        <w:spacing w:after="160"/>
-      </w:pPr>
-    </w:p>
-    <w:p>
-      <w:pPr>
-        <w:pStyle w:val="Heading2"/>
-      </w:pPr>
-      <w:r>
-        <w:rPr>
-          <w:rFonts w:ascii="Arial" w:hAnsi="Arial"/>
-          <w:color w:val="0F172A"/>
-          <w:sz w:val="24"/>
-        </w:rPr>
-        <w:t>Verbatim Spoken English Script (Read Naturally):</w:t>
-      </w:r>
-    </w:p>
-    <w:p>
-      <w:pPr>
-        <w:spacing w:line="300" w:lineRule="auto" w:after="240"/>
-      </w:pPr>
-      <w:r>
-        <w:rPr>
-          <w:rFonts w:ascii="Arial" w:hAnsi="Arial"/>
-          <w:sz w:val="21"/>
-        </w:rPr>
-        <w:t>Thank you, Speaker 4. Hello everyone, I am Speaker 5.</w:t>
-        <w:br/>
-        <w:br/>
-        <w:t>Target 14.2 is anchored by the historic Kunming-Montreal Global Biodiversity Framework, specifically Target 3—widely known as the '30 by 30' commitment. Over 190 countries have pledged to effectively conserve at least 30 percent of coastal and marine areas by the year 2030.</w:t>
-        <w:br/>
-        <w:br/>
-        <w:t>Equally historic is the newly adopted BBNJ Treaty—the Biodiversity Beyond National Jurisdiction treaty. For the first time in human history, the international community has a legal mechanism to designate high-seas marine protected areas in international waters outside any single country's jurisdiction.</w:t>
-        <w:br/>
-        <w:br/>
-        <w:t>[PAUSE — ADVANCE TO SLIDE 10]</w:t>
-        <w:br/>
-        <w:br/>
-        <w:t>Now, we descend into the profound chemical shift of Target 14.3: Ocean Acidification.</w:t>
-        <w:br/>
-        <w:br/>
-        <w:t>The ocean has acted as humanity's greatest climate buffer, absorbing roughly 25 percent of all atmospheric carbon dioxide emissions every year. But that protection comes at an immense chemical price. When CO2 dissolves in seawater, it forms carbonic acid, releasing hydrogen ions.</w:t>
-        <w:br/>
-        <w:br/>
-        <w:t>Since the pre-industrial era, surface ocean pH has dropped by approximately 0.1 units. Because pH is logarithmic, a 0.1 drop represents a 30 percent surge in acidity. Seawater is not turning into vinegar—it remains alkaline—but this drop strips away the carbonate ions that corals, oysters, pteropods, and shellfish need to build their skeletons.</w:t>
-        <w:br/>
-        <w:br/>
-        <w:t>Speaker 6 will now conclude our presentation with how scientists measure ocean pH and how global institutions coordinate action.</w:t>
+        <w:t>Speaker 4 — Target 14.2 Measurement &amp; Governance (Slides 7 &amp; 8)</w:t>
       </w:r>
     </w:p>
     <w:p>
       <w:r>
         <w:rPr>
           <w:b/>
-          <w:color w:val="0284C7"/>
+          <w:color w:val="475569"/>
+          <w:sz w:val="20"/>
         </w:rPr>
-        <w:t xml:space="preserve">Pronunciation Quick Guide: </w:t>
+        <w:t>Time Window: 07:30 to 10:00 (02:30 Target) • Role: Speaker 4 (Biological Auditing &amp; International Treaties)</w:t>
+      </w:r>
+    </w:p>
+    <w:p>
+      <w:r>
+        <w:rPr>
+          <w:b/>
+          <w:sz w:val="20"/>
+        </w:rPr>
+        <w:t xml:space="preserve">Pronunciation Guide: </w:t>
       </w:r>
       <w:r>
         <w:rPr>
           <w:i/>
+          <w:sz w:val="20"/>
         </w:rPr>
-        <w:t>Kunming-Montreal -&gt; [Koon-ming Mon-tree-AWL] | Logarithmic -&gt; [log-uh-RITH-mik] | Pteropods -&gt; [TEH-ruh-pods (silent p)]</w:t>
+        <w:t>Kunming-Montreal [Koon-ming Mon-tree-AWL] | Bathymetry [buh-THIM-uh-tree] | Genomics [juh-NOH-miks]</w:t>
+      </w:r>
+    </w:p>
+    <w:p>
+      <w:pPr>
+        <w:spacing w:line="300" w:lineRule="auto" w:after="120"/>
+      </w:pPr>
+      <w:r>
+        <w:rPr>
+          <w:rFonts w:ascii="Arial" w:hAnsi="Arial"/>
+          <w:b/>
+          <w:color w:val="0284C7"/>
+          <w:sz w:val="22"/>
+        </w:rPr>
+        <w:t>[ON SLIDE 07 — MEASUREMENT 14.2]</w:t>
+      </w:r>
+    </w:p>
+    <w:p>
+      <w:pPr>
+        <w:spacing w:line="300" w:lineRule="auto" w:after="120"/>
+      </w:pPr>
+      <w:r>
+        <w:rPr>
+          <w:rFonts w:ascii="Arial" w:hAnsi="Arial"/>
+          <w:color w:val="0F172A"/>
+          <w:sz w:val="22"/>
+        </w:rPr>
+        <w:t>Thank you, Speaker 3. Hello everyone, I am Speaker 4.</w:t>
+      </w:r>
+    </w:p>
+    <w:p>
+      <w:pPr>
+        <w:spacing w:line="300" w:lineRule="auto" w:after="120"/>
+      </w:pPr>
+      <w:r>
+        <w:rPr>
+          <w:rFonts w:ascii="Arial" w:hAnsi="Arial"/>
+          <w:color w:val="0F172A"/>
+          <w:sz w:val="22"/>
+        </w:rPr>
+        <w:t>Question 3: How do scientists measure real ecological health beyond paperwork?</w:t>
+      </w:r>
+    </w:p>
+    <w:p>
+      <w:pPr>
+        <w:spacing w:line="300" w:lineRule="auto" w:after="120"/>
+      </w:pPr>
+      <w:r>
+        <w:rPr>
+          <w:rFonts w:ascii="Arial" w:hAnsi="Arial"/>
+          <w:color w:val="0F172A"/>
+          <w:sz w:val="22"/>
+        </w:rPr>
+        <w:t>Marine biologists deploy three direct empirical techniques: First, the Global Coral Reef Monitoring Network (GCRMN) conducts standardized scuba transects to measure hard coral cover, structural rugosity, and bleaching mortality.</w:t>
+      </w:r>
+    </w:p>
+    <w:p>
+      <w:pPr>
+        <w:spacing w:line="300" w:lineRule="auto" w:after="120"/>
+      </w:pPr>
+      <w:r>
+        <w:rPr>
+          <w:rFonts w:ascii="Arial" w:hAnsi="Arial"/>
+          <w:color w:val="0F172A"/>
+          <w:sz w:val="22"/>
+        </w:rPr>
+        <w:t>Second, environmental DNA (eDNA) sampling allows scientists to filter a liter of seawater and sequence genetic traces shed by marine organisms, auditing entire fish populations without destructive netting. Third, multibeam sonar bathymetry and airborne LiDAR map the exact boundaries and density of seagrass meadows and mangrove roots.</w:t>
+      </w:r>
+    </w:p>
+    <w:p>
+      <w:pPr>
+        <w:spacing w:line="300" w:lineRule="auto" w:after="120"/>
+      </w:pPr>
+      <w:r>
+        <w:rPr>
+          <w:rFonts w:ascii="Arial" w:hAnsi="Arial"/>
+          <w:b/>
+          <w:color w:val="0284C7"/>
+          <w:sz w:val="22"/>
+        </w:rPr>
+        <w:t>[ADVANCE TO SLIDE 08 — GOVERNANCE 14.2]</w:t>
+      </w:r>
+    </w:p>
+    <w:p>
+      <w:pPr>
+        <w:spacing w:line="300" w:lineRule="auto" w:after="120"/>
+      </w:pPr>
+      <w:r>
+        <w:rPr>
+          <w:rFonts w:ascii="Arial" w:hAnsi="Arial"/>
+          <w:color w:val="0F172A"/>
+          <w:sz w:val="22"/>
+        </w:rPr>
+        <w:t>Question 4: What global governance frameworks enforce Target 14.2?</w:t>
+      </w:r>
+    </w:p>
+    <w:p>
+      <w:pPr>
+        <w:spacing w:line="300" w:lineRule="auto" w:after="120"/>
+      </w:pPr>
+      <w:r>
+        <w:rPr>
+          <w:rFonts w:ascii="Arial" w:hAnsi="Arial"/>
+          <w:color w:val="0F172A"/>
+          <w:sz w:val="22"/>
+        </w:rPr>
+        <w:t>Target 14.2 is driven by two landmark international accords. First is the Kunming-Montreal Global Biodiversity Framework, specifically Target 3—the '30 by 30' commitment, where 190 nations pledged to protect 30 percent of marine and coastal domains by 2030.</w:t>
+      </w:r>
+    </w:p>
+    <w:p>
+      <w:pPr>
+        <w:spacing w:line="300" w:lineRule="auto" w:after="120"/>
+      </w:pPr>
+      <w:r>
+        <w:rPr>
+          <w:rFonts w:ascii="Arial" w:hAnsi="Arial"/>
+          <w:color w:val="0F172A"/>
+          <w:sz w:val="22"/>
+        </w:rPr>
+        <w:t>Second is the historic BBNJ Treaty—Biodiversity Beyond National Jurisdiction. For the first time in legal history, the international community possesses a binding mechanism to establish and enforce Marine Protected Areas in international waters—the High Seas—which cover two-thirds of the global ocean.</w:t>
       </w:r>
     </w:p>
     <w:p>
@@ -987,18 +725,19 @@
           <w:b/>
           <w:color w:val="E11D48"/>
         </w:rPr>
-        <w:t xml:space="preserve">Handoff Cue: </w:t>
+        <w:t xml:space="preserve">🤝 Transition / Handoff Cue: </w:t>
       </w:r>
       <w:r>
         <w:rPr>
           <w:b/>
+          <w:i/>
         </w:rPr>
-        <w:t>"I now hand over to Speaker 6 to conclude with the precision measurement of Target 14.3 and our final synthesis."</w:t>
+        <w:t>"I now hand over to Speaker 5 to investigate Target 14.3 and the invisible chemical crisis of ocean acidification."</w:t>
       </w:r>
     </w:p>
     <w:p>
       <w:r>
-        <w:br w:type="page"/>
+        <w:t>―――――――――――――――――――――――――――――――――――――――――――――――――――――――</w:t>
       </w:r>
     </w:p>
     <w:p>
@@ -1010,168 +749,154 @@
           <w:rFonts w:ascii="Arial" w:hAnsi="Arial"/>
           <w:b/>
           <w:color w:val="0284C7"/>
-          <w:sz w:val="28"/>
+          <w:sz w:val="32"/>
         </w:rPr>
-        <w:t>TAB / SECTION: SPEAKER 6: PRECISION SENSORS, UNESCO &amp; FINAL SYNTHESIS</w:t>
-      </w:r>
-    </w:p>
-    <w:tbl>
-      <w:tblPr>
-        <w:tblW w:type="auto" w:w="0"/>
-        <w:jc w:val="center"/>
-        <w:tblLayout w:type="fixed"/>
-        <w:tblLook w:firstColumn="1" w:firstRow="1" w:lastColumn="0" w:lastRow="0" w:noHBand="0" w:noVBand="1" w:val="04A0"/>
-      </w:tblPr>
-      <w:tblGrid>
-        <w:gridCol w:w="4824"/>
-        <w:gridCol w:w="4824"/>
-      </w:tblGrid>
-      <w:tr>
-        <w:tc>
-          <w:tcPr>
-            <w:tcW w:type="dxa" w:w="2592"/>
-            <w:shd w:fill="F1F5F9"/>
-          </w:tcPr>
-          <w:p>
-            <w:r>
-              <w:rPr>
-                <w:b/>
-              </w:rPr>
-              <w:t>Allocated Time:</w:t>
-            </w:r>
-          </w:p>
-        </w:tc>
-        <w:tc>
-          <w:tcPr>
-            <w:tcW w:type="dxa" w:w="7488"/>
-            <w:shd w:fill="FFFFFF"/>
-          </w:tcPr>
-          <w:p>
-            <w:r>
-              <w:t>12:30 - 15:00 (Target: 2 min 20 sec)</w:t>
-            </w:r>
-          </w:p>
-        </w:tc>
-      </w:tr>
-      <w:tr>
-        <w:tc>
-          <w:tcPr>
-            <w:tcW w:type="dxa" w:w="2592"/>
-            <w:shd w:fill="F1F5F9"/>
-          </w:tcPr>
-          <w:p>
-            <w:r>
-              <w:rPr>
-                <w:b/>
-              </w:rPr>
-              <w:t>Slides Covered:</w:t>
-            </w:r>
-          </w:p>
-        </w:tc>
-        <w:tc>
-          <w:tcPr>
-            <w:tcW w:type="dxa" w:w="7488"/>
-            <w:shd w:fill="FFFFFF"/>
-          </w:tcPr>
-          <w:p>
-            <w:r>
-              <w:t>Slide 11 &amp; Slide 12</w:t>
-            </w:r>
-          </w:p>
-        </w:tc>
-      </w:tr>
-      <w:tr>
-        <w:tc>
-          <w:tcPr>
-            <w:tcW w:type="dxa" w:w="2592"/>
-            <w:shd w:fill="F1F5F9"/>
-          </w:tcPr>
-          <w:p>
-            <w:r>
-              <w:rPr>
-                <w:b/>
-              </w:rPr>
-              <w:t>Core Focus:</w:t>
-            </w:r>
-          </w:p>
-        </w:tc>
-        <w:tc>
-          <w:tcPr>
-            <w:tcW w:type="dxa" w:w="7488"/>
-            <w:shd w:fill="FFFFFF"/>
-          </w:tcPr>
-          <w:p>
-            <w:r>
-              <w:t>Indicator 14.3.1, GOA-ON Autonomous Sensor Network, Total pH Scale, UNESCO-IOC Custodianship, UN Ocean Decade, Conclusion</w:t>
-            </w:r>
-          </w:p>
-        </w:tc>
-      </w:tr>
-    </w:tbl>
-    <w:p>
-      <w:pPr>
-        <w:spacing w:after="160"/>
-      </w:pPr>
-    </w:p>
-    <w:p>
-      <w:pPr>
-        <w:pStyle w:val="Heading2"/>
-      </w:pPr>
-      <w:r>
-        <w:rPr>
-          <w:rFonts w:ascii="Arial" w:hAnsi="Arial"/>
-          <w:color w:val="0F172A"/>
-          <w:sz w:val="24"/>
-        </w:rPr>
-        <w:t>Verbatim Spoken English Script (Read Naturally):</w:t>
-      </w:r>
-    </w:p>
-    <w:p>
-      <w:pPr>
-        <w:spacing w:line="300" w:lineRule="auto" w:after="240"/>
-      </w:pPr>
-      <w:r>
-        <w:rPr>
-          <w:rFonts w:ascii="Arial" w:hAnsi="Arial"/>
-          <w:sz w:val="21"/>
-        </w:rPr>
-        <w:t>Thank you, Speaker 5. Hello everyone, I am Speaker 6, and I will deliver our final synthesis.</w:t>
-        <w:br/>
-        <w:br/>
-        <w:t>Target 14.3 is tracked through Indicator 14.3.1: Average marine acidity measured at representative sampling stations. Measuring ocean acidity is far more complex than dipping litmus paper into water. Seawater pH naturally fluctuates with depth, temperature, water currents, and seasonal plankton blooms.</w:t>
-        <w:br/>
-        <w:br/>
-        <w:t>Under UN metadata, measurement must be conducted on the 'Total pH scale' alongside at least one other carbon parameter, such as Total Dissolved Inorganic Carbon or Total Alkalinity. Scientists deploy high-precision glass electrodes and spectrophotometric sensors mounted on autonomous ocean gliders, deep moorings, and Biogeochemical ARGO robotic floats through the Global Ocean Acidification Observing Network, or GOA-ON.</w:t>
-        <w:br/>
-        <w:br/>
-        <w:t>[PAUSE — ADVANCE TO SLIDE 12]</w:t>
-        <w:br/>
-        <w:br/>
-        <w:t>Who governs Target 14.3? The official global custodian agency is UNESCO’s Intergovernmental Oceanographic Commission, or UNESCO-IOC. UNESCO-IOC coordinates global ocean observations and publishes the global progress reports.</w:t>
-        <w:br/>
-        <w:br/>
-        <w:t>The biggest operational challenge is the geographic data gap. Wealthy developed nations maintain hundreds of autonomous sensor stations, while small island developing states—who depend most heavily on coral reefs for survival—often have zero continuous monitoring buoys. Under the UN Decade of Ocean Science, UNESCO is distributing low-cost monitoring kits called 'Ocean Acidification in a Box' to bridge this divide.</w:t>
-        <w:br/>
-        <w:br/>
-        <w:t>In conclusion: SDG 14 teaches us that the ocean is one continuous, interconnected planetary system. Land pollution under 14.1, ecosystem resilience under 14.2, and ocean chemistry under 14.3 cannot be solved separately. Stopping plastic at the source, enforcing the 30x30 reserves, and slashing greenhouse gas emissions are three parts of a single mission: preserving life below water.</w:t>
-        <w:br/>
-        <w:br/>
-        <w:t>Thank you very much for your attention. Our team is now delighted to take your questions.</w:t>
+        <w:t>Speaker 5 — Target 14.3 Aim &amp; Indicators (Slides 9 &amp; 10)</w:t>
       </w:r>
     </w:p>
     <w:p>
       <w:r>
         <w:rPr>
           <w:b/>
-          <w:color w:val="0284C7"/>
+          <w:color w:val="475569"/>
+          <w:sz w:val="20"/>
         </w:rPr>
-        <w:t xml:space="preserve">Pronunciation Quick Guide: </w:t>
+        <w:t>Time Window: 10:00 to 12:30 (02:30 Target) • Role: Speaker 5 (Ocean Chemistry &amp; Carbon Sink Dynamics)</w:t>
+      </w:r>
+    </w:p>
+    <w:p>
+      <w:r>
+        <w:rPr>
+          <w:b/>
+          <w:sz w:val="20"/>
+        </w:rPr>
+        <w:t xml:space="preserve">Pronunciation Guide: </w:t>
       </w:r>
       <w:r>
         <w:rPr>
           <w:i/>
+          <w:sz w:val="20"/>
         </w:rPr>
-        <w:t>Spectrophotometric -&gt; [spek-troh-foh-toh-MET-rik] | Intergovernmental -&gt; [in-ter-guh-vern-MEN-tuhl] | Alkalinity -&gt; [al-kuh-LIN-uh-tee]</w:t>
+        <w:t>Acidification [uh-sid-uh-fuh-KAY-shun] | Logarithmic [log-uh-RITH-mik] | Aragonite [uh-RAG-uh-nyte]</w:t>
+      </w:r>
+    </w:p>
+    <w:p>
+      <w:pPr>
+        <w:spacing w:line="300" w:lineRule="auto" w:after="120"/>
+      </w:pPr>
+      <w:r>
+        <w:rPr>
+          <w:rFonts w:ascii="Arial" w:hAnsi="Arial"/>
+          <w:b/>
+          <w:color w:val="0284C7"/>
+          <w:sz w:val="22"/>
+        </w:rPr>
+        <w:t>[ON SLIDE 09 — TARGET 14.3 AIM]</w:t>
+      </w:r>
+    </w:p>
+    <w:p>
+      <w:pPr>
+        <w:spacing w:line="300" w:lineRule="auto" w:after="120"/>
+      </w:pPr>
+      <w:r>
+        <w:rPr>
+          <w:rFonts w:ascii="Arial" w:hAnsi="Arial"/>
+          <w:color w:val="0F172A"/>
+          <w:sz w:val="22"/>
+        </w:rPr>
+        <w:t>Thank you, Speaker 4. Hello everyone, I am Speaker 5.</w:t>
+      </w:r>
+    </w:p>
+    <w:p>
+      <w:pPr>
+        <w:spacing w:line="300" w:lineRule="auto" w:after="120"/>
+      </w:pPr>
+      <w:r>
+        <w:rPr>
+          <w:rFonts w:ascii="Arial" w:hAnsi="Arial"/>
+          <w:color w:val="0F172A"/>
+          <w:sz w:val="22"/>
+        </w:rPr>
+        <w:t>We descend into Target 14.3: Ocean Acidification. Question 1: What is the aim?</w:t>
+      </w:r>
+    </w:p>
+    <w:p>
+      <w:pPr>
+        <w:spacing w:line="300" w:lineRule="auto" w:after="120"/>
+      </w:pPr>
+      <w:r>
+        <w:rPr>
+          <w:rFonts w:ascii="Arial" w:hAnsi="Arial"/>
+          <w:color w:val="0F172A"/>
+          <w:sz w:val="22"/>
+        </w:rPr>
+        <w:t>The mandate requires humanity to minimize and address the impacts of ocean acidification, including through enhanced scientific cooperation at all levels. The ocean has served as Earth's primary climate shield, absorbing roughly 25 percent of all human-generated CO2 emissions. But this protection carries a grave chemical cost.</w:t>
+      </w:r>
+    </w:p>
+    <w:p>
+      <w:pPr>
+        <w:spacing w:line="300" w:lineRule="auto" w:after="120"/>
+      </w:pPr>
+      <w:r>
+        <w:rPr>
+          <w:rFonts w:ascii="Arial" w:hAnsi="Arial"/>
+          <w:color w:val="0F172A"/>
+          <w:sz w:val="22"/>
+        </w:rPr>
+        <w:t>When CO2 dissolves in seawater, it forms carbonic acid, releasing hydrogen ions. Since the industrial revolution, surface ocean pH has declined by 0.1 units. Because pH is on a logarithmic scale, a 0.1 decline represents a 30 percent surge in hydrogen ion acidity, stripping away the carbonate ions that shellfish, pteropods, and corals require to construct their protective shells.</w:t>
+      </w:r>
+    </w:p>
+    <w:p>
+      <w:pPr>
+        <w:spacing w:line="300" w:lineRule="auto" w:after="120"/>
+      </w:pPr>
+      <w:r>
+        <w:rPr>
+          <w:rFonts w:ascii="Arial" w:hAnsi="Arial"/>
+          <w:b/>
+          <w:color w:val="0284C7"/>
+          <w:sz w:val="22"/>
+        </w:rPr>
+        <w:t>[ADVANCE TO SLIDE 10 — INDICATOR 14.3.1]</w:t>
+      </w:r>
+    </w:p>
+    <w:p>
+      <w:pPr>
+        <w:spacing w:line="300" w:lineRule="auto" w:after="120"/>
+      </w:pPr>
+      <w:r>
+        <w:rPr>
+          <w:rFonts w:ascii="Arial" w:hAnsi="Arial"/>
+          <w:color w:val="0F172A"/>
+          <w:sz w:val="22"/>
+        </w:rPr>
+        <w:t>Question 2: What is the official indicator?</w:t>
+      </w:r>
+    </w:p>
+    <w:p>
+      <w:pPr>
+        <w:spacing w:line="300" w:lineRule="auto" w:after="120"/>
+      </w:pPr>
+      <w:r>
+        <w:rPr>
+          <w:rFonts w:ascii="Arial" w:hAnsi="Arial"/>
+          <w:color w:val="0F172A"/>
+          <w:sz w:val="22"/>
+        </w:rPr>
+        <w:t>The UN designated Indicator 14.3.1: Average marine acidity (pH) measured at an agreed suite of representative sampling stations. Measuring pH requires extraordinary scientific precision—down to 0.002 pH units on the 'Total pH scale' (pHT).</w:t>
+      </w:r>
+    </w:p>
+    <w:p>
+      <w:pPr>
+        <w:spacing w:line="300" w:lineRule="auto" w:after="120"/>
+      </w:pPr>
+      <w:r>
+        <w:rPr>
+          <w:rFonts w:ascii="Arial" w:hAnsi="Arial"/>
+          <w:color w:val="0F172A"/>
+          <w:sz w:val="22"/>
+        </w:rPr>
+        <w:t>Crucially, UN metadata mandates that pH must be reported alongside at least one co-parameter: Total Dissolved Inorganic Carbon (DIC) or Total Alkalinity. This enables calculation of the Aragonite Saturation State (Omega), determining the exact threshold where seawater transitions from nourishing shells to actively corroding them.</w:t>
       </w:r>
     </w:p>
     <w:p>
@@ -1180,23 +905,204 @@
           <w:b/>
           <w:color w:val="E11D48"/>
         </w:rPr>
-        <w:t xml:space="preserve">Handoff Cue: </w:t>
+        <w:t xml:space="preserve">🤝 Transition / Handoff Cue: </w:t>
       </w:r>
       <w:r>
         <w:rPr>
           <w:b/>
+          <w:i/>
         </w:rPr>
-        <w:t>"Thank you everyone. We invite our professor and classmates to share your feedback and questions."</w:t>
+        <w:t>"Speaker 6 will now conclude with autonomous robotic sensors, UNESCO governance, and our team's final synthesis."</w:t>
       </w:r>
     </w:p>
     <w:p>
       <w:r>
-        <w:br w:type="page"/>
+        <w:t>―――――――――――――――――――――――――――――――――――――――――――――――――――――――</w:t>
+      </w:r>
+    </w:p>
+    <w:p>
+      <w:pPr>
+        <w:pStyle w:val="Heading1"/>
+      </w:pPr>
+      <w:r>
+        <w:rPr>
+          <w:rFonts w:ascii="Arial" w:hAnsi="Arial"/>
+          <w:b/>
+          <w:color w:val="0284C7"/>
+          <w:sz w:val="32"/>
+        </w:rPr>
+        <w:t>Speaker 6 — Target 14.3 Measurement, Governance &amp; Synthesis (Slides 11 &amp; 12)</w:t>
+      </w:r>
+    </w:p>
+    <w:p>
+      <w:r>
+        <w:rPr>
+          <w:b/>
+          <w:color w:val="475569"/>
+          <w:sz w:val="20"/>
+        </w:rPr>
+        <w:t>Time Window: 12:30 to 15:00 (02:30 Target) • Role: Speaker 6 (Robotic Profiling, UNESCO &amp; Team Synthesis)</w:t>
+      </w:r>
+    </w:p>
+    <w:p>
+      <w:r>
+        <w:rPr>
+          <w:b/>
+          <w:sz w:val="20"/>
+        </w:rPr>
+        <w:t xml:space="preserve">Pronunciation Guide: </w:t>
+      </w:r>
+      <w:r>
+        <w:rPr>
+          <w:i/>
+          <w:sz w:val="20"/>
+        </w:rPr>
+        <w:t>Spectrophotometric [spek-troh-foh-toh-MET-rik] | Intergovernmental [in-ter-guh-vern-MEN-tuhl] | Synthesis [SIN-thuh-sis]</w:t>
+      </w:r>
+    </w:p>
+    <w:p>
+      <w:pPr>
+        <w:spacing w:line="300" w:lineRule="auto" w:after="120"/>
+      </w:pPr>
+      <w:r>
+        <w:rPr>
+          <w:rFonts w:ascii="Arial" w:hAnsi="Arial"/>
+          <w:b/>
+          <w:color w:val="0284C7"/>
+          <w:sz w:val="22"/>
+        </w:rPr>
+        <w:t>[ON SLIDE 11 — MEASUREMENT 14.3]</w:t>
+      </w:r>
+    </w:p>
+    <w:p>
+      <w:pPr>
+        <w:spacing w:line="300" w:lineRule="auto" w:after="120"/>
+      </w:pPr>
+      <w:r>
+        <w:rPr>
+          <w:rFonts w:ascii="Arial" w:hAnsi="Arial"/>
+          <w:color w:val="0F172A"/>
+          <w:sz w:val="22"/>
+        </w:rPr>
+        <w:t>Thank you, Speaker 5. Hello everyone, I am Speaker 6, and I will deliver our final section and synthesis.</w:t>
+      </w:r>
+    </w:p>
+    <w:p>
+      <w:pPr>
+        <w:spacing w:line="300" w:lineRule="auto" w:after="120"/>
+      </w:pPr>
+      <w:r>
+        <w:rPr>
+          <w:rFonts w:ascii="Arial" w:hAnsi="Arial"/>
+          <w:color w:val="0F172A"/>
+          <w:sz w:val="22"/>
+        </w:rPr>
+        <w:t>Question 3: How is ocean acidity measured scientifically?</w:t>
+      </w:r>
+    </w:p>
+    <w:p>
+      <w:pPr>
+        <w:spacing w:line="300" w:lineRule="auto" w:after="120"/>
+      </w:pPr>
+      <w:r>
+        <w:rPr>
+          <w:rFonts w:ascii="Arial" w:hAnsi="Arial"/>
+          <w:color w:val="0F172A"/>
+          <w:sz w:val="22"/>
+        </w:rPr>
+        <w:t>Because ocean pH fluctuates with depth, temperature, and seasonal biology, scientists cannot rely on simple spot checks. Measurement is executed through the Global Ocean Acidification Observing Network (GOA-ON).</w:t>
+      </w:r>
+    </w:p>
+    <w:p>
+      <w:pPr>
+        <w:spacing w:line="300" w:lineRule="auto" w:after="120"/>
+      </w:pPr>
+      <w:r>
+        <w:rPr>
+          <w:rFonts w:ascii="Arial" w:hAnsi="Arial"/>
+          <w:color w:val="0F172A"/>
+          <w:sz w:val="22"/>
+        </w:rPr>
+        <w:t>Key technologies include autonomous Biogeochemical Argo profiling floats (BGC-Argo) that dive to 2,000 meters measuring pH with ion-sensitive field-effect transistors (ISFET), fixed deep-sea ocean moorings, and automated spectrophotometry using purified m-Cresol purple dye aboard oceanographic research vessels.</w:t>
+      </w:r>
+    </w:p>
+    <w:p>
+      <w:pPr>
+        <w:spacing w:line="300" w:lineRule="auto" w:after="120"/>
+      </w:pPr>
+      <w:r>
+        <w:rPr>
+          <w:rFonts w:ascii="Arial" w:hAnsi="Arial"/>
+          <w:b/>
+          <w:color w:val="0284C7"/>
+          <w:sz w:val="22"/>
+        </w:rPr>
+        <w:t>[ADVANCE TO SLIDE 12 — GOVERNANCE 14.3 &amp; SYNTHESIS]</w:t>
+      </w:r>
+    </w:p>
+    <w:p>
+      <w:pPr>
+        <w:spacing w:line="300" w:lineRule="auto" w:after="120"/>
+      </w:pPr>
+      <w:r>
+        <w:rPr>
+          <w:rFonts w:ascii="Arial" w:hAnsi="Arial"/>
+          <w:color w:val="0F172A"/>
+          <w:sz w:val="22"/>
+        </w:rPr>
+        <w:t>Question 4: Who governs Target 14.3 and what is the final synthesis?</w:t>
+      </w:r>
+    </w:p>
+    <w:p>
+      <w:pPr>
+        <w:spacing w:line="300" w:lineRule="auto" w:after="120"/>
+      </w:pPr>
+      <w:r>
+        <w:rPr>
+          <w:rFonts w:ascii="Arial" w:hAnsi="Arial"/>
+          <w:color w:val="0F172A"/>
+          <w:sz w:val="22"/>
+        </w:rPr>
+        <w:t>The custodian agency is UNESCO’s Intergovernmental Oceanographic Commission (IOC-UNESCO). IOC coordinates GOA-ON and maintains the global data repository. A major focus is resolving global equity: Small Island Developing States (SIDS) face the highest vulnerability but have historically had the fewest monitoring buoys. Through the UN Ocean Decade, UNESCO deploys 'Ocean Acidification in a Box' low-cost testing kits to close this gap.</w:t>
+      </w:r>
+    </w:p>
+    <w:p>
+      <w:pPr>
+        <w:spacing w:line="300" w:lineRule="auto" w:after="120"/>
+      </w:pPr>
+      <w:r>
+        <w:rPr>
+          <w:rFonts w:ascii="Arial" w:hAnsi="Arial"/>
+          <w:color w:val="0F172A"/>
+          <w:sz w:val="22"/>
+        </w:rPr>
+        <w:t>To conclude: SDG 14 demonstrates that the ocean is one indivisible planetary life-support system. Land-based pollution under 14.1, habitat resilience under 14.2, and ocean chemistry under 14.3 are deeply intertwined. Halting plastic and fertilizer runoff, enforcing the 30x30 marine reserves, and slashing greenhouse gas emissions under the Paris Agreement are not separate goals—they are three pillars of one unified mission: protecting life below water.</w:t>
+      </w:r>
+    </w:p>
+    <w:p>
+      <w:r>
+        <w:rPr>
+          <w:b/>
+          <w:color w:val="E11D48"/>
+        </w:rPr>
+        <w:t xml:space="preserve">🤝 Transition / Handoff Cue: </w:t>
+      </w:r>
+      <w:r>
+        <w:rPr>
+          <w:b/>
+          <w:i/>
+        </w:rPr>
+        <w:t>"Thank you for your attention. Our team is now delighted to take any questions from the class."</w:t>
+      </w:r>
+    </w:p>
+    <w:p>
+      <w:r>
+        <w:t>―――――――――――――――――――――――――――――――――――――――――――――――――――――――</w:t>
       </w:r>
     </w:p>
     <w:sectPr>
       <w:pgSz w:w="12240" w:h="15840"/>
-      <w:pgMar w:top="1152" w:right="1296" w:bottom="1152" w:left="1296" w:header="720" w:footer="720" w:gutter="0"/>
+      <w:pgMar w:top="1440" w:right="1440" w:bottom="1440" w:left="1440" w:header="720" w:footer="720" w:gutter="0"/>
       <w:cols w:space="720"/>
       <w:docGrid w:linePitch="360"/>
     </w:sectPr>

</xml_diff>

<commit_message>
revert: restore exact visual design and cards, fix navigation button syntax error
</commit_message>
<xml_diff>
--- a/SDG14_Official_Speaker_Script.docx
+++ b/SDG14_Official_Speaker_Script.docx
@@ -13,7 +13,7 @@
           <w:color w:val="0284C7"/>
           <w:sz w:val="40"/>
         </w:rPr>
-        <w:t>SDG 14: LIFE BELOW WATER — OFFICIAL 6-SPEAKER SCRIPT</w:t>
+        <w:t>UNITED NATIONS SDG 14: LIFE BELOW WATER</w:t>
       </w:r>
     </w:p>
     <w:p>
@@ -23,27 +23,210 @@
       <w:r>
         <w:rPr>
           <w:rFonts w:ascii="Arial" w:hAnsi="Arial"/>
-          <w:i/>
+          <w:color w:val="64748B"/>
           <w:sz w:val="22"/>
         </w:rPr>
-        <w:t>Framework: 3 Targets × 4 Core Questions • 12 Slides Total • 15 Minutes (02:30 per Speaker)</w:t>
+        <w:t>Official 6-Speaker Rehearsal Dossier &amp; Slide-by-Slide Script</w:t>
+        <w:br/>
+        <w:t>Targets 14.1, 14.2 &amp; 14.3 | Total Duration: 15:00 (2:30 per speaker)</w:t>
       </w:r>
     </w:p>
     <w:p>
       <w:pPr>
-        <w:jc w:val="center"/>
+        <w:spacing w:after="240"/>
+      </w:pPr>
+    </w:p>
+    <w:p>
+      <w:pPr>
+        <w:pStyle w:val="Heading1"/>
       </w:pPr>
       <w:r>
         <w:rPr>
-          <w:color w:val="64748B"/>
-          <w:sz w:val="19"/>
+          <w:rFonts w:ascii="Arial" w:hAnsi="Arial"/>
+          <w:b/>
+          <w:color w:val="0284C7"/>
+          <w:sz w:val="28"/>
         </w:rPr>
-        <w:t>Prepared for: skrongdattv1@gmail.com (Kiris) • Formatted with Heading 1 for Google Docs Document Tabs</w:t>
+        <w:t>TAB / SECTION: SPEAKER 1: THE BIG PICTURE &amp; CAUSAL CHAIN</w:t>
+      </w:r>
+    </w:p>
+    <w:tbl>
+      <w:tblPr>
+        <w:tblW w:type="auto" w:w="0"/>
+        <w:jc w:val="center"/>
+        <w:tblLayout w:type="fixed"/>
+        <w:tblLook w:firstColumn="1" w:firstRow="1" w:lastColumn="0" w:lastRow="0" w:noHBand="0" w:noVBand="1" w:val="04A0"/>
+      </w:tblPr>
+      <w:tblGrid>
+        <w:gridCol w:w="4824"/>
+        <w:gridCol w:w="4824"/>
+      </w:tblGrid>
+      <w:tr>
+        <w:tc>
+          <w:tcPr>
+            <w:tcW w:type="dxa" w:w="2592"/>
+            <w:shd w:fill="F1F5F9"/>
+          </w:tcPr>
+          <w:p>
+            <w:r>
+              <w:rPr>
+                <w:b/>
+              </w:rPr>
+              <w:t>Allocated Time:</w:t>
+            </w:r>
+          </w:p>
+        </w:tc>
+        <w:tc>
+          <w:tcPr>
+            <w:tcW w:type="dxa" w:w="7488"/>
+            <w:shd w:fill="FFFFFF"/>
+          </w:tcPr>
+          <w:p>
+            <w:r>
+              <w:t>00:00 - 02:30 (Target: 2 min 20 sec)</w:t>
+            </w:r>
+          </w:p>
+        </w:tc>
+      </w:tr>
+      <w:tr>
+        <w:tc>
+          <w:tcPr>
+            <w:tcW w:type="dxa" w:w="2592"/>
+            <w:shd w:fill="F1F5F9"/>
+          </w:tcPr>
+          <w:p>
+            <w:r>
+              <w:rPr>
+                <w:b/>
+              </w:rPr>
+              <w:t>Slides Covered:</w:t>
+            </w:r>
+          </w:p>
+        </w:tc>
+        <w:tc>
+          <w:tcPr>
+            <w:tcW w:type="dxa" w:w="7488"/>
+            <w:shd w:fill="FFFFFF"/>
+          </w:tcPr>
+          <w:p>
+            <w:r>
+              <w:t>Slide 1 &amp; Slide 2</w:t>
+            </w:r>
+          </w:p>
+        </w:tc>
+      </w:tr>
+      <w:tr>
+        <w:tc>
+          <w:tcPr>
+            <w:tcW w:type="dxa" w:w="2592"/>
+            <w:shd w:fill="F1F5F9"/>
+          </w:tcPr>
+          <w:p>
+            <w:r>
+              <w:rPr>
+                <w:b/>
+              </w:rPr>
+              <w:t>Core Focus:</w:t>
+            </w:r>
+          </w:p>
+        </w:tc>
+        <w:tc>
+          <w:tcPr>
+            <w:tcW w:type="dxa" w:w="7488"/>
+            <w:shd w:fill="FFFFFF"/>
+          </w:tcPr>
+          <w:p>
+            <w:r>
+              <w:t>Opening Hook, Overview of Targets 14.1-14.3, The 4 Core Questions, The Upstream-to-Abyss Risk Cascade</w:t>
+            </w:r>
+          </w:p>
+        </w:tc>
+      </w:tr>
+    </w:tbl>
+    <w:p>
+      <w:pPr>
+        <w:spacing w:after="160"/>
+      </w:pPr>
+    </w:p>
+    <w:p>
+      <w:pPr>
+        <w:pStyle w:val="Heading2"/>
+      </w:pPr>
+      <w:r>
+        <w:rPr>
+          <w:rFonts w:ascii="Arial" w:hAnsi="Arial"/>
+          <w:color w:val="0F172A"/>
+          <w:sz w:val="24"/>
+        </w:rPr>
+        <w:t>Verbatim Spoken English Script (Read Naturally):</w:t>
+      </w:r>
+    </w:p>
+    <w:p>
+      <w:pPr>
+        <w:spacing w:line="300" w:lineRule="auto" w:after="240"/>
+      </w:pPr>
+      <w:r>
+        <w:rPr>
+          <w:rFonts w:ascii="Arial" w:hAnsi="Arial"/>
+          <w:sz w:val="21"/>
+        </w:rPr>
+        <w:t>Good morning, professor and fellow classmates. Today, our team is presenting United Nations Sustainable Development Goal 14: Life Below Water.</w:t>
+        <w:br/>
+        <w:br/>
+        <w:t>The ocean generates over 50 percent of the oxygen we breathe, absorbs a quarter of all global carbon dioxide emissions, and directly sustains the livelihoods of over three billion human beings. Yet today, marine systems face unprecedented ecological disruption.</w:t>
+        <w:br/>
+        <w:br/>
+        <w:t>Our team focuses on three foundational targets: Target 14.1 on Marine Pollution; Target 14.2 on Ecosystem Resilience; and Target 14.3 on Ocean Acidification.</w:t>
+        <w:br/>
+        <w:br/>
+        <w:t>For each target, we systematically address four non-negotiable questions: First, what does the target aim to achieve? Second, what official indicators monitor global progress? Third, how are these indicators measured scientifically? And fourth, what international institutions and governance treaties enforce compliance?</w:t>
+        <w:br/>
+        <w:br/>
+        <w:t>[PAUSE — ADVANCE TO SLIDE 2]</w:t>
+        <w:br/>
+        <w:br/>
+        <w:t>Before diving into each target individually, look at how they connect. They do not operate in silos; they form an unbroken causal chain of risk.</w:t>
+        <w:br/>
+        <w:br/>
+        <w:t>It starts upstream under Target 14.1: agricultural fertilizers and city plastics exert massive pressure on coastal waters. That pressure travels into Target 14.2, where fragile coral reefs and mangrove nurseries suffer habitat degradation. And simultaneously, Target 14.3 monitors global ocean chemistry as excess atmospheric CO2 permanently alters the pH balance of the entire water column.</w:t>
+        <w:br/>
+        <w:br/>
+        <w:t>To understand the first line of defense, I now pass the floor to Speaker 2 to break down Target 14.1.</w:t>
       </w:r>
     </w:p>
     <w:p>
       <w:r>
-        <w:t>―――――――――――――――――――――――――――――――――――――――――――――――――――――――</w:t>
+        <w:rPr>
+          <w:b/>
+          <w:color w:val="0284C7"/>
+        </w:rPr>
+        <w:t xml:space="preserve">Pronunciation Quick Guide: </w:t>
+      </w:r>
+      <w:r>
+        <w:rPr>
+          <w:i/>
+        </w:rPr>
+        <w:t>Ecosystem -&gt; [EE-koh-sis-tuhm] | Indicator -&gt; [IN-dih-kay-ter] | Acidification -&gt; [uh-sid-uh-fuh-KAY-shun]</w:t>
+      </w:r>
+    </w:p>
+    <w:p>
+      <w:r>
+        <w:rPr>
+          <w:b/>
+          <w:color w:val="E11D48"/>
+        </w:rPr>
+        <w:t xml:space="preserve">Handoff Cue: </w:t>
+      </w:r>
+      <w:r>
+        <w:rPr>
+          <w:b/>
+        </w:rPr>
+        <w:t>"I now hand over to Speaker 2, who will examine the source of marine pollution under Target 14.1."</w:t>
+      </w:r>
+    </w:p>
+    <w:p>
+      <w:r>
+        <w:br w:type="page"/>
       </w:r>
     </w:p>
     <w:p>
@@ -55,141 +238,168 @@
           <w:rFonts w:ascii="Arial" w:hAnsi="Arial"/>
           <w:b/>
           <w:color w:val="0284C7"/>
-          <w:sz w:val="32"/>
+          <w:sz w:val="28"/>
         </w:rPr>
-        <w:t>Speaker 1 — Target 14.1 Aim &amp; Indicators (Slides 1 &amp; 2)</w:t>
+        <w:t>TAB / SECTION: SPEAKER 2: TARGET 14.1 &amp; THE DUAL INDICATORS</w:t>
+      </w:r>
+    </w:p>
+    <w:tbl>
+      <w:tblPr>
+        <w:tblW w:type="auto" w:w="0"/>
+        <w:jc w:val="center"/>
+        <w:tblLayout w:type="fixed"/>
+        <w:tblLook w:firstColumn="1" w:firstRow="1" w:lastColumn="0" w:lastRow="0" w:noHBand="0" w:noVBand="1" w:val="04A0"/>
+      </w:tblPr>
+      <w:tblGrid>
+        <w:gridCol w:w="4824"/>
+        <w:gridCol w:w="4824"/>
+      </w:tblGrid>
+      <w:tr>
+        <w:tc>
+          <w:tcPr>
+            <w:tcW w:type="dxa" w:w="2592"/>
+            <w:shd w:fill="F1F5F9"/>
+          </w:tcPr>
+          <w:p>
+            <w:r>
+              <w:rPr>
+                <w:b/>
+              </w:rPr>
+              <w:t>Allocated Time:</w:t>
+            </w:r>
+          </w:p>
+        </w:tc>
+        <w:tc>
+          <w:tcPr>
+            <w:tcW w:type="dxa" w:w="7488"/>
+            <w:shd w:fill="FFFFFF"/>
+          </w:tcPr>
+          <w:p>
+            <w:r>
+              <w:t>02:30 - 05:00 (Target: 2 min 20 sec)</w:t>
+            </w:r>
+          </w:p>
+        </w:tc>
+      </w:tr>
+      <w:tr>
+        <w:tc>
+          <w:tcPr>
+            <w:tcW w:type="dxa" w:w="2592"/>
+            <w:shd w:fill="F1F5F9"/>
+          </w:tcPr>
+          <w:p>
+            <w:r>
+              <w:rPr>
+                <w:b/>
+              </w:rPr>
+              <w:t>Slides Covered:</w:t>
+            </w:r>
+          </w:p>
+        </w:tc>
+        <w:tc>
+          <w:tcPr>
+            <w:tcW w:type="dxa" w:w="7488"/>
+            <w:shd w:fill="FFFFFF"/>
+          </w:tcPr>
+          <w:p>
+            <w:r>
+              <w:t>Slide 3 &amp; Slide 4</w:t>
+            </w:r>
+          </w:p>
+        </w:tc>
+      </w:tr>
+      <w:tr>
+        <w:tc>
+          <w:tcPr>
+            <w:tcW w:type="dxa" w:w="2592"/>
+            <w:shd w:fill="F1F5F9"/>
+          </w:tcPr>
+          <w:p>
+            <w:r>
+              <w:rPr>
+                <w:b/>
+              </w:rPr>
+              <w:t>Core Focus:</w:t>
+            </w:r>
+          </w:p>
+        </w:tc>
+        <w:tc>
+          <w:tcPr>
+            <w:tcW w:type="dxa" w:w="7488"/>
+            <w:shd w:fill="FFFFFF"/>
+          </w:tcPr>
+          <w:p>
+            <w:r>
+              <w:t>Target 14.1 Mandate, The 80% Land-Based Origin, 2025 Deadline, Indicator 14.1.1(a) vs 14.1.1(b)</w:t>
+            </w:r>
+          </w:p>
+        </w:tc>
+      </w:tr>
+    </w:tbl>
+    <w:p>
+      <w:pPr>
+        <w:spacing w:after="160"/>
+      </w:pPr>
+    </w:p>
+    <w:p>
+      <w:pPr>
+        <w:pStyle w:val="Heading2"/>
+      </w:pPr>
+      <w:r>
+        <w:rPr>
+          <w:rFonts w:ascii="Arial" w:hAnsi="Arial"/>
+          <w:color w:val="0F172A"/>
+          <w:sz w:val="24"/>
+        </w:rPr>
+        <w:t>Verbatim Spoken English Script (Read Naturally):</w:t>
+      </w:r>
+    </w:p>
+    <w:p>
+      <w:pPr>
+        <w:spacing w:line="300" w:lineRule="auto" w:after="240"/>
+      </w:pPr>
+      <w:r>
+        <w:rPr>
+          <w:rFonts w:ascii="Arial" w:hAnsi="Arial"/>
+          <w:sz w:val="21"/>
+        </w:rPr>
+        <w:t>Thank you, Speaker 1. Hello everyone, I am Speaker 2.</w:t>
+        <w:br/>
+        <w:br/>
+        <w:t>Target 14.1 is the frontline defense of marine conservation. Its official mandate is clear: by 2025, prevent and significantly reduce marine pollution of all kinds, in particular from land-based activities.</w:t>
+        <w:br/>
+        <w:br/>
+        <w:t>Notice two critical facts here: First, up to 80 percent of all marine litter and pollution originates on dry land—through agricultural fertilizer runoff, untreated municipal wastewater, and mismanaged municipal solid waste flowing into river basins. Second, the official target deadline was set for 2025. That means we are already operating past the original timeline, making accelerated monitoring vital.</w:t>
+        <w:br/>
+        <w:br/>
+        <w:t>[PAUSE — ADVANCE TO SLIDE 4]</w:t>
+        <w:br/>
+        <w:br/>
+        <w:t>To monitor Target 14.1, the United Nations established Indicator 14.1.1, split into two distinct pathways.</w:t>
+        <w:br/>
+        <w:br/>
+        <w:t>Sub-indicator 14.1.1(a) is the Index of Coastal Eutrophication, or ICEP. This monitors invisible chemical pollution—specifically nitrogen and phosphorus from fertilizers. When excess nutrients wash into coastal seas, they cause catastrophic algal blooms that suck oxygen out of the water, creating suffocating dead zones.</w:t>
+        <w:br/>
+        <w:br/>
+        <w:t>Sub-indicator 14.1.1(b) is Plastic Debris Density. This monitors solid waste accumulation across two realms: floating macro- and micro-plastics in surface waters, and plastic trash accumulating along shorelines.</w:t>
+        <w:br/>
+        <w:br/>
+        <w:t>Now, how do scientists actually measure invisible fertilizer runoff and tons of scattered plastic? Speaker 3 will explain the scientific measurement methods and governance.</w:t>
       </w:r>
     </w:p>
     <w:p>
       <w:r>
         <w:rPr>
           <w:b/>
-          <w:color w:val="475569"/>
-          <w:sz w:val="20"/>
+          <w:color w:val="0284C7"/>
         </w:rPr>
-        <w:t>Time Window: 00:00 to 02:30 (02:30 Target) • Role: Speaker 1 (Opening &amp; Target 14.1 Fundamentals)</w:t>
-      </w:r>
-    </w:p>
-    <w:p>
-      <w:r>
-        <w:rPr>
-          <w:b/>
-          <w:sz w:val="20"/>
-        </w:rPr>
-        <w:t xml:space="preserve">Pronunciation Guide: </w:t>
+        <w:t xml:space="preserve">Pronunciation Quick Guide: </w:t>
       </w:r>
       <w:r>
         <w:rPr>
           <w:i/>
-          <w:sz w:val="20"/>
         </w:rPr>
-        <w:t>Eutrophication [yoo-truh-fuh-KAY-shun] | Phosphorus [FOS-fuh-ruhs] | Hypoxic [hy-POK-sik]</w:t>
-      </w:r>
-    </w:p>
-    <w:p>
-      <w:pPr>
-        <w:spacing w:line="300" w:lineRule="auto" w:after="120"/>
-      </w:pPr>
-      <w:r>
-        <w:rPr>
-          <w:rFonts w:ascii="Arial" w:hAnsi="Arial"/>
-          <w:b/>
-          <w:color w:val="0284C7"/>
-          <w:sz w:val="22"/>
-        </w:rPr>
-        <w:t>[ON SLIDE 01 — TARGET 14.1 AIM]</w:t>
-      </w:r>
-    </w:p>
-    <w:p>
-      <w:pPr>
-        <w:spacing w:line="300" w:lineRule="auto" w:after="120"/>
-      </w:pPr>
-      <w:r>
-        <w:rPr>
-          <w:rFonts w:ascii="Arial" w:hAnsi="Arial"/>
-          <w:color w:val="0F172A"/>
-          <w:sz w:val="22"/>
-        </w:rPr>
-        <w:t>Good morning, professor and fellow classmates. Today, our team is presenting United Nations Sustainable Development Goal 14: Life Below Water. Our study is built upon a rigorous matrix: three foundational targets examined across four essential questions.</w:t>
-      </w:r>
-    </w:p>
-    <w:p>
-      <w:pPr>
-        <w:spacing w:line="300" w:lineRule="auto" w:after="120"/>
-      </w:pPr>
-      <w:r>
-        <w:rPr>
-          <w:rFonts w:ascii="Arial" w:hAnsi="Arial"/>
-          <w:color w:val="0F172A"/>
-          <w:sz w:val="22"/>
-        </w:rPr>
-        <w:t>I begin with Target 14.1: Marine Pollution. Question 1 asks: What does this target aim to achieve?</w:t>
-      </w:r>
-    </w:p>
-    <w:p>
-      <w:pPr>
-        <w:spacing w:line="300" w:lineRule="auto" w:after="120"/>
-      </w:pPr>
-      <w:r>
-        <w:rPr>
-          <w:rFonts w:ascii="Arial" w:hAnsi="Arial"/>
-          <w:color w:val="0F172A"/>
-          <w:sz w:val="22"/>
-        </w:rPr>
-        <w:t>The official UN mandate is unequivocal: by 2025, prevent and significantly reduce marine pollution of all kinds, in particular from land-based activities. Notice two vital dimensions: First, up to 80 percent of all marine litter originates inland—carried by river basins from agricultural runoff and municipal solid waste. Second, 2025 was the original deadline, meaning global implementation is operating under severe time pressure.</w:t>
-      </w:r>
-    </w:p>
-    <w:p>
-      <w:pPr>
-        <w:spacing w:line="300" w:lineRule="auto" w:after="120"/>
-      </w:pPr>
-      <w:r>
-        <w:rPr>
-          <w:rFonts w:ascii="Arial" w:hAnsi="Arial"/>
-          <w:b/>
-          <w:color w:val="0284C7"/>
-          <w:sz w:val="22"/>
-        </w:rPr>
-        <w:t>[ADVANCE TO SLIDE 02 — INDICATOR 14.1.1]</w:t>
-      </w:r>
-    </w:p>
-    <w:p>
-      <w:pPr>
-        <w:spacing w:line="300" w:lineRule="auto" w:after="120"/>
-      </w:pPr>
-      <w:r>
-        <w:rPr>
-          <w:rFonts w:ascii="Arial" w:hAnsi="Arial"/>
-          <w:color w:val="0F172A"/>
-          <w:sz w:val="22"/>
-        </w:rPr>
-        <w:t>Question 2: What official indicators track this progress?</w:t>
-      </w:r>
-    </w:p>
-    <w:p>
-      <w:pPr>
-        <w:spacing w:line="300" w:lineRule="auto" w:after="120"/>
-      </w:pPr>
-      <w:r>
-        <w:rPr>
-          <w:rFonts w:ascii="Arial" w:hAnsi="Arial"/>
-          <w:color w:val="0F172A"/>
-          <w:sz w:val="22"/>
-        </w:rPr>
-        <w:t>The UN designated Indicator 14.1.1, split into two complementary monitoring pathways. Sub-indicator 14.1.1(a) is the Index of Coastal Eutrophication Potential, or ICEP. It tracks invisible chemical pollution—specifically nitrogen and phosphorus fertilizers. When excess nutrients wash into coastal waters, they spark massive algal blooms that consume dissolved oxygen, resulting in over 500 oceanic dead zones worldwide.</w:t>
-      </w:r>
-    </w:p>
-    <w:p>
-      <w:pPr>
-        <w:spacing w:line="300" w:lineRule="auto" w:after="120"/>
-      </w:pPr>
-      <w:r>
-        <w:rPr>
-          <w:rFonts w:ascii="Arial" w:hAnsi="Arial"/>
-          <w:color w:val="0F172A"/>
-          <w:sz w:val="22"/>
-        </w:rPr>
-        <w:t>Sub-indicator 14.1.1(b) is Plastic Debris Density, measuring both floating macro- and micro-plastics in surface waters and solid waste accumulation per kilometer of coastline.</w:t>
+        <w:t>Eutrophication -&gt; [yoo-truh-fuh-KAY-shun] | Phosphorus -&gt; [FOS-fuh-ruhs] | Debris -&gt; [duh-BREE (silent s)]</w:t>
       </w:r>
     </w:p>
     <w:p>
@@ -198,19 +408,18 @@
           <w:b/>
           <w:color w:val="E11D48"/>
         </w:rPr>
-        <w:t xml:space="preserve">🤝 Transition / Handoff Cue: </w:t>
+        <w:t xml:space="preserve">Handoff Cue: </w:t>
       </w:r>
       <w:r>
         <w:rPr>
           <w:b/>
-          <w:i/>
         </w:rPr>
-        <w:t>"Speaker 2 will now explain how scientists measure this pollution from space and how international treaties govern it."</w:t>
+        <w:t>"Speaker 3 will now walk us through how satellites and beach surveys turn these indicators into concrete global data."</w:t>
       </w:r>
     </w:p>
     <w:p>
       <w:r>
-        <w:t>―――――――――――――――――――――――――――――――――――――――――――――――――――――――</w:t>
+        <w:br w:type="page"/>
       </w:r>
     </w:p>
     <w:p>
@@ -222,154 +431,168 @@
           <w:rFonts w:ascii="Arial" w:hAnsi="Arial"/>
           <w:b/>
           <w:color w:val="0284C7"/>
-          <w:sz w:val="32"/>
+          <w:sz w:val="28"/>
         </w:rPr>
-        <w:t>Speaker 2 — Target 14.1 Measurement &amp; Governance (Slides 3 &amp; 4)</w:t>
+        <w:t>TAB / SECTION: SPEAKER 3: MEASUREMENT &amp; GOVERNANCE OF 14.1</w:t>
+      </w:r>
+    </w:p>
+    <w:tbl>
+      <w:tblPr>
+        <w:tblW w:type="auto" w:w="0"/>
+        <w:jc w:val="center"/>
+        <w:tblLayout w:type="fixed"/>
+        <w:tblLook w:firstColumn="1" w:firstRow="1" w:lastColumn="0" w:lastRow="0" w:noHBand="0" w:noVBand="1" w:val="04A0"/>
+      </w:tblPr>
+      <w:tblGrid>
+        <w:gridCol w:w="4824"/>
+        <w:gridCol w:w="4824"/>
+      </w:tblGrid>
+      <w:tr>
+        <w:tc>
+          <w:tcPr>
+            <w:tcW w:type="dxa" w:w="2592"/>
+            <w:shd w:fill="F1F5F9"/>
+          </w:tcPr>
+          <w:p>
+            <w:r>
+              <w:rPr>
+                <w:b/>
+              </w:rPr>
+              <w:t>Allocated Time:</w:t>
+            </w:r>
+          </w:p>
+        </w:tc>
+        <w:tc>
+          <w:tcPr>
+            <w:tcW w:type="dxa" w:w="7488"/>
+            <w:shd w:fill="FFFFFF"/>
+          </w:tcPr>
+          <w:p>
+            <w:r>
+              <w:t>05:00 - 07:30 (Target: 2 min 20 sec)</w:t>
+            </w:r>
+          </w:p>
+        </w:tc>
+      </w:tr>
+      <w:tr>
+        <w:tc>
+          <w:tcPr>
+            <w:tcW w:type="dxa" w:w="2592"/>
+            <w:shd w:fill="F1F5F9"/>
+          </w:tcPr>
+          <w:p>
+            <w:r>
+              <w:rPr>
+                <w:b/>
+              </w:rPr>
+              <w:t>Slides Covered:</w:t>
+            </w:r>
+          </w:p>
+        </w:tc>
+        <w:tc>
+          <w:tcPr>
+            <w:tcW w:type="dxa" w:w="7488"/>
+            <w:shd w:fill="FFFFFF"/>
+          </w:tcPr>
+          <w:p>
+            <w:r>
+              <w:t>Slide 5 &amp; Slide 6</w:t>
+            </w:r>
+          </w:p>
+        </w:tc>
+      </w:tr>
+      <w:tr>
+        <w:tc>
+          <w:tcPr>
+            <w:tcW w:type="dxa" w:w="2592"/>
+            <w:shd w:fill="F1F5F9"/>
+          </w:tcPr>
+          <w:p>
+            <w:r>
+              <w:rPr>
+                <w:b/>
+              </w:rPr>
+              <w:t>Core Focus:</w:t>
+            </w:r>
+          </w:p>
+        </w:tc>
+        <w:tc>
+          <w:tcPr>
+            <w:tcW w:type="dxa" w:w="7488"/>
+            <w:shd w:fill="FFFFFF"/>
+          </w:tcPr>
+          <w:p>
+            <w:r>
+              <w:t>Satellite Optical Sensing, Chlorophyll-a Anomalies, 100m Beach Transects, UNEP Custodian, INC Global Plastics Treaty</w:t>
+            </w:r>
+          </w:p>
+        </w:tc>
+      </w:tr>
+    </w:tbl>
+    <w:p>
+      <w:pPr>
+        <w:spacing w:after="160"/>
+      </w:pPr>
+    </w:p>
+    <w:p>
+      <w:pPr>
+        <w:pStyle w:val="Heading2"/>
+      </w:pPr>
+      <w:r>
+        <w:rPr>
+          <w:rFonts w:ascii="Arial" w:hAnsi="Arial"/>
+          <w:color w:val="0F172A"/>
+          <w:sz w:val="24"/>
+        </w:rPr>
+        <w:t>Verbatim Spoken English Script (Read Naturally):</w:t>
+      </w:r>
+    </w:p>
+    <w:p>
+      <w:pPr>
+        <w:spacing w:line="300" w:lineRule="auto" w:after="240"/>
+      </w:pPr>
+      <w:r>
+        <w:rPr>
+          <w:rFonts w:ascii="Arial" w:hAnsi="Arial"/>
+          <w:sz w:val="21"/>
+        </w:rPr>
+        <w:t>Thank you, Speaker 2. Hello everyone, I am Speaker 3.</w:t>
+        <w:br/>
+        <w:br/>
+        <w:t>Measuring pollution across hundreds of millions of square miles of open ocean requires two complementary scientific techniques.</w:t>
+        <w:br/>
+        <w:br/>
+        <w:t>For coastal eutrophication, marine scientists use satellite remote sensing. NASA’s MODIS and the European Space Agency’s Sentinel-3 satellites continuously scan ocean surface color from orbit. They calculate Chlorophyll-a concentration anomalies. When chlorophyll levels spike far above the historical baseline, it proves that agricultural nutrient pollution has triggered an abnormal algal bloom.</w:t>
+        <w:br/>
+        <w:br/>
+        <w:t>For plastic debris density, scientists use standardized 100-meter beach transects and manta trawl surface nets. Citizen science groups and environmental agencies count, weigh, and categorize every plastic item along designated 100-meter strips of shoreline.</w:t>
+        <w:br/>
+        <w:br/>
+        <w:t>[PAUSE — ADVANCE TO SLIDE 6]</w:t>
+        <w:br/>
+        <w:br/>
+        <w:t>Now, who governs Target 14.1? The United Nations Environment Programme, or UNEP, serves as the official global custodian agency. UNEP standardizes country reporting and aggregates national data.</w:t>
+        <w:br/>
+        <w:br/>
+        <w:t>At the international policy level, the most important breakthrough is the ongoing negotiation of the Intergovernmental Negotiating Committee—the INC Global Plastics Treaty. This treaty aims to establish a legally binding international instrument addressing the full lifecycle of plastics, from chemical design to marine leakage.</w:t>
+        <w:br/>
+        <w:br/>
+        <w:t>Having tackled marine pollution, we now move downstream to living habitats. Speaker 4 will introduce Target 14.2.</w:t>
       </w:r>
     </w:p>
     <w:p>
       <w:r>
         <w:rPr>
           <w:b/>
-          <w:color w:val="475569"/>
-          <w:sz w:val="20"/>
+          <w:color w:val="0284C7"/>
         </w:rPr>
-        <w:t>Time Window: 02:30 to 05:00 (02:30 Target) • Role: Speaker 2 (Scientific Measurement &amp; Marine Law)</w:t>
-      </w:r>
-    </w:p>
-    <w:p>
-      <w:r>
-        <w:rPr>
-          <w:b/>
-          <w:sz w:val="20"/>
-        </w:rPr>
-        <w:t xml:space="preserve">Pronunciation Guide: </w:t>
+        <w:t xml:space="preserve">Pronunciation Quick Guide: </w:t>
       </w:r>
       <w:r>
         <w:rPr>
           <w:i/>
-          <w:sz w:val="20"/>
         </w:rPr>
-        <w:t>Chlorophyll [KLOR-uh-fil] | Transects [TRAN-sekts] | Custodian [kuh-STOH-dee-uhn]</w:t>
-      </w:r>
-    </w:p>
-    <w:p>
-      <w:pPr>
-        <w:spacing w:line="300" w:lineRule="auto" w:after="120"/>
-      </w:pPr>
-      <w:r>
-        <w:rPr>
-          <w:rFonts w:ascii="Arial" w:hAnsi="Arial"/>
-          <w:b/>
-          <w:color w:val="0284C7"/>
-          <w:sz w:val="22"/>
-        </w:rPr>
-        <w:t>[ON SLIDE 03 — MEASUREMENT 14.1]</w:t>
-      </w:r>
-    </w:p>
-    <w:p>
-      <w:pPr>
-        <w:spacing w:line="300" w:lineRule="auto" w:after="120"/>
-      </w:pPr>
-      <w:r>
-        <w:rPr>
-          <w:rFonts w:ascii="Arial" w:hAnsi="Arial"/>
-          <w:color w:val="0F172A"/>
-          <w:sz w:val="22"/>
-        </w:rPr>
-        <w:t>Thank you, Speaker 1. Hello everyone, I am Speaker 2.</w:t>
-      </w:r>
-    </w:p>
-    <w:p>
-      <w:pPr>
-        <w:spacing w:line="300" w:lineRule="auto" w:after="120"/>
-      </w:pPr>
-      <w:r>
-        <w:rPr>
-          <w:rFonts w:ascii="Arial" w:hAnsi="Arial"/>
-          <w:color w:val="0F172A"/>
-          <w:sz w:val="22"/>
-        </w:rPr>
-        <w:t>Question 3 asks: How is marine pollution measured scientifically?</w:t>
-      </w:r>
-    </w:p>
-    <w:p>
-      <w:pPr>
-        <w:spacing w:line="300" w:lineRule="auto" w:after="120"/>
-      </w:pPr>
-      <w:r>
-        <w:rPr>
-          <w:rFonts w:ascii="Arial" w:hAnsi="Arial"/>
-          <w:color w:val="0F172A"/>
-          <w:sz w:val="22"/>
-        </w:rPr>
-        <w:t>Tracking pollution across millions of square kilometers requires orbital remote sensing paired with shoreline surveys. For coastal eutrophication, ESA’s Sentinel-3 and NASA’s MODIS satellites scan ocean surface reflectance to detect Chlorophyll-a anomalies. When chlorophyll concentrations surge above normal baselines, algorithms flag active algal blooms.</w:t>
-      </w:r>
-    </w:p>
-    <w:p>
-      <w:pPr>
-        <w:spacing w:line="300" w:lineRule="auto" w:after="120"/>
-      </w:pPr>
-      <w:r>
-        <w:rPr>
-          <w:rFonts w:ascii="Arial" w:hAnsi="Arial"/>
-          <w:color w:val="0F172A"/>
-          <w:sz w:val="22"/>
-        </w:rPr>
-        <w:t>For plastics, scientists use two methodologies: surface manta trawl nets with 333-micrometer mesh to capture floating microplastics, and standardized 100-meter shoreline transects where researchers categorize, count, and weigh litter deposits per square meter.</w:t>
-      </w:r>
-    </w:p>
-    <w:p>
-      <w:pPr>
-        <w:spacing w:line="300" w:lineRule="auto" w:after="120"/>
-      </w:pPr>
-      <w:r>
-        <w:rPr>
-          <w:rFonts w:ascii="Arial" w:hAnsi="Arial"/>
-          <w:b/>
-          <w:color w:val="0284C7"/>
-          <w:sz w:val="22"/>
-        </w:rPr>
-        <w:t>[ADVANCE TO SLIDE 04 — GOVERNANCE 14.1]</w:t>
-      </w:r>
-    </w:p>
-    <w:p>
-      <w:pPr>
-        <w:spacing w:line="300" w:lineRule="auto" w:after="120"/>
-      </w:pPr>
-      <w:r>
-        <w:rPr>
-          <w:rFonts w:ascii="Arial" w:hAnsi="Arial"/>
-          <w:color w:val="0F172A"/>
-          <w:sz w:val="22"/>
-        </w:rPr>
-        <w:t>Question 4: What institutions and governance frameworks enforce compliance?</w:t>
-      </w:r>
-    </w:p>
-    <w:p>
-      <w:pPr>
-        <w:spacing w:line="300" w:lineRule="auto" w:after="120"/>
-      </w:pPr>
-      <w:r>
-        <w:rPr>
-          <w:rFonts w:ascii="Arial" w:hAnsi="Arial"/>
-          <w:color w:val="0F172A"/>
-          <w:sz w:val="22"/>
-        </w:rPr>
-        <w:t>The official global custodian agency is the United Nations Environment Programme (UNEP). UNEP standardizes national data reporting and methodologies across member states.</w:t>
-      </w:r>
-    </w:p>
-    <w:p>
-      <w:pPr>
-        <w:spacing w:line="300" w:lineRule="auto" w:after="120"/>
-      </w:pPr>
-      <w:r>
-        <w:rPr>
-          <w:rFonts w:ascii="Arial" w:hAnsi="Arial"/>
-          <w:color w:val="0F172A"/>
-          <w:sz w:val="22"/>
-        </w:rPr>
-        <w:t>On the legal front, the most critical breakthrough is the Intergovernmental Negotiating Committee (INC) Global Plastics Treaty—mandated to become a legally binding international treaty addressing the full lifecycle of plastics. At sea, MARPOL Annex V under the International Maritime Organization strictly prohibits commercial vessels from discharging any plastics into the marine environment.</w:t>
+        <w:t>Chlorophyll -&gt; [KLOR-uh-fil] | Transects -&gt; [TRAN-sekts] | Custodian -&gt; [kuh-STOH-dee-uhn]</w:t>
       </w:r>
     </w:p>
     <w:p>
@@ -378,19 +601,18 @@
           <w:b/>
           <w:color w:val="E11D48"/>
         </w:rPr>
-        <w:t xml:space="preserve">🤝 Transition / Handoff Cue: </w:t>
+        <w:t xml:space="preserve">Handoff Cue: </w:t>
       </w:r>
       <w:r>
         <w:rPr>
           <w:b/>
-          <w:i/>
         </w:rPr>
-        <w:t>"I now pass the floor to Speaker 3 to dive into Target 14.2 on living coastal ecosystems."</w:t>
+        <w:t>"I now hand over to Speaker 4 to examine marine ecosystem resilience and Target 14.2."</w:t>
       </w:r>
     </w:p>
     <w:p>
       <w:r>
-        <w:t>―――――――――――――――――――――――――――――――――――――――――――――――――――――――</w:t>
+        <w:br w:type="page"/>
       </w:r>
     </w:p>
     <w:p>
@@ -402,141 +624,168 @@
           <w:rFonts w:ascii="Arial" w:hAnsi="Arial"/>
           <w:b/>
           <w:color w:val="0284C7"/>
-          <w:sz w:val="32"/>
+          <w:sz w:val="28"/>
         </w:rPr>
-        <w:t>Speaker 3 — Target 14.2 Aim &amp; Indicators (Slides 5 &amp; 6)</w:t>
+        <w:t>TAB / SECTION: SPEAKER 4: TARGET 14.2 &amp; THE CRITICAL BLINDSPOT</w:t>
+      </w:r>
+    </w:p>
+    <w:tbl>
+      <w:tblPr>
+        <w:tblW w:type="auto" w:w="0"/>
+        <w:jc w:val="center"/>
+        <w:tblLayout w:type="fixed"/>
+        <w:tblLook w:firstColumn="1" w:firstRow="1" w:lastColumn="0" w:lastRow="0" w:noHBand="0" w:noVBand="1" w:val="04A0"/>
+      </w:tblPr>
+      <w:tblGrid>
+        <w:gridCol w:w="4824"/>
+        <w:gridCol w:w="4824"/>
+      </w:tblGrid>
+      <w:tr>
+        <w:tc>
+          <w:tcPr>
+            <w:tcW w:type="dxa" w:w="2592"/>
+            <w:shd w:fill="F1F5F9"/>
+          </w:tcPr>
+          <w:p>
+            <w:r>
+              <w:rPr>
+                <w:b/>
+              </w:rPr>
+              <w:t>Allocated Time:</w:t>
+            </w:r>
+          </w:p>
+        </w:tc>
+        <w:tc>
+          <w:tcPr>
+            <w:tcW w:type="dxa" w:w="7488"/>
+            <w:shd w:fill="FFFFFF"/>
+          </w:tcPr>
+          <w:p>
+            <w:r>
+              <w:t>07:30 - 10:00 (Target: 2 min 20 sec)</w:t>
+            </w:r>
+          </w:p>
+        </w:tc>
+      </w:tr>
+      <w:tr>
+        <w:tc>
+          <w:tcPr>
+            <w:tcW w:type="dxa" w:w="2592"/>
+            <w:shd w:fill="F1F5F9"/>
+          </w:tcPr>
+          <w:p>
+            <w:r>
+              <w:rPr>
+                <w:b/>
+              </w:rPr>
+              <w:t>Slides Covered:</w:t>
+            </w:r>
+          </w:p>
+        </w:tc>
+        <w:tc>
+          <w:tcPr>
+            <w:tcW w:type="dxa" w:w="7488"/>
+            <w:shd w:fill="FFFFFF"/>
+          </w:tcPr>
+          <w:p>
+            <w:r>
+              <w:t>Slide 7 &amp; Slide 8</w:t>
+            </w:r>
+          </w:p>
+        </w:tc>
+      </w:tr>
+      <w:tr>
+        <w:tc>
+          <w:tcPr>
+            <w:tcW w:type="dxa" w:w="2592"/>
+            <w:shd w:fill="F1F5F9"/>
+          </w:tcPr>
+          <w:p>
+            <w:r>
+              <w:rPr>
+                <w:b/>
+              </w:rPr>
+              <w:t>Core Focus:</w:t>
+            </w:r>
+          </w:p>
+        </w:tc>
+        <w:tc>
+          <w:tcPr>
+            <w:tcW w:type="dxa" w:w="7488"/>
+            <w:shd w:fill="FFFFFF"/>
+          </w:tcPr>
+          <w:p>
+            <w:r>
+              <w:t>Target 14.2 Mandate, Ecosystem-Based Management (EBM), Indicator 14.2.1, Critical Evaluation (Process vs Outcome Metric)</w:t>
+            </w:r>
+          </w:p>
+        </w:tc>
+      </w:tr>
+    </w:tbl>
+    <w:p>
+      <w:pPr>
+        <w:spacing w:after="160"/>
+      </w:pPr>
+    </w:p>
+    <w:p>
+      <w:pPr>
+        <w:pStyle w:val="Heading2"/>
+      </w:pPr>
+      <w:r>
+        <w:rPr>
+          <w:rFonts w:ascii="Arial" w:hAnsi="Arial"/>
+          <w:color w:val="0F172A"/>
+          <w:sz w:val="24"/>
+        </w:rPr>
+        <w:t>Verbatim Spoken English Script (Read Naturally):</w:t>
+      </w:r>
+    </w:p>
+    <w:p>
+      <w:pPr>
+        <w:spacing w:line="300" w:lineRule="auto" w:after="240"/>
+      </w:pPr>
+      <w:r>
+        <w:rPr>
+          <w:rFonts w:ascii="Arial" w:hAnsi="Arial"/>
+          <w:sz w:val="21"/>
+        </w:rPr>
+        <w:t>Thank you, Speaker 3. Hello everyone, I am Speaker 4.</w:t>
+        <w:br/>
+        <w:br/>
+        <w:t>Target 14.2 shifts our focus from waste management to living ecological resilience. Its mandate is to sustainably manage and protect marine and coastal ecosystems to avoid significant adverse impacts, and take action for their restoration.</w:t>
+        <w:br/>
+        <w:br/>
+        <w:t>The core philosophy of Target 14.2 is Ecosystem-Based Management, or EBM. Historically, humans managed oceans in isolated silos: fishing ministries regulated fish, transport ministries regulated shipping, and energy departments leased offshore oil. EBM breaks down these silos. It recognizes that corals, seagrasses, mangroves, fish stocks, and human coastal economies are all part of one interconnected living web.</w:t>
+        <w:br/>
+        <w:br/>
+        <w:t>[PAUSE — ADVANCE TO SLIDE 8]</w:t>
+        <w:br/>
+        <w:br/>
+        <w:t>To monitor progress, the UN established Indicator 14.2.1: the number of countries using ecosystem-based approaches to manage marine areas.</w:t>
+        <w:br/>
+        <w:br/>
+        <w:t>Measurement is conducted through national self-reporting surveys verified by UNEP. Countries receive credit if they enact legally recognized Marine Spatial Plans and establish Marine Protected Areas.</w:t>
+        <w:br/>
+        <w:br/>
+        <w:t>However, our team must highlight a critical analytical limitation: Indicator 14.2.1 is a process indicator, not an outcome indicator. It measures whether a government passed a planning policy on paper. It does not prove whether coral cover increased, whether fish biomass recovered, or whether enforcement actually stops illegal bottom trawling. Many designated zones risk remaining 'paper parks'.</w:t>
+        <w:br/>
+        <w:br/>
+        <w:t>Speaker 5 will now explore the global treaties governing 14.2 and introduce the chemistry of Target 14.3.</w:t>
       </w:r>
     </w:p>
     <w:p>
       <w:r>
         <w:rPr>
           <w:b/>
-          <w:color w:val="475569"/>
-          <w:sz w:val="20"/>
+          <w:color w:val="0284C7"/>
         </w:rPr>
-        <w:t>Time Window: 05:00 to 07:30 (02:30 Target) • Role: Speaker 3 (Living Habitats &amp; Policy Evaluation)</w:t>
-      </w:r>
-    </w:p>
-    <w:p>
-      <w:r>
-        <w:rPr>
-          <w:b/>
-          <w:sz w:val="20"/>
-        </w:rPr>
-        <w:t xml:space="preserve">Pronunciation Guide: </w:t>
+        <w:t xml:space="preserve">Pronunciation Quick Guide: </w:t>
       </w:r>
       <w:r>
         <w:rPr>
           <w:i/>
-          <w:sz w:val="20"/>
         </w:rPr>
-        <w:t>Resilience [rih-ZIL-yuhnss] | Ecosystem-based [EE-koh-sis-tuhm bayst] | Spatial [SPAY-shuhl]</w:t>
-      </w:r>
-    </w:p>
-    <w:p>
-      <w:pPr>
-        <w:spacing w:line="300" w:lineRule="auto" w:after="120"/>
-      </w:pPr>
-      <w:r>
-        <w:rPr>
-          <w:rFonts w:ascii="Arial" w:hAnsi="Arial"/>
-          <w:b/>
-          <w:color w:val="0284C7"/>
-          <w:sz w:val="22"/>
-        </w:rPr>
-        <w:t>[ON SLIDE 05 — TARGET 14.2 AIM]</w:t>
-      </w:r>
-    </w:p>
-    <w:p>
-      <w:pPr>
-        <w:spacing w:line="300" w:lineRule="auto" w:after="120"/>
-      </w:pPr>
-      <w:r>
-        <w:rPr>
-          <w:rFonts w:ascii="Arial" w:hAnsi="Arial"/>
-          <w:color w:val="0F172A"/>
-          <w:sz w:val="22"/>
-        </w:rPr>
-        <w:t>Thank you, Speaker 2. Hello everyone, I am Speaker 3.</w:t>
-      </w:r>
-    </w:p>
-    <w:p>
-      <w:pPr>
-        <w:spacing w:line="300" w:lineRule="auto" w:after="120"/>
-      </w:pPr>
-      <w:r>
-        <w:rPr>
-          <w:rFonts w:ascii="Arial" w:hAnsi="Arial"/>
-          <w:color w:val="0F172A"/>
-          <w:sz w:val="22"/>
-        </w:rPr>
-        <w:t>We now transition to Target 14.2: Marine Ecosystem Resilience. Question 1: What is the aim?</w:t>
-      </w:r>
-    </w:p>
-    <w:p>
-      <w:pPr>
-        <w:spacing w:line="300" w:lineRule="auto" w:after="120"/>
-      </w:pPr>
-      <w:r>
-        <w:rPr>
-          <w:rFonts w:ascii="Arial" w:hAnsi="Arial"/>
-          <w:color w:val="0F172A"/>
-          <w:sz w:val="22"/>
-        </w:rPr>
-        <w:t>The mandate requires countries to sustainably manage and protect marine and coastal ecosystems to avoid significant adverse impacts, including by strengthening their resilience and taking action for their restoration. The core principle is Ecosystem-Based Management (EBM). Historically, humans managed oceans in silos: fisheries departments regulated fish, while transport ministries regulated shipping. EBM breaks these silos down, managing corals, seagrass meadows, mangroves, and fishing as one interconnected biological web.</w:t>
-      </w:r>
-    </w:p>
-    <w:p>
-      <w:pPr>
-        <w:spacing w:line="300" w:lineRule="auto" w:after="120"/>
-      </w:pPr>
-      <w:r>
-        <w:rPr>
-          <w:rFonts w:ascii="Arial" w:hAnsi="Arial"/>
-          <w:b/>
-          <w:color w:val="0284C7"/>
-          <w:sz w:val="22"/>
-        </w:rPr>
-        <w:t>[ADVANCE TO SLIDE 06 — INDICATOR 14.2.1]</w:t>
-      </w:r>
-    </w:p>
-    <w:p>
-      <w:pPr>
-        <w:spacing w:line="300" w:lineRule="auto" w:after="120"/>
-      </w:pPr>
-      <w:r>
-        <w:rPr>
-          <w:rFonts w:ascii="Arial" w:hAnsi="Arial"/>
-          <w:color w:val="0F172A"/>
-          <w:sz w:val="22"/>
-        </w:rPr>
-        <w:t>Question 2: What is the official indicator?</w:t>
-      </w:r>
-    </w:p>
-    <w:p>
-      <w:pPr>
-        <w:spacing w:line="300" w:lineRule="auto" w:after="120"/>
-      </w:pPr>
-      <w:r>
-        <w:rPr>
-          <w:rFonts w:ascii="Arial" w:hAnsi="Arial"/>
-          <w:color w:val="0F172A"/>
-          <w:sz w:val="22"/>
-        </w:rPr>
-        <w:t>The UN established Indicator 14.2.1: the number of countries using ecosystem-based approaches to manage marine areas. Governments report whether they have established Marine Spatial Planning (MSP) and Integrated Coastal Zone Management (ICZM) frameworks.</w:t>
-      </w:r>
-    </w:p>
-    <w:p>
-      <w:pPr>
-        <w:spacing w:line="300" w:lineRule="auto" w:after="120"/>
-      </w:pPr>
-      <w:r>
-        <w:rPr>
-          <w:rFonts w:ascii="Arial" w:hAnsi="Arial"/>
-          <w:color w:val="0F172A"/>
-          <w:sz w:val="22"/>
-        </w:rPr>
-        <w:t>However, our team highlights a major analytical limitation: Indicator 14.2.1 is a process indicator, not an outcome metric. It records whether a government enacted a management law on paper. It does not verify whether coral cover grew, whether fish biomass recovered, or whether patrol boats stop illegal trawling. This creates the acute risk of 'paper parks'—zones protected on maps but neglected in reality.</w:t>
+        <w:t>Resilience -&gt; [rih-ZIL-yuhnss] | Biomass -&gt; [BY-oh-mass] | Ecosystem-based -&gt; [EE-koh-sis-tuhm bayst]</w:t>
       </w:r>
     </w:p>
     <w:p>
@@ -545,19 +794,18 @@
           <w:b/>
           <w:color w:val="E11D48"/>
         </w:rPr>
-        <w:t xml:space="preserve">🤝 Transition / Handoff Cue: </w:t>
+        <w:t xml:space="preserve">Handoff Cue: </w:t>
       </w:r>
       <w:r>
         <w:rPr>
           <w:b/>
-          <w:i/>
         </w:rPr>
-        <w:t>"Speaker 4 will now examine how scientists audit real marine ecology and the global treaties enforcing 14.2."</w:t>
+        <w:t>"Speaker 5 will now explain the 30x30 global target and take us into the deep chemical shift of Target 14.3."</w:t>
       </w:r>
     </w:p>
     <w:p>
       <w:r>
-        <w:t>―――――――――――――――――――――――――――――――――――――――――――――――――――――――</w:t>
+        <w:br w:type="page"/>
       </w:r>
     </w:p>
     <w:p>
@@ -569,154 +817,168 @@
           <w:rFonts w:ascii="Arial" w:hAnsi="Arial"/>
           <w:b/>
           <w:color w:val="0284C7"/>
-          <w:sz w:val="32"/>
+          <w:sz w:val="28"/>
         </w:rPr>
-        <w:t>Speaker 4 — Target 14.2 Measurement &amp; Governance (Slides 7 &amp; 8)</w:t>
+        <w:t>TAB / SECTION: SPEAKER 5: GOVERNANCE OF 14.2 &amp; TARGET 14.3 ACIDIFICATION</w:t>
+      </w:r>
+    </w:p>
+    <w:tbl>
+      <w:tblPr>
+        <w:tblW w:type="auto" w:w="0"/>
+        <w:jc w:val="center"/>
+        <w:tblLayout w:type="fixed"/>
+        <w:tblLook w:firstColumn="1" w:firstRow="1" w:lastColumn="0" w:lastRow="0" w:noHBand="0" w:noVBand="1" w:val="04A0"/>
+      </w:tblPr>
+      <w:tblGrid>
+        <w:gridCol w:w="4824"/>
+        <w:gridCol w:w="4824"/>
+      </w:tblGrid>
+      <w:tr>
+        <w:tc>
+          <w:tcPr>
+            <w:tcW w:type="dxa" w:w="2592"/>
+            <w:shd w:fill="F1F5F9"/>
+          </w:tcPr>
+          <w:p>
+            <w:r>
+              <w:rPr>
+                <w:b/>
+              </w:rPr>
+              <w:t>Allocated Time:</w:t>
+            </w:r>
+          </w:p>
+        </w:tc>
+        <w:tc>
+          <w:tcPr>
+            <w:tcW w:type="dxa" w:w="7488"/>
+            <w:shd w:fill="FFFFFF"/>
+          </w:tcPr>
+          <w:p>
+            <w:r>
+              <w:t>10:00 - 12:30 (Target: 2 min 20 sec)</w:t>
+            </w:r>
+          </w:p>
+        </w:tc>
+      </w:tr>
+      <w:tr>
+        <w:tc>
+          <w:tcPr>
+            <w:tcW w:type="dxa" w:w="2592"/>
+            <w:shd w:fill="F1F5F9"/>
+          </w:tcPr>
+          <w:p>
+            <w:r>
+              <w:rPr>
+                <w:b/>
+              </w:rPr>
+              <w:t>Slides Covered:</w:t>
+            </w:r>
+          </w:p>
+        </w:tc>
+        <w:tc>
+          <w:tcPr>
+            <w:tcW w:type="dxa" w:w="7488"/>
+            <w:shd w:fill="FFFFFF"/>
+          </w:tcPr>
+          <w:p>
+            <w:r>
+              <w:t>Slide 9 &amp; Slide 10</w:t>
+            </w:r>
+          </w:p>
+        </w:tc>
+      </w:tr>
+      <w:tr>
+        <w:tc>
+          <w:tcPr>
+            <w:tcW w:type="dxa" w:w="2592"/>
+            <w:shd w:fill="F1F5F9"/>
+          </w:tcPr>
+          <w:p>
+            <w:r>
+              <w:rPr>
+                <w:b/>
+              </w:rPr>
+              <w:t>Core Focus:</w:t>
+            </w:r>
+          </w:p>
+        </w:tc>
+        <w:tc>
+          <w:tcPr>
+            <w:tcW w:type="dxa" w:w="7488"/>
+            <w:shd w:fill="FFFFFF"/>
+          </w:tcPr>
+          <w:p>
+            <w:r>
+              <w:t>Kunming-Montreal 30x30 Target, BBNJ High Seas Treaty, Target 14.3 Mandate, The 30% Acidity Surge, CO2 Chemical Mechanics</w:t>
+            </w:r>
+          </w:p>
+        </w:tc>
+      </w:tr>
+    </w:tbl>
+    <w:p>
+      <w:pPr>
+        <w:spacing w:after="160"/>
+      </w:pPr>
+    </w:p>
+    <w:p>
+      <w:pPr>
+        <w:pStyle w:val="Heading2"/>
+      </w:pPr>
+      <w:r>
+        <w:rPr>
+          <w:rFonts w:ascii="Arial" w:hAnsi="Arial"/>
+          <w:color w:val="0F172A"/>
+          <w:sz w:val="24"/>
+        </w:rPr>
+        <w:t>Verbatim Spoken English Script (Read Naturally):</w:t>
+      </w:r>
+    </w:p>
+    <w:p>
+      <w:pPr>
+        <w:spacing w:line="300" w:lineRule="auto" w:after="240"/>
+      </w:pPr>
+      <w:r>
+        <w:rPr>
+          <w:rFonts w:ascii="Arial" w:hAnsi="Arial"/>
+          <w:sz w:val="21"/>
+        </w:rPr>
+        <w:t>Thank you, Speaker 4. Hello everyone, I am Speaker 5.</w:t>
+        <w:br/>
+        <w:br/>
+        <w:t>Target 14.2 is anchored by the historic Kunming-Montreal Global Biodiversity Framework, specifically Target 3—widely known as the '30 by 30' commitment. Over 190 countries have pledged to effectively conserve at least 30 percent of coastal and marine areas by the year 2030.</w:t>
+        <w:br/>
+        <w:br/>
+        <w:t>Equally historic is the newly adopted BBNJ Treaty—the Biodiversity Beyond National Jurisdiction treaty. For the first time in human history, the international community has a legal mechanism to designate high-seas marine protected areas in international waters outside any single country's jurisdiction.</w:t>
+        <w:br/>
+        <w:br/>
+        <w:t>[PAUSE — ADVANCE TO SLIDE 10]</w:t>
+        <w:br/>
+        <w:br/>
+        <w:t>Now, we descend into the profound chemical shift of Target 14.3: Ocean Acidification.</w:t>
+        <w:br/>
+        <w:br/>
+        <w:t>The ocean has acted as humanity's greatest climate buffer, absorbing roughly 25 percent of all atmospheric carbon dioxide emissions every year. But that protection comes at an immense chemical price. When CO2 dissolves in seawater, it forms carbonic acid, releasing hydrogen ions.</w:t>
+        <w:br/>
+        <w:br/>
+        <w:t>Since the pre-industrial era, surface ocean pH has dropped by approximately 0.1 units. Because pH is logarithmic, a 0.1 drop represents a 30 percent surge in acidity. Seawater is not turning into vinegar—it remains alkaline—but this drop strips away the carbonate ions that corals, oysters, pteropods, and shellfish need to build their skeletons.</w:t>
+        <w:br/>
+        <w:br/>
+        <w:t>Speaker 6 will now conclude our presentation with how scientists measure ocean pH and how global institutions coordinate action.</w:t>
       </w:r>
     </w:p>
     <w:p>
       <w:r>
         <w:rPr>
           <w:b/>
-          <w:color w:val="475569"/>
-          <w:sz w:val="20"/>
+          <w:color w:val="0284C7"/>
         </w:rPr>
-        <w:t>Time Window: 07:30 to 10:00 (02:30 Target) • Role: Speaker 4 (Biological Auditing &amp; International Treaties)</w:t>
-      </w:r>
-    </w:p>
-    <w:p>
-      <w:r>
-        <w:rPr>
-          <w:b/>
-          <w:sz w:val="20"/>
-        </w:rPr>
-        <w:t xml:space="preserve">Pronunciation Guide: </w:t>
+        <w:t xml:space="preserve">Pronunciation Quick Guide: </w:t>
       </w:r>
       <w:r>
         <w:rPr>
           <w:i/>
-          <w:sz w:val="20"/>
         </w:rPr>
-        <w:t>Kunming-Montreal [Koon-ming Mon-tree-AWL] | Bathymetry [buh-THIM-uh-tree] | Genomics [juh-NOH-miks]</w:t>
-      </w:r>
-    </w:p>
-    <w:p>
-      <w:pPr>
-        <w:spacing w:line="300" w:lineRule="auto" w:after="120"/>
-      </w:pPr>
-      <w:r>
-        <w:rPr>
-          <w:rFonts w:ascii="Arial" w:hAnsi="Arial"/>
-          <w:b/>
-          <w:color w:val="0284C7"/>
-          <w:sz w:val="22"/>
-        </w:rPr>
-        <w:t>[ON SLIDE 07 — MEASUREMENT 14.2]</w:t>
-      </w:r>
-    </w:p>
-    <w:p>
-      <w:pPr>
-        <w:spacing w:line="300" w:lineRule="auto" w:after="120"/>
-      </w:pPr>
-      <w:r>
-        <w:rPr>
-          <w:rFonts w:ascii="Arial" w:hAnsi="Arial"/>
-          <w:color w:val="0F172A"/>
-          <w:sz w:val="22"/>
-        </w:rPr>
-        <w:t>Thank you, Speaker 3. Hello everyone, I am Speaker 4.</w:t>
-      </w:r>
-    </w:p>
-    <w:p>
-      <w:pPr>
-        <w:spacing w:line="300" w:lineRule="auto" w:after="120"/>
-      </w:pPr>
-      <w:r>
-        <w:rPr>
-          <w:rFonts w:ascii="Arial" w:hAnsi="Arial"/>
-          <w:color w:val="0F172A"/>
-          <w:sz w:val="22"/>
-        </w:rPr>
-        <w:t>Question 3: How do scientists measure real ecological health beyond paperwork?</w:t>
-      </w:r>
-    </w:p>
-    <w:p>
-      <w:pPr>
-        <w:spacing w:line="300" w:lineRule="auto" w:after="120"/>
-      </w:pPr>
-      <w:r>
-        <w:rPr>
-          <w:rFonts w:ascii="Arial" w:hAnsi="Arial"/>
-          <w:color w:val="0F172A"/>
-          <w:sz w:val="22"/>
-        </w:rPr>
-        <w:t>Marine biologists deploy three direct empirical techniques: First, the Global Coral Reef Monitoring Network (GCRMN) conducts standardized scuba transects to measure hard coral cover, structural rugosity, and bleaching mortality.</w:t>
-      </w:r>
-    </w:p>
-    <w:p>
-      <w:pPr>
-        <w:spacing w:line="300" w:lineRule="auto" w:after="120"/>
-      </w:pPr>
-      <w:r>
-        <w:rPr>
-          <w:rFonts w:ascii="Arial" w:hAnsi="Arial"/>
-          <w:color w:val="0F172A"/>
-          <w:sz w:val="22"/>
-        </w:rPr>
-        <w:t>Second, environmental DNA (eDNA) sampling allows scientists to filter a liter of seawater and sequence genetic traces shed by marine organisms, auditing entire fish populations without destructive netting. Third, multibeam sonar bathymetry and airborne LiDAR map the exact boundaries and density of seagrass meadows and mangrove roots.</w:t>
-      </w:r>
-    </w:p>
-    <w:p>
-      <w:pPr>
-        <w:spacing w:line="300" w:lineRule="auto" w:after="120"/>
-      </w:pPr>
-      <w:r>
-        <w:rPr>
-          <w:rFonts w:ascii="Arial" w:hAnsi="Arial"/>
-          <w:b/>
-          <w:color w:val="0284C7"/>
-          <w:sz w:val="22"/>
-        </w:rPr>
-        <w:t>[ADVANCE TO SLIDE 08 — GOVERNANCE 14.2]</w:t>
-      </w:r>
-    </w:p>
-    <w:p>
-      <w:pPr>
-        <w:spacing w:line="300" w:lineRule="auto" w:after="120"/>
-      </w:pPr>
-      <w:r>
-        <w:rPr>
-          <w:rFonts w:ascii="Arial" w:hAnsi="Arial"/>
-          <w:color w:val="0F172A"/>
-          <w:sz w:val="22"/>
-        </w:rPr>
-        <w:t>Question 4: What global governance frameworks enforce Target 14.2?</w:t>
-      </w:r>
-    </w:p>
-    <w:p>
-      <w:pPr>
-        <w:spacing w:line="300" w:lineRule="auto" w:after="120"/>
-      </w:pPr>
-      <w:r>
-        <w:rPr>
-          <w:rFonts w:ascii="Arial" w:hAnsi="Arial"/>
-          <w:color w:val="0F172A"/>
-          <w:sz w:val="22"/>
-        </w:rPr>
-        <w:t>Target 14.2 is driven by two landmark international accords. First is the Kunming-Montreal Global Biodiversity Framework, specifically Target 3—the '30 by 30' commitment, where 190 nations pledged to protect 30 percent of marine and coastal domains by 2030.</w:t>
-      </w:r>
-    </w:p>
-    <w:p>
-      <w:pPr>
-        <w:spacing w:line="300" w:lineRule="auto" w:after="120"/>
-      </w:pPr>
-      <w:r>
-        <w:rPr>
-          <w:rFonts w:ascii="Arial" w:hAnsi="Arial"/>
-          <w:color w:val="0F172A"/>
-          <w:sz w:val="22"/>
-        </w:rPr>
-        <w:t>Second is the historic BBNJ Treaty—Biodiversity Beyond National Jurisdiction. For the first time in legal history, the international community possesses a binding mechanism to establish and enforce Marine Protected Areas in international waters—the High Seas—which cover two-thirds of the global ocean.</w:t>
+        <w:t>Kunming-Montreal -&gt; [Koon-ming Mon-tree-AWL] | Logarithmic -&gt; [log-uh-RITH-mik] | Pteropods -&gt; [TEH-ruh-pods (silent p)]</w:t>
       </w:r>
     </w:p>
     <w:p>
@@ -725,19 +987,18 @@
           <w:b/>
           <w:color w:val="E11D48"/>
         </w:rPr>
-        <w:t xml:space="preserve">🤝 Transition / Handoff Cue: </w:t>
+        <w:t xml:space="preserve">Handoff Cue: </w:t>
       </w:r>
       <w:r>
         <w:rPr>
           <w:b/>
-          <w:i/>
         </w:rPr>
-        <w:t>"I now hand over to Speaker 5 to investigate Target 14.3 and the invisible chemical crisis of ocean acidification."</w:t>
+        <w:t>"I now hand over to Speaker 6 to conclude with the precision measurement of Target 14.3 and our final synthesis."</w:t>
       </w:r>
     </w:p>
     <w:p>
       <w:r>
-        <w:t>―――――――――――――――――――――――――――――――――――――――――――――――――――――――</w:t>
+        <w:br w:type="page"/>
       </w:r>
     </w:p>
     <w:p>
@@ -749,154 +1010,168 @@
           <w:rFonts w:ascii="Arial" w:hAnsi="Arial"/>
           <w:b/>
           <w:color w:val="0284C7"/>
-          <w:sz w:val="32"/>
+          <w:sz w:val="28"/>
         </w:rPr>
-        <w:t>Speaker 5 — Target 14.3 Aim &amp; Indicators (Slides 9 &amp; 10)</w:t>
+        <w:t>TAB / SECTION: SPEAKER 6: PRECISION SENSORS, UNESCO &amp; FINAL SYNTHESIS</w:t>
+      </w:r>
+    </w:p>
+    <w:tbl>
+      <w:tblPr>
+        <w:tblW w:type="auto" w:w="0"/>
+        <w:jc w:val="center"/>
+        <w:tblLayout w:type="fixed"/>
+        <w:tblLook w:firstColumn="1" w:firstRow="1" w:lastColumn="0" w:lastRow="0" w:noHBand="0" w:noVBand="1" w:val="04A0"/>
+      </w:tblPr>
+      <w:tblGrid>
+        <w:gridCol w:w="4824"/>
+        <w:gridCol w:w="4824"/>
+      </w:tblGrid>
+      <w:tr>
+        <w:tc>
+          <w:tcPr>
+            <w:tcW w:type="dxa" w:w="2592"/>
+            <w:shd w:fill="F1F5F9"/>
+          </w:tcPr>
+          <w:p>
+            <w:r>
+              <w:rPr>
+                <w:b/>
+              </w:rPr>
+              <w:t>Allocated Time:</w:t>
+            </w:r>
+          </w:p>
+        </w:tc>
+        <w:tc>
+          <w:tcPr>
+            <w:tcW w:type="dxa" w:w="7488"/>
+            <w:shd w:fill="FFFFFF"/>
+          </w:tcPr>
+          <w:p>
+            <w:r>
+              <w:t>12:30 - 15:00 (Target: 2 min 20 sec)</w:t>
+            </w:r>
+          </w:p>
+        </w:tc>
+      </w:tr>
+      <w:tr>
+        <w:tc>
+          <w:tcPr>
+            <w:tcW w:type="dxa" w:w="2592"/>
+            <w:shd w:fill="F1F5F9"/>
+          </w:tcPr>
+          <w:p>
+            <w:r>
+              <w:rPr>
+                <w:b/>
+              </w:rPr>
+              <w:t>Slides Covered:</w:t>
+            </w:r>
+          </w:p>
+        </w:tc>
+        <w:tc>
+          <w:tcPr>
+            <w:tcW w:type="dxa" w:w="7488"/>
+            <w:shd w:fill="FFFFFF"/>
+          </w:tcPr>
+          <w:p>
+            <w:r>
+              <w:t>Slide 11 &amp; Slide 12</w:t>
+            </w:r>
+          </w:p>
+        </w:tc>
+      </w:tr>
+      <w:tr>
+        <w:tc>
+          <w:tcPr>
+            <w:tcW w:type="dxa" w:w="2592"/>
+            <w:shd w:fill="F1F5F9"/>
+          </w:tcPr>
+          <w:p>
+            <w:r>
+              <w:rPr>
+                <w:b/>
+              </w:rPr>
+              <w:t>Core Focus:</w:t>
+            </w:r>
+          </w:p>
+        </w:tc>
+        <w:tc>
+          <w:tcPr>
+            <w:tcW w:type="dxa" w:w="7488"/>
+            <w:shd w:fill="FFFFFF"/>
+          </w:tcPr>
+          <w:p>
+            <w:r>
+              <w:t>Indicator 14.3.1, GOA-ON Autonomous Sensor Network, Total pH Scale, UNESCO-IOC Custodianship, UN Ocean Decade, Conclusion</w:t>
+            </w:r>
+          </w:p>
+        </w:tc>
+      </w:tr>
+    </w:tbl>
+    <w:p>
+      <w:pPr>
+        <w:spacing w:after="160"/>
+      </w:pPr>
+    </w:p>
+    <w:p>
+      <w:pPr>
+        <w:pStyle w:val="Heading2"/>
+      </w:pPr>
+      <w:r>
+        <w:rPr>
+          <w:rFonts w:ascii="Arial" w:hAnsi="Arial"/>
+          <w:color w:val="0F172A"/>
+          <w:sz w:val="24"/>
+        </w:rPr>
+        <w:t>Verbatim Spoken English Script (Read Naturally):</w:t>
+      </w:r>
+    </w:p>
+    <w:p>
+      <w:pPr>
+        <w:spacing w:line="300" w:lineRule="auto" w:after="240"/>
+      </w:pPr>
+      <w:r>
+        <w:rPr>
+          <w:rFonts w:ascii="Arial" w:hAnsi="Arial"/>
+          <w:sz w:val="21"/>
+        </w:rPr>
+        <w:t>Thank you, Speaker 5. Hello everyone, I am Speaker 6, and I will deliver our final synthesis.</w:t>
+        <w:br/>
+        <w:br/>
+        <w:t>Target 14.3 is tracked through Indicator 14.3.1: Average marine acidity measured at representative sampling stations. Measuring ocean acidity is far more complex than dipping litmus paper into water. Seawater pH naturally fluctuates with depth, temperature, water currents, and seasonal plankton blooms.</w:t>
+        <w:br/>
+        <w:br/>
+        <w:t>Under UN metadata, measurement must be conducted on the 'Total pH scale' alongside at least one other carbon parameter, such as Total Dissolved Inorganic Carbon or Total Alkalinity. Scientists deploy high-precision glass electrodes and spectrophotometric sensors mounted on autonomous ocean gliders, deep moorings, and Biogeochemical ARGO robotic floats through the Global Ocean Acidification Observing Network, or GOA-ON.</w:t>
+        <w:br/>
+        <w:br/>
+        <w:t>[PAUSE — ADVANCE TO SLIDE 12]</w:t>
+        <w:br/>
+        <w:br/>
+        <w:t>Who governs Target 14.3? The official global custodian agency is UNESCO’s Intergovernmental Oceanographic Commission, or UNESCO-IOC. UNESCO-IOC coordinates global ocean observations and publishes the global progress reports.</w:t>
+        <w:br/>
+        <w:br/>
+        <w:t>The biggest operational challenge is the geographic data gap. Wealthy developed nations maintain hundreds of autonomous sensor stations, while small island developing states—who depend most heavily on coral reefs for survival—often have zero continuous monitoring buoys. Under the UN Decade of Ocean Science, UNESCO is distributing low-cost monitoring kits called 'Ocean Acidification in a Box' to bridge this divide.</w:t>
+        <w:br/>
+        <w:br/>
+        <w:t>In conclusion: SDG 14 teaches us that the ocean is one continuous, interconnected planetary system. Land pollution under 14.1, ecosystem resilience under 14.2, and ocean chemistry under 14.3 cannot be solved separately. Stopping plastic at the source, enforcing the 30x30 reserves, and slashing greenhouse gas emissions are three parts of a single mission: preserving life below water.</w:t>
+        <w:br/>
+        <w:br/>
+        <w:t>Thank you very much for your attention. Our team is now delighted to take your questions.</w:t>
       </w:r>
     </w:p>
     <w:p>
       <w:r>
         <w:rPr>
           <w:b/>
-          <w:color w:val="475569"/>
-          <w:sz w:val="20"/>
+          <w:color w:val="0284C7"/>
         </w:rPr>
-        <w:t>Time Window: 10:00 to 12:30 (02:30 Target) • Role: Speaker 5 (Ocean Chemistry &amp; Carbon Sink Dynamics)</w:t>
-      </w:r>
-    </w:p>
-    <w:p>
-      <w:r>
-        <w:rPr>
-          <w:b/>
-          <w:sz w:val="20"/>
-        </w:rPr>
-        <w:t xml:space="preserve">Pronunciation Guide: </w:t>
+        <w:t xml:space="preserve">Pronunciation Quick Guide: </w:t>
       </w:r>
       <w:r>
         <w:rPr>
           <w:i/>
-          <w:sz w:val="20"/>
         </w:rPr>
-        <w:t>Acidification [uh-sid-uh-fuh-KAY-shun] | Logarithmic [log-uh-RITH-mik] | Aragonite [uh-RAG-uh-nyte]</w:t>
-      </w:r>
-    </w:p>
-    <w:p>
-      <w:pPr>
-        <w:spacing w:line="300" w:lineRule="auto" w:after="120"/>
-      </w:pPr>
-      <w:r>
-        <w:rPr>
-          <w:rFonts w:ascii="Arial" w:hAnsi="Arial"/>
-          <w:b/>
-          <w:color w:val="0284C7"/>
-          <w:sz w:val="22"/>
-        </w:rPr>
-        <w:t>[ON SLIDE 09 — TARGET 14.3 AIM]</w:t>
-      </w:r>
-    </w:p>
-    <w:p>
-      <w:pPr>
-        <w:spacing w:line="300" w:lineRule="auto" w:after="120"/>
-      </w:pPr>
-      <w:r>
-        <w:rPr>
-          <w:rFonts w:ascii="Arial" w:hAnsi="Arial"/>
-          <w:color w:val="0F172A"/>
-          <w:sz w:val="22"/>
-        </w:rPr>
-        <w:t>Thank you, Speaker 4. Hello everyone, I am Speaker 5.</w:t>
-      </w:r>
-    </w:p>
-    <w:p>
-      <w:pPr>
-        <w:spacing w:line="300" w:lineRule="auto" w:after="120"/>
-      </w:pPr>
-      <w:r>
-        <w:rPr>
-          <w:rFonts w:ascii="Arial" w:hAnsi="Arial"/>
-          <w:color w:val="0F172A"/>
-          <w:sz w:val="22"/>
-        </w:rPr>
-        <w:t>We descend into Target 14.3: Ocean Acidification. Question 1: What is the aim?</w:t>
-      </w:r>
-    </w:p>
-    <w:p>
-      <w:pPr>
-        <w:spacing w:line="300" w:lineRule="auto" w:after="120"/>
-      </w:pPr>
-      <w:r>
-        <w:rPr>
-          <w:rFonts w:ascii="Arial" w:hAnsi="Arial"/>
-          <w:color w:val="0F172A"/>
-          <w:sz w:val="22"/>
-        </w:rPr>
-        <w:t>The mandate requires humanity to minimize and address the impacts of ocean acidification, including through enhanced scientific cooperation at all levels. The ocean has served as Earth's primary climate shield, absorbing roughly 25 percent of all human-generated CO2 emissions. But this protection carries a grave chemical cost.</w:t>
-      </w:r>
-    </w:p>
-    <w:p>
-      <w:pPr>
-        <w:spacing w:line="300" w:lineRule="auto" w:after="120"/>
-      </w:pPr>
-      <w:r>
-        <w:rPr>
-          <w:rFonts w:ascii="Arial" w:hAnsi="Arial"/>
-          <w:color w:val="0F172A"/>
-          <w:sz w:val="22"/>
-        </w:rPr>
-        <w:t>When CO2 dissolves in seawater, it forms carbonic acid, releasing hydrogen ions. Since the industrial revolution, surface ocean pH has declined by 0.1 units. Because pH is on a logarithmic scale, a 0.1 decline represents a 30 percent surge in hydrogen ion acidity, stripping away the carbonate ions that shellfish, pteropods, and corals require to construct their protective shells.</w:t>
-      </w:r>
-    </w:p>
-    <w:p>
-      <w:pPr>
-        <w:spacing w:line="300" w:lineRule="auto" w:after="120"/>
-      </w:pPr>
-      <w:r>
-        <w:rPr>
-          <w:rFonts w:ascii="Arial" w:hAnsi="Arial"/>
-          <w:b/>
-          <w:color w:val="0284C7"/>
-          <w:sz w:val="22"/>
-        </w:rPr>
-        <w:t>[ADVANCE TO SLIDE 10 — INDICATOR 14.3.1]</w:t>
-      </w:r>
-    </w:p>
-    <w:p>
-      <w:pPr>
-        <w:spacing w:line="300" w:lineRule="auto" w:after="120"/>
-      </w:pPr>
-      <w:r>
-        <w:rPr>
-          <w:rFonts w:ascii="Arial" w:hAnsi="Arial"/>
-          <w:color w:val="0F172A"/>
-          <w:sz w:val="22"/>
-        </w:rPr>
-        <w:t>Question 2: What is the official indicator?</w:t>
-      </w:r>
-    </w:p>
-    <w:p>
-      <w:pPr>
-        <w:spacing w:line="300" w:lineRule="auto" w:after="120"/>
-      </w:pPr>
-      <w:r>
-        <w:rPr>
-          <w:rFonts w:ascii="Arial" w:hAnsi="Arial"/>
-          <w:color w:val="0F172A"/>
-          <w:sz w:val="22"/>
-        </w:rPr>
-        <w:t>The UN designated Indicator 14.3.1: Average marine acidity (pH) measured at an agreed suite of representative sampling stations. Measuring pH requires extraordinary scientific precision—down to 0.002 pH units on the 'Total pH scale' (pHT).</w:t>
-      </w:r>
-    </w:p>
-    <w:p>
-      <w:pPr>
-        <w:spacing w:line="300" w:lineRule="auto" w:after="120"/>
-      </w:pPr>
-      <w:r>
-        <w:rPr>
-          <w:rFonts w:ascii="Arial" w:hAnsi="Arial"/>
-          <w:color w:val="0F172A"/>
-          <w:sz w:val="22"/>
-        </w:rPr>
-        <w:t>Crucially, UN metadata mandates that pH must be reported alongside at least one co-parameter: Total Dissolved Inorganic Carbon (DIC) or Total Alkalinity. This enables calculation of the Aragonite Saturation State (Omega), determining the exact threshold where seawater transitions from nourishing shells to actively corroding them.</w:t>
+        <w:t>Spectrophotometric -&gt; [spek-troh-foh-toh-MET-rik] | Intergovernmental -&gt; [in-ter-guh-vern-MEN-tuhl] | Alkalinity -&gt; [al-kuh-LIN-uh-tee]</w:t>
       </w:r>
     </w:p>
     <w:p>
@@ -905,204 +1180,23 @@
           <w:b/>
           <w:color w:val="E11D48"/>
         </w:rPr>
-        <w:t xml:space="preserve">🤝 Transition / Handoff Cue: </w:t>
+        <w:t xml:space="preserve">Handoff Cue: </w:t>
       </w:r>
       <w:r>
         <w:rPr>
           <w:b/>
-          <w:i/>
         </w:rPr>
-        <w:t>"Speaker 6 will now conclude with autonomous robotic sensors, UNESCO governance, and our team's final synthesis."</w:t>
+        <w:t>"Thank you everyone. We invite our professor and classmates to share your feedback and questions."</w:t>
       </w:r>
     </w:p>
     <w:p>
       <w:r>
-        <w:t>―――――――――――――――――――――――――――――――――――――――――――――――――――――――</w:t>
-      </w:r>
-    </w:p>
-    <w:p>
-      <w:pPr>
-        <w:pStyle w:val="Heading1"/>
-      </w:pPr>
-      <w:r>
-        <w:rPr>
-          <w:rFonts w:ascii="Arial" w:hAnsi="Arial"/>
-          <w:b/>
-          <w:color w:val="0284C7"/>
-          <w:sz w:val="32"/>
-        </w:rPr>
-        <w:t>Speaker 6 — Target 14.3 Measurement, Governance &amp; Synthesis (Slides 11 &amp; 12)</w:t>
-      </w:r>
-    </w:p>
-    <w:p>
-      <w:r>
-        <w:rPr>
-          <w:b/>
-          <w:color w:val="475569"/>
-          <w:sz w:val="20"/>
-        </w:rPr>
-        <w:t>Time Window: 12:30 to 15:00 (02:30 Target) • Role: Speaker 6 (Robotic Profiling, UNESCO &amp; Team Synthesis)</w:t>
-      </w:r>
-    </w:p>
-    <w:p>
-      <w:r>
-        <w:rPr>
-          <w:b/>
-          <w:sz w:val="20"/>
-        </w:rPr>
-        <w:t xml:space="preserve">Pronunciation Guide: </w:t>
-      </w:r>
-      <w:r>
-        <w:rPr>
-          <w:i/>
-          <w:sz w:val="20"/>
-        </w:rPr>
-        <w:t>Spectrophotometric [spek-troh-foh-toh-MET-rik] | Intergovernmental [in-ter-guh-vern-MEN-tuhl] | Synthesis [SIN-thuh-sis]</w:t>
-      </w:r>
-    </w:p>
-    <w:p>
-      <w:pPr>
-        <w:spacing w:line="300" w:lineRule="auto" w:after="120"/>
-      </w:pPr>
-      <w:r>
-        <w:rPr>
-          <w:rFonts w:ascii="Arial" w:hAnsi="Arial"/>
-          <w:b/>
-          <w:color w:val="0284C7"/>
-          <w:sz w:val="22"/>
-        </w:rPr>
-        <w:t>[ON SLIDE 11 — MEASUREMENT 14.3]</w:t>
-      </w:r>
-    </w:p>
-    <w:p>
-      <w:pPr>
-        <w:spacing w:line="300" w:lineRule="auto" w:after="120"/>
-      </w:pPr>
-      <w:r>
-        <w:rPr>
-          <w:rFonts w:ascii="Arial" w:hAnsi="Arial"/>
-          <w:color w:val="0F172A"/>
-          <w:sz w:val="22"/>
-        </w:rPr>
-        <w:t>Thank you, Speaker 5. Hello everyone, I am Speaker 6, and I will deliver our final section and synthesis.</w:t>
-      </w:r>
-    </w:p>
-    <w:p>
-      <w:pPr>
-        <w:spacing w:line="300" w:lineRule="auto" w:after="120"/>
-      </w:pPr>
-      <w:r>
-        <w:rPr>
-          <w:rFonts w:ascii="Arial" w:hAnsi="Arial"/>
-          <w:color w:val="0F172A"/>
-          <w:sz w:val="22"/>
-        </w:rPr>
-        <w:t>Question 3: How is ocean acidity measured scientifically?</w:t>
-      </w:r>
-    </w:p>
-    <w:p>
-      <w:pPr>
-        <w:spacing w:line="300" w:lineRule="auto" w:after="120"/>
-      </w:pPr>
-      <w:r>
-        <w:rPr>
-          <w:rFonts w:ascii="Arial" w:hAnsi="Arial"/>
-          <w:color w:val="0F172A"/>
-          <w:sz w:val="22"/>
-        </w:rPr>
-        <w:t>Because ocean pH fluctuates with depth, temperature, and seasonal biology, scientists cannot rely on simple spot checks. Measurement is executed through the Global Ocean Acidification Observing Network (GOA-ON).</w:t>
-      </w:r>
-    </w:p>
-    <w:p>
-      <w:pPr>
-        <w:spacing w:line="300" w:lineRule="auto" w:after="120"/>
-      </w:pPr>
-      <w:r>
-        <w:rPr>
-          <w:rFonts w:ascii="Arial" w:hAnsi="Arial"/>
-          <w:color w:val="0F172A"/>
-          <w:sz w:val="22"/>
-        </w:rPr>
-        <w:t>Key technologies include autonomous Biogeochemical Argo profiling floats (BGC-Argo) that dive to 2,000 meters measuring pH with ion-sensitive field-effect transistors (ISFET), fixed deep-sea ocean moorings, and automated spectrophotometry using purified m-Cresol purple dye aboard oceanographic research vessels.</w:t>
-      </w:r>
-    </w:p>
-    <w:p>
-      <w:pPr>
-        <w:spacing w:line="300" w:lineRule="auto" w:after="120"/>
-      </w:pPr>
-      <w:r>
-        <w:rPr>
-          <w:rFonts w:ascii="Arial" w:hAnsi="Arial"/>
-          <w:b/>
-          <w:color w:val="0284C7"/>
-          <w:sz w:val="22"/>
-        </w:rPr>
-        <w:t>[ADVANCE TO SLIDE 12 — GOVERNANCE 14.3 &amp; SYNTHESIS]</w:t>
-      </w:r>
-    </w:p>
-    <w:p>
-      <w:pPr>
-        <w:spacing w:line="300" w:lineRule="auto" w:after="120"/>
-      </w:pPr>
-      <w:r>
-        <w:rPr>
-          <w:rFonts w:ascii="Arial" w:hAnsi="Arial"/>
-          <w:color w:val="0F172A"/>
-          <w:sz w:val="22"/>
-        </w:rPr>
-        <w:t>Question 4: Who governs Target 14.3 and what is the final synthesis?</w:t>
-      </w:r>
-    </w:p>
-    <w:p>
-      <w:pPr>
-        <w:spacing w:line="300" w:lineRule="auto" w:after="120"/>
-      </w:pPr>
-      <w:r>
-        <w:rPr>
-          <w:rFonts w:ascii="Arial" w:hAnsi="Arial"/>
-          <w:color w:val="0F172A"/>
-          <w:sz w:val="22"/>
-        </w:rPr>
-        <w:t>The custodian agency is UNESCO’s Intergovernmental Oceanographic Commission (IOC-UNESCO). IOC coordinates GOA-ON and maintains the global data repository. A major focus is resolving global equity: Small Island Developing States (SIDS) face the highest vulnerability but have historically had the fewest monitoring buoys. Through the UN Ocean Decade, UNESCO deploys 'Ocean Acidification in a Box' low-cost testing kits to close this gap.</w:t>
-      </w:r>
-    </w:p>
-    <w:p>
-      <w:pPr>
-        <w:spacing w:line="300" w:lineRule="auto" w:after="120"/>
-      </w:pPr>
-      <w:r>
-        <w:rPr>
-          <w:rFonts w:ascii="Arial" w:hAnsi="Arial"/>
-          <w:color w:val="0F172A"/>
-          <w:sz w:val="22"/>
-        </w:rPr>
-        <w:t>To conclude: SDG 14 demonstrates that the ocean is one indivisible planetary life-support system. Land-based pollution under 14.1, habitat resilience under 14.2, and ocean chemistry under 14.3 are deeply intertwined. Halting plastic and fertilizer runoff, enforcing the 30x30 marine reserves, and slashing greenhouse gas emissions under the Paris Agreement are not separate goals—they are three pillars of one unified mission: protecting life below water.</w:t>
-      </w:r>
-    </w:p>
-    <w:p>
-      <w:r>
-        <w:rPr>
-          <w:b/>
-          <w:color w:val="E11D48"/>
-        </w:rPr>
-        <w:t xml:space="preserve">🤝 Transition / Handoff Cue: </w:t>
-      </w:r>
-      <w:r>
-        <w:rPr>
-          <w:b/>
-          <w:i/>
-        </w:rPr>
-        <w:t>"Thank you for your attention. Our team is now delighted to take any questions from the class."</w:t>
-      </w:r>
-    </w:p>
-    <w:p>
-      <w:r>
-        <w:t>―――――――――――――――――――――――――――――――――――――――――――――――――――――――</w:t>
+        <w:br w:type="page"/>
       </w:r>
     </w:p>
     <w:sectPr>
       <w:pgSz w:w="12240" w:h="15840"/>
-      <w:pgMar w:top="1440" w:right="1440" w:bottom="1440" w:left="1440" w:header="720" w:footer="720" w:gutter="0"/>
+      <w:pgMar w:top="1152" w:right="1296" w:bottom="1152" w:left="1296" w:header="720" w:footer="720" w:gutter="0"/>
       <w:cols w:space="720"/>
       <w:docGrid w:linePitch="360"/>
     </w:sectPr>

</xml_diff>

<commit_message>
feat: complete Hollywood IMAX visual rebuild with 12-slide matrix, synchronized speaker portal and script
</commit_message>
<xml_diff>
--- a/SDG14_Official_Speaker_Script.docx
+++ b/SDG14_Official_Speaker_Script.docx
@@ -13,7 +13,7 @@
           <w:color w:val="0284C7"/>
           <w:sz w:val="40"/>
         </w:rPr>
-        <w:t>UNITED NATIONS SDG 14: LIFE BELOW WATER</w:t>
+        <w:t>SDG 14: LIFE BELOW WATER — OFFICIAL 6-SPEAKER SCRIPT</w:t>
       </w:r>
     </w:p>
     <w:p>
@@ -23,210 +23,27 @@
       <w:r>
         <w:rPr>
           <w:rFonts w:ascii="Arial" w:hAnsi="Arial"/>
-          <w:color w:val="64748B"/>
+          <w:i/>
           <w:sz w:val="22"/>
         </w:rPr>
-        <w:t>Official 6-Speaker Rehearsal Dossier &amp; Slide-by-Slide Script</w:t>
-        <w:br/>
-        <w:t>Targets 14.1, 14.2 &amp; 14.3 | Total Duration: 15:00 (2:30 per speaker)</w:t>
+        <w:t>Framework: 3 Targets × 4 Core Questions • 12 Slides Total • 15 Minutes (02:30 per Speaker)</w:t>
       </w:r>
     </w:p>
     <w:p>
       <w:pPr>
-        <w:spacing w:after="240"/>
-      </w:pPr>
-    </w:p>
-    <w:p>
-      <w:pPr>
-        <w:pStyle w:val="Heading1"/>
+        <w:jc w:val="center"/>
       </w:pPr>
       <w:r>
         <w:rPr>
-          <w:rFonts w:ascii="Arial" w:hAnsi="Arial"/>
-          <w:b/>
-          <w:color w:val="0284C7"/>
-          <w:sz w:val="28"/>
+          <w:color w:val="64748B"/>
+          <w:sz w:val="19"/>
         </w:rPr>
-        <w:t>TAB / SECTION: SPEAKER 1: THE BIG PICTURE &amp; CAUSAL CHAIN</w:t>
-      </w:r>
-    </w:p>
-    <w:tbl>
-      <w:tblPr>
-        <w:tblW w:type="auto" w:w="0"/>
-        <w:jc w:val="center"/>
-        <w:tblLayout w:type="fixed"/>
-        <w:tblLook w:firstColumn="1" w:firstRow="1" w:lastColumn="0" w:lastRow="0" w:noHBand="0" w:noVBand="1" w:val="04A0"/>
-      </w:tblPr>
-      <w:tblGrid>
-        <w:gridCol w:w="4824"/>
-        <w:gridCol w:w="4824"/>
-      </w:tblGrid>
-      <w:tr>
-        <w:tc>
-          <w:tcPr>
-            <w:tcW w:type="dxa" w:w="2592"/>
-            <w:shd w:fill="F1F5F9"/>
-          </w:tcPr>
-          <w:p>
-            <w:r>
-              <w:rPr>
-                <w:b/>
-              </w:rPr>
-              <w:t>Allocated Time:</w:t>
-            </w:r>
-          </w:p>
-        </w:tc>
-        <w:tc>
-          <w:tcPr>
-            <w:tcW w:type="dxa" w:w="7488"/>
-            <w:shd w:fill="FFFFFF"/>
-          </w:tcPr>
-          <w:p>
-            <w:r>
-              <w:t>00:00 - 02:30 (Target: 2 min 20 sec)</w:t>
-            </w:r>
-          </w:p>
-        </w:tc>
-      </w:tr>
-      <w:tr>
-        <w:tc>
-          <w:tcPr>
-            <w:tcW w:type="dxa" w:w="2592"/>
-            <w:shd w:fill="F1F5F9"/>
-          </w:tcPr>
-          <w:p>
-            <w:r>
-              <w:rPr>
-                <w:b/>
-              </w:rPr>
-              <w:t>Slides Covered:</w:t>
-            </w:r>
-          </w:p>
-        </w:tc>
-        <w:tc>
-          <w:tcPr>
-            <w:tcW w:type="dxa" w:w="7488"/>
-            <w:shd w:fill="FFFFFF"/>
-          </w:tcPr>
-          <w:p>
-            <w:r>
-              <w:t>Slide 1 &amp; Slide 2</w:t>
-            </w:r>
-          </w:p>
-        </w:tc>
-      </w:tr>
-      <w:tr>
-        <w:tc>
-          <w:tcPr>
-            <w:tcW w:type="dxa" w:w="2592"/>
-            <w:shd w:fill="F1F5F9"/>
-          </w:tcPr>
-          <w:p>
-            <w:r>
-              <w:rPr>
-                <w:b/>
-              </w:rPr>
-              <w:t>Core Focus:</w:t>
-            </w:r>
-          </w:p>
-        </w:tc>
-        <w:tc>
-          <w:tcPr>
-            <w:tcW w:type="dxa" w:w="7488"/>
-            <w:shd w:fill="FFFFFF"/>
-          </w:tcPr>
-          <w:p>
-            <w:r>
-              <w:t>Opening Hook, Overview of Targets 14.1-14.3, The 4 Core Questions, The Upstream-to-Abyss Risk Cascade</w:t>
-            </w:r>
-          </w:p>
-        </w:tc>
-      </w:tr>
-    </w:tbl>
-    <w:p>
-      <w:pPr>
-        <w:spacing w:after="160"/>
-      </w:pPr>
-    </w:p>
-    <w:p>
-      <w:pPr>
-        <w:pStyle w:val="Heading2"/>
-      </w:pPr>
-      <w:r>
-        <w:rPr>
-          <w:rFonts w:ascii="Arial" w:hAnsi="Arial"/>
-          <w:color w:val="0F172A"/>
-          <w:sz w:val="24"/>
-        </w:rPr>
-        <w:t>Verbatim Spoken English Script (Read Naturally):</w:t>
-      </w:r>
-    </w:p>
-    <w:p>
-      <w:pPr>
-        <w:spacing w:line="300" w:lineRule="auto" w:after="240"/>
-      </w:pPr>
-      <w:r>
-        <w:rPr>
-          <w:rFonts w:ascii="Arial" w:hAnsi="Arial"/>
-          <w:sz w:val="21"/>
-        </w:rPr>
-        <w:t>Good morning, professor and fellow classmates. Today, our team is presenting United Nations Sustainable Development Goal 14: Life Below Water.</w:t>
-        <w:br/>
-        <w:br/>
-        <w:t>The ocean generates over 50 percent of the oxygen we breathe, absorbs a quarter of all global carbon dioxide emissions, and directly sustains the livelihoods of over three billion human beings. Yet today, marine systems face unprecedented ecological disruption.</w:t>
-        <w:br/>
-        <w:br/>
-        <w:t>Our team focuses on three foundational targets: Target 14.1 on Marine Pollution; Target 14.2 on Ecosystem Resilience; and Target 14.3 on Ocean Acidification.</w:t>
-        <w:br/>
-        <w:br/>
-        <w:t>For each target, we systematically address four non-negotiable questions: First, what does the target aim to achieve? Second, what official indicators monitor global progress? Third, how are these indicators measured scientifically? And fourth, what international institutions and governance treaties enforce compliance?</w:t>
-        <w:br/>
-        <w:br/>
-        <w:t>[PAUSE — ADVANCE TO SLIDE 2]</w:t>
-        <w:br/>
-        <w:br/>
-        <w:t>Before diving into each target individually, look at how they connect. They do not operate in silos; they form an unbroken causal chain of risk.</w:t>
-        <w:br/>
-        <w:br/>
-        <w:t>It starts upstream under Target 14.1: agricultural fertilizers and city plastics exert massive pressure on coastal waters. That pressure travels into Target 14.2, where fragile coral reefs and mangrove nurseries suffer habitat degradation. And simultaneously, Target 14.3 monitors global ocean chemistry as excess atmospheric CO2 permanently alters the pH balance of the entire water column.</w:t>
-        <w:br/>
-        <w:br/>
-        <w:t>To understand the first line of defense, I now pass the floor to Speaker 2 to break down Target 14.1.</w:t>
+        <w:t>Prepared for: skrongdattv1@gmail.com (Kiris) • Formatted with Heading 1 for Google Docs Document Tabs</w:t>
       </w:r>
     </w:p>
     <w:p>
       <w:r>
-        <w:rPr>
-          <w:b/>
-          <w:color w:val="0284C7"/>
-        </w:rPr>
-        <w:t xml:space="preserve">Pronunciation Quick Guide: </w:t>
-      </w:r>
-      <w:r>
-        <w:rPr>
-          <w:i/>
-        </w:rPr>
-        <w:t>Ecosystem -&gt; [EE-koh-sis-tuhm] | Indicator -&gt; [IN-dih-kay-ter] | Acidification -&gt; [uh-sid-uh-fuh-KAY-shun]</w:t>
-      </w:r>
-    </w:p>
-    <w:p>
-      <w:r>
-        <w:rPr>
-          <w:b/>
-          <w:color w:val="E11D48"/>
-        </w:rPr>
-        <w:t xml:space="preserve">Handoff Cue: </w:t>
-      </w:r>
-      <w:r>
-        <w:rPr>
-          <w:b/>
-        </w:rPr>
-        <w:t>"I now hand over to Speaker 2, who will examine the source of marine pollution under Target 14.1."</w:t>
-      </w:r>
-    </w:p>
-    <w:p>
-      <w:r>
-        <w:br w:type="page"/>
+        <w:t>―――――――――――――――――――――――――――――――――――――――――――――――――――――――</w:t>
       </w:r>
     </w:p>
     <w:p>
@@ -238,168 +55,141 @@
           <w:rFonts w:ascii="Arial" w:hAnsi="Arial"/>
           <w:b/>
           <w:color w:val="0284C7"/>
-          <w:sz w:val="28"/>
+          <w:sz w:val="32"/>
         </w:rPr>
-        <w:t>TAB / SECTION: SPEAKER 2: TARGET 14.1 &amp; THE DUAL INDICATORS</w:t>
-      </w:r>
-    </w:p>
-    <w:tbl>
-      <w:tblPr>
-        <w:tblW w:type="auto" w:w="0"/>
-        <w:jc w:val="center"/>
-        <w:tblLayout w:type="fixed"/>
-        <w:tblLook w:firstColumn="1" w:firstRow="1" w:lastColumn="0" w:lastRow="0" w:noHBand="0" w:noVBand="1" w:val="04A0"/>
-      </w:tblPr>
-      <w:tblGrid>
-        <w:gridCol w:w="4824"/>
-        <w:gridCol w:w="4824"/>
-      </w:tblGrid>
-      <w:tr>
-        <w:tc>
-          <w:tcPr>
-            <w:tcW w:type="dxa" w:w="2592"/>
-            <w:shd w:fill="F1F5F9"/>
-          </w:tcPr>
-          <w:p>
-            <w:r>
-              <w:rPr>
-                <w:b/>
-              </w:rPr>
-              <w:t>Allocated Time:</w:t>
-            </w:r>
-          </w:p>
-        </w:tc>
-        <w:tc>
-          <w:tcPr>
-            <w:tcW w:type="dxa" w:w="7488"/>
-            <w:shd w:fill="FFFFFF"/>
-          </w:tcPr>
-          <w:p>
-            <w:r>
-              <w:t>02:30 - 05:00 (Target: 2 min 20 sec)</w:t>
-            </w:r>
-          </w:p>
-        </w:tc>
-      </w:tr>
-      <w:tr>
-        <w:tc>
-          <w:tcPr>
-            <w:tcW w:type="dxa" w:w="2592"/>
-            <w:shd w:fill="F1F5F9"/>
-          </w:tcPr>
-          <w:p>
-            <w:r>
-              <w:rPr>
-                <w:b/>
-              </w:rPr>
-              <w:t>Slides Covered:</w:t>
-            </w:r>
-          </w:p>
-        </w:tc>
-        <w:tc>
-          <w:tcPr>
-            <w:tcW w:type="dxa" w:w="7488"/>
-            <w:shd w:fill="FFFFFF"/>
-          </w:tcPr>
-          <w:p>
-            <w:r>
-              <w:t>Slide 3 &amp; Slide 4</w:t>
-            </w:r>
-          </w:p>
-        </w:tc>
-      </w:tr>
-      <w:tr>
-        <w:tc>
-          <w:tcPr>
-            <w:tcW w:type="dxa" w:w="2592"/>
-            <w:shd w:fill="F1F5F9"/>
-          </w:tcPr>
-          <w:p>
-            <w:r>
-              <w:rPr>
-                <w:b/>
-              </w:rPr>
-              <w:t>Core Focus:</w:t>
-            </w:r>
-          </w:p>
-        </w:tc>
-        <w:tc>
-          <w:tcPr>
-            <w:tcW w:type="dxa" w:w="7488"/>
-            <w:shd w:fill="FFFFFF"/>
-          </w:tcPr>
-          <w:p>
-            <w:r>
-              <w:t>Target 14.1 Mandate, The 80% Land-Based Origin, 2025 Deadline, Indicator 14.1.1(a) vs 14.1.1(b)</w:t>
-            </w:r>
-          </w:p>
-        </w:tc>
-      </w:tr>
-    </w:tbl>
-    <w:p>
-      <w:pPr>
-        <w:spacing w:after="160"/>
-      </w:pPr>
-    </w:p>
-    <w:p>
-      <w:pPr>
-        <w:pStyle w:val="Heading2"/>
-      </w:pPr>
-      <w:r>
-        <w:rPr>
-          <w:rFonts w:ascii="Arial" w:hAnsi="Arial"/>
-          <w:color w:val="0F172A"/>
-          <w:sz w:val="24"/>
-        </w:rPr>
-        <w:t>Verbatim Spoken English Script (Read Naturally):</w:t>
-      </w:r>
-    </w:p>
-    <w:p>
-      <w:pPr>
-        <w:spacing w:line="300" w:lineRule="auto" w:after="240"/>
-      </w:pPr>
-      <w:r>
-        <w:rPr>
-          <w:rFonts w:ascii="Arial" w:hAnsi="Arial"/>
-          <w:sz w:val="21"/>
-        </w:rPr>
-        <w:t>Thank you, Speaker 1. Hello everyone, I am Speaker 2.</w:t>
-        <w:br/>
-        <w:br/>
-        <w:t>Target 14.1 is the frontline defense of marine conservation. Its official mandate is clear: by 2025, prevent and significantly reduce marine pollution of all kinds, in particular from land-based activities.</w:t>
-        <w:br/>
-        <w:br/>
-        <w:t>Notice two critical facts here: First, up to 80 percent of all marine litter and pollution originates on dry land—through agricultural fertilizer runoff, untreated municipal wastewater, and mismanaged municipal solid waste flowing into river basins. Second, the official target deadline was set for 2025. That means we are already operating past the original timeline, making accelerated monitoring vital.</w:t>
-        <w:br/>
-        <w:br/>
-        <w:t>[PAUSE — ADVANCE TO SLIDE 4]</w:t>
-        <w:br/>
-        <w:br/>
-        <w:t>To monitor Target 14.1, the United Nations established Indicator 14.1.1, split into two distinct pathways.</w:t>
-        <w:br/>
-        <w:br/>
-        <w:t>Sub-indicator 14.1.1(a) is the Index of Coastal Eutrophication, or ICEP. This monitors invisible chemical pollution—specifically nitrogen and phosphorus from fertilizers. When excess nutrients wash into coastal seas, they cause catastrophic algal blooms that suck oxygen out of the water, creating suffocating dead zones.</w:t>
-        <w:br/>
-        <w:br/>
-        <w:t>Sub-indicator 14.1.1(b) is Plastic Debris Density. This monitors solid waste accumulation across two realms: floating macro- and micro-plastics in surface waters, and plastic trash accumulating along shorelines.</w:t>
-        <w:br/>
-        <w:br/>
-        <w:t>Now, how do scientists actually measure invisible fertilizer runoff and tons of scattered plastic? Speaker 3 will explain the scientific measurement methods and governance.</w:t>
+        <w:t>Speaker 1 — Target 14.1 Aim &amp; Indicators (Slides 1 &amp; 2)</w:t>
       </w:r>
     </w:p>
     <w:p>
       <w:r>
         <w:rPr>
           <w:b/>
-          <w:color w:val="0284C7"/>
+          <w:color w:val="475569"/>
+          <w:sz w:val="20"/>
         </w:rPr>
-        <w:t xml:space="preserve">Pronunciation Quick Guide: </w:t>
+        <w:t>Time Window: 00:00 to 02:30 (02:30 Target) • Role: Speaker 1 (Opening &amp; Target 14.1 Fundamentals)</w:t>
+      </w:r>
+    </w:p>
+    <w:p>
+      <w:r>
+        <w:rPr>
+          <w:b/>
+          <w:sz w:val="20"/>
+        </w:rPr>
+        <w:t xml:space="preserve">Pronunciation Guide: </w:t>
       </w:r>
       <w:r>
         <w:rPr>
           <w:i/>
+          <w:sz w:val="20"/>
         </w:rPr>
-        <w:t>Eutrophication -&gt; [yoo-truh-fuh-KAY-shun] | Phosphorus -&gt; [FOS-fuh-ruhs] | Debris -&gt; [duh-BREE (silent s)]</w:t>
+        <w:t>Eutrophication [yoo-truh-fuh-KAY-shun] | Phosphorus [FOS-fuh-ruhs] | Hypoxic [hy-POK-sik]</w:t>
+      </w:r>
+    </w:p>
+    <w:p>
+      <w:pPr>
+        <w:spacing w:line="300" w:lineRule="auto" w:after="120"/>
+      </w:pPr>
+      <w:r>
+        <w:rPr>
+          <w:rFonts w:ascii="Arial" w:hAnsi="Arial"/>
+          <w:b/>
+          <w:color w:val="0284C7"/>
+          <w:sz w:val="22"/>
+        </w:rPr>
+        <w:t>[ON SLIDE 01 — TARGET 14.1 AIM]</w:t>
+      </w:r>
+    </w:p>
+    <w:p>
+      <w:pPr>
+        <w:spacing w:line="300" w:lineRule="auto" w:after="120"/>
+      </w:pPr>
+      <w:r>
+        <w:rPr>
+          <w:rFonts w:ascii="Arial" w:hAnsi="Arial"/>
+          <w:color w:val="0F172A"/>
+          <w:sz w:val="22"/>
+        </w:rPr>
+        <w:t>Good morning, professor and fellow classmates. Today, our team is presenting United Nations Sustainable Development Goal 14: Life Below Water. Our study is built upon a rigorous matrix: three foundational targets examined across four essential questions.</w:t>
+      </w:r>
+    </w:p>
+    <w:p>
+      <w:pPr>
+        <w:spacing w:line="300" w:lineRule="auto" w:after="120"/>
+      </w:pPr>
+      <w:r>
+        <w:rPr>
+          <w:rFonts w:ascii="Arial" w:hAnsi="Arial"/>
+          <w:color w:val="0F172A"/>
+          <w:sz w:val="22"/>
+        </w:rPr>
+        <w:t>I begin with Target 14.1: Marine Pollution. Question 1 asks: What does this target aim to achieve?</w:t>
+      </w:r>
+    </w:p>
+    <w:p>
+      <w:pPr>
+        <w:spacing w:line="300" w:lineRule="auto" w:after="120"/>
+      </w:pPr>
+      <w:r>
+        <w:rPr>
+          <w:rFonts w:ascii="Arial" w:hAnsi="Arial"/>
+          <w:color w:val="0F172A"/>
+          <w:sz w:val="22"/>
+        </w:rPr>
+        <w:t>The official UN mandate is unequivocal: by 2025, prevent and significantly reduce marine pollution of all kinds, in particular from land-based activities. Notice two vital dimensions: First, up to 80 percent of all marine litter originates inland—carried by river basins from agricultural runoff and municipal solid waste. Second, 2025 was the original deadline, meaning global implementation is operating under severe time pressure.</w:t>
+      </w:r>
+    </w:p>
+    <w:p>
+      <w:pPr>
+        <w:spacing w:line="300" w:lineRule="auto" w:after="120"/>
+      </w:pPr>
+      <w:r>
+        <w:rPr>
+          <w:rFonts w:ascii="Arial" w:hAnsi="Arial"/>
+          <w:b/>
+          <w:color w:val="0284C7"/>
+          <w:sz w:val="22"/>
+        </w:rPr>
+        <w:t>[ADVANCE TO SLIDE 02 — INDICATOR 14.1.1]</w:t>
+      </w:r>
+    </w:p>
+    <w:p>
+      <w:pPr>
+        <w:spacing w:line="300" w:lineRule="auto" w:after="120"/>
+      </w:pPr>
+      <w:r>
+        <w:rPr>
+          <w:rFonts w:ascii="Arial" w:hAnsi="Arial"/>
+          <w:color w:val="0F172A"/>
+          <w:sz w:val="22"/>
+        </w:rPr>
+        <w:t>Question 2: What official indicators track this progress?</w:t>
+      </w:r>
+    </w:p>
+    <w:p>
+      <w:pPr>
+        <w:spacing w:line="300" w:lineRule="auto" w:after="120"/>
+      </w:pPr>
+      <w:r>
+        <w:rPr>
+          <w:rFonts w:ascii="Arial" w:hAnsi="Arial"/>
+          <w:color w:val="0F172A"/>
+          <w:sz w:val="22"/>
+        </w:rPr>
+        <w:t>The UN designated Indicator 14.1.1, split into two complementary monitoring pathways. Sub-indicator 14.1.1(a) is the Index of Coastal Eutrophication Potential, or ICEP. It tracks invisible chemical pollution—specifically nitrogen and phosphorus fertilizers. When excess nutrients wash into coastal waters, they spark massive algal blooms that consume dissolved oxygen, resulting in over 500 oceanic dead zones worldwide.</w:t>
+      </w:r>
+    </w:p>
+    <w:p>
+      <w:pPr>
+        <w:spacing w:line="300" w:lineRule="auto" w:after="120"/>
+      </w:pPr>
+      <w:r>
+        <w:rPr>
+          <w:rFonts w:ascii="Arial" w:hAnsi="Arial"/>
+          <w:color w:val="0F172A"/>
+          <w:sz w:val="22"/>
+        </w:rPr>
+        <w:t>Sub-indicator 14.1.1(b) is Plastic Debris Density, measuring both floating macro- and micro-plastics in surface waters and solid waste accumulation per kilometer of coastline.</w:t>
       </w:r>
     </w:p>
     <w:p>
@@ -408,18 +198,19 @@
           <w:b/>
           <w:color w:val="E11D48"/>
         </w:rPr>
-        <w:t xml:space="preserve">Handoff Cue: </w:t>
+        <w:t xml:space="preserve">🤝 Transition / Handoff Cue: </w:t>
       </w:r>
       <w:r>
         <w:rPr>
           <w:b/>
+          <w:i/>
         </w:rPr>
-        <w:t>"Speaker 3 will now walk us through how satellites and beach surveys turn these indicators into concrete global data."</w:t>
+        <w:t>"Speaker 2 will now explain how scientists measure this pollution from space and how international treaties govern it."</w:t>
       </w:r>
     </w:p>
     <w:p>
       <w:r>
-        <w:br w:type="page"/>
+        <w:t>―――――――――――――――――――――――――――――――――――――――――――――――――――――――</w:t>
       </w:r>
     </w:p>
     <w:p>
@@ -431,168 +222,154 @@
           <w:rFonts w:ascii="Arial" w:hAnsi="Arial"/>
           <w:b/>
           <w:color w:val="0284C7"/>
-          <w:sz w:val="28"/>
+          <w:sz w:val="32"/>
         </w:rPr>
-        <w:t>TAB / SECTION: SPEAKER 3: MEASUREMENT &amp; GOVERNANCE OF 14.1</w:t>
-      </w:r>
-    </w:p>
-    <w:tbl>
-      <w:tblPr>
-        <w:tblW w:type="auto" w:w="0"/>
-        <w:jc w:val="center"/>
-        <w:tblLayout w:type="fixed"/>
-        <w:tblLook w:firstColumn="1" w:firstRow="1" w:lastColumn="0" w:lastRow="0" w:noHBand="0" w:noVBand="1" w:val="04A0"/>
-      </w:tblPr>
-      <w:tblGrid>
-        <w:gridCol w:w="4824"/>
-        <w:gridCol w:w="4824"/>
-      </w:tblGrid>
-      <w:tr>
-        <w:tc>
-          <w:tcPr>
-            <w:tcW w:type="dxa" w:w="2592"/>
-            <w:shd w:fill="F1F5F9"/>
-          </w:tcPr>
-          <w:p>
-            <w:r>
-              <w:rPr>
-                <w:b/>
-              </w:rPr>
-              <w:t>Allocated Time:</w:t>
-            </w:r>
-          </w:p>
-        </w:tc>
-        <w:tc>
-          <w:tcPr>
-            <w:tcW w:type="dxa" w:w="7488"/>
-            <w:shd w:fill="FFFFFF"/>
-          </w:tcPr>
-          <w:p>
-            <w:r>
-              <w:t>05:00 - 07:30 (Target: 2 min 20 sec)</w:t>
-            </w:r>
-          </w:p>
-        </w:tc>
-      </w:tr>
-      <w:tr>
-        <w:tc>
-          <w:tcPr>
-            <w:tcW w:type="dxa" w:w="2592"/>
-            <w:shd w:fill="F1F5F9"/>
-          </w:tcPr>
-          <w:p>
-            <w:r>
-              <w:rPr>
-                <w:b/>
-              </w:rPr>
-              <w:t>Slides Covered:</w:t>
-            </w:r>
-          </w:p>
-        </w:tc>
-        <w:tc>
-          <w:tcPr>
-            <w:tcW w:type="dxa" w:w="7488"/>
-            <w:shd w:fill="FFFFFF"/>
-          </w:tcPr>
-          <w:p>
-            <w:r>
-              <w:t>Slide 5 &amp; Slide 6</w:t>
-            </w:r>
-          </w:p>
-        </w:tc>
-      </w:tr>
-      <w:tr>
-        <w:tc>
-          <w:tcPr>
-            <w:tcW w:type="dxa" w:w="2592"/>
-            <w:shd w:fill="F1F5F9"/>
-          </w:tcPr>
-          <w:p>
-            <w:r>
-              <w:rPr>
-                <w:b/>
-              </w:rPr>
-              <w:t>Core Focus:</w:t>
-            </w:r>
-          </w:p>
-        </w:tc>
-        <w:tc>
-          <w:tcPr>
-            <w:tcW w:type="dxa" w:w="7488"/>
-            <w:shd w:fill="FFFFFF"/>
-          </w:tcPr>
-          <w:p>
-            <w:r>
-              <w:t>Satellite Optical Sensing, Chlorophyll-a Anomalies, 100m Beach Transects, UNEP Custodian, INC Global Plastics Treaty</w:t>
-            </w:r>
-          </w:p>
-        </w:tc>
-      </w:tr>
-    </w:tbl>
-    <w:p>
-      <w:pPr>
-        <w:spacing w:after="160"/>
-      </w:pPr>
-    </w:p>
-    <w:p>
-      <w:pPr>
-        <w:pStyle w:val="Heading2"/>
-      </w:pPr>
-      <w:r>
-        <w:rPr>
-          <w:rFonts w:ascii="Arial" w:hAnsi="Arial"/>
-          <w:color w:val="0F172A"/>
-          <w:sz w:val="24"/>
-        </w:rPr>
-        <w:t>Verbatim Spoken English Script (Read Naturally):</w:t>
-      </w:r>
-    </w:p>
-    <w:p>
-      <w:pPr>
-        <w:spacing w:line="300" w:lineRule="auto" w:after="240"/>
-      </w:pPr>
-      <w:r>
-        <w:rPr>
-          <w:rFonts w:ascii="Arial" w:hAnsi="Arial"/>
-          <w:sz w:val="21"/>
-        </w:rPr>
-        <w:t>Thank you, Speaker 2. Hello everyone, I am Speaker 3.</w:t>
-        <w:br/>
-        <w:br/>
-        <w:t>Measuring pollution across hundreds of millions of square miles of open ocean requires two complementary scientific techniques.</w:t>
-        <w:br/>
-        <w:br/>
-        <w:t>For coastal eutrophication, marine scientists use satellite remote sensing. NASA’s MODIS and the European Space Agency’s Sentinel-3 satellites continuously scan ocean surface color from orbit. They calculate Chlorophyll-a concentration anomalies. When chlorophyll levels spike far above the historical baseline, it proves that agricultural nutrient pollution has triggered an abnormal algal bloom.</w:t>
-        <w:br/>
-        <w:br/>
-        <w:t>For plastic debris density, scientists use standardized 100-meter beach transects and manta trawl surface nets. Citizen science groups and environmental agencies count, weigh, and categorize every plastic item along designated 100-meter strips of shoreline.</w:t>
-        <w:br/>
-        <w:br/>
-        <w:t>[PAUSE — ADVANCE TO SLIDE 6]</w:t>
-        <w:br/>
-        <w:br/>
-        <w:t>Now, who governs Target 14.1? The United Nations Environment Programme, or UNEP, serves as the official global custodian agency. UNEP standardizes country reporting and aggregates national data.</w:t>
-        <w:br/>
-        <w:br/>
-        <w:t>At the international policy level, the most important breakthrough is the ongoing negotiation of the Intergovernmental Negotiating Committee—the INC Global Plastics Treaty. This treaty aims to establish a legally binding international instrument addressing the full lifecycle of plastics, from chemical design to marine leakage.</w:t>
-        <w:br/>
-        <w:br/>
-        <w:t>Having tackled marine pollution, we now move downstream to living habitats. Speaker 4 will introduce Target 14.2.</w:t>
+        <w:t>Speaker 2 — Target 14.1 Measurement &amp; Governance (Slides 3 &amp; 4)</w:t>
       </w:r>
     </w:p>
     <w:p>
       <w:r>
         <w:rPr>
           <w:b/>
-          <w:color w:val="0284C7"/>
+          <w:color w:val="475569"/>
+          <w:sz w:val="20"/>
         </w:rPr>
-        <w:t xml:space="preserve">Pronunciation Quick Guide: </w:t>
+        <w:t>Time Window: 02:30 to 05:00 (02:30 Target) • Role: Speaker 2 (Scientific Measurement &amp; Marine Law)</w:t>
+      </w:r>
+    </w:p>
+    <w:p>
+      <w:r>
+        <w:rPr>
+          <w:b/>
+          <w:sz w:val="20"/>
+        </w:rPr>
+        <w:t xml:space="preserve">Pronunciation Guide: </w:t>
       </w:r>
       <w:r>
         <w:rPr>
           <w:i/>
+          <w:sz w:val="20"/>
         </w:rPr>
-        <w:t>Chlorophyll -&gt; [KLOR-uh-fil] | Transects -&gt; [TRAN-sekts] | Custodian -&gt; [kuh-STOH-dee-uhn]</w:t>
+        <w:t>Chlorophyll [KLOR-uh-fil] | Transects [TRAN-sekts] | Custodian [kuh-STOH-dee-uhn]</w:t>
+      </w:r>
+    </w:p>
+    <w:p>
+      <w:pPr>
+        <w:spacing w:line="300" w:lineRule="auto" w:after="120"/>
+      </w:pPr>
+      <w:r>
+        <w:rPr>
+          <w:rFonts w:ascii="Arial" w:hAnsi="Arial"/>
+          <w:b/>
+          <w:color w:val="0284C7"/>
+          <w:sz w:val="22"/>
+        </w:rPr>
+        <w:t>[ON SLIDE 03 — MEASUREMENT 14.1]</w:t>
+      </w:r>
+    </w:p>
+    <w:p>
+      <w:pPr>
+        <w:spacing w:line="300" w:lineRule="auto" w:after="120"/>
+      </w:pPr>
+      <w:r>
+        <w:rPr>
+          <w:rFonts w:ascii="Arial" w:hAnsi="Arial"/>
+          <w:color w:val="0F172A"/>
+          <w:sz w:val="22"/>
+        </w:rPr>
+        <w:t>Thank you, Speaker 1. Hello everyone, I am Speaker 2.</w:t>
+      </w:r>
+    </w:p>
+    <w:p>
+      <w:pPr>
+        <w:spacing w:line="300" w:lineRule="auto" w:after="120"/>
+      </w:pPr>
+      <w:r>
+        <w:rPr>
+          <w:rFonts w:ascii="Arial" w:hAnsi="Arial"/>
+          <w:color w:val="0F172A"/>
+          <w:sz w:val="22"/>
+        </w:rPr>
+        <w:t>Question 3 asks: How is marine pollution measured scientifically?</w:t>
+      </w:r>
+    </w:p>
+    <w:p>
+      <w:pPr>
+        <w:spacing w:line="300" w:lineRule="auto" w:after="120"/>
+      </w:pPr>
+      <w:r>
+        <w:rPr>
+          <w:rFonts w:ascii="Arial" w:hAnsi="Arial"/>
+          <w:color w:val="0F172A"/>
+          <w:sz w:val="22"/>
+        </w:rPr>
+        <w:t>Tracking pollution across millions of square kilometers requires orbital remote sensing paired with shoreline surveys. For coastal eutrophication, ESA’s Sentinel-3 and NASA’s MODIS satellites scan ocean surface reflectance to detect Chlorophyll-a anomalies. When chlorophyll concentrations surge above normal baselines, algorithms flag active algal blooms.</w:t>
+      </w:r>
+    </w:p>
+    <w:p>
+      <w:pPr>
+        <w:spacing w:line="300" w:lineRule="auto" w:after="120"/>
+      </w:pPr>
+      <w:r>
+        <w:rPr>
+          <w:rFonts w:ascii="Arial" w:hAnsi="Arial"/>
+          <w:color w:val="0F172A"/>
+          <w:sz w:val="22"/>
+        </w:rPr>
+        <w:t>For plastics, scientists use two methodologies: surface manta trawl nets with 333-micrometer mesh to capture floating microplastics, and standardized 100-meter shoreline transects where researchers categorize, count, and weigh litter deposits per square meter.</w:t>
+      </w:r>
+    </w:p>
+    <w:p>
+      <w:pPr>
+        <w:spacing w:line="300" w:lineRule="auto" w:after="120"/>
+      </w:pPr>
+      <w:r>
+        <w:rPr>
+          <w:rFonts w:ascii="Arial" w:hAnsi="Arial"/>
+          <w:b/>
+          <w:color w:val="0284C7"/>
+          <w:sz w:val="22"/>
+        </w:rPr>
+        <w:t>[ADVANCE TO SLIDE 04 — GOVERNANCE 14.1]</w:t>
+      </w:r>
+    </w:p>
+    <w:p>
+      <w:pPr>
+        <w:spacing w:line="300" w:lineRule="auto" w:after="120"/>
+      </w:pPr>
+      <w:r>
+        <w:rPr>
+          <w:rFonts w:ascii="Arial" w:hAnsi="Arial"/>
+          <w:color w:val="0F172A"/>
+          <w:sz w:val="22"/>
+        </w:rPr>
+        <w:t>Question 4: What institutions and governance frameworks enforce compliance?</w:t>
+      </w:r>
+    </w:p>
+    <w:p>
+      <w:pPr>
+        <w:spacing w:line="300" w:lineRule="auto" w:after="120"/>
+      </w:pPr>
+      <w:r>
+        <w:rPr>
+          <w:rFonts w:ascii="Arial" w:hAnsi="Arial"/>
+          <w:color w:val="0F172A"/>
+          <w:sz w:val="22"/>
+        </w:rPr>
+        <w:t>The official global custodian agency is the United Nations Environment Programme (UNEP). UNEP standardizes national data reporting and methodologies across member states.</w:t>
+      </w:r>
+    </w:p>
+    <w:p>
+      <w:pPr>
+        <w:spacing w:line="300" w:lineRule="auto" w:after="120"/>
+      </w:pPr>
+      <w:r>
+        <w:rPr>
+          <w:rFonts w:ascii="Arial" w:hAnsi="Arial"/>
+          <w:color w:val="0F172A"/>
+          <w:sz w:val="22"/>
+        </w:rPr>
+        <w:t>On the legal front, the most critical breakthrough is the Intergovernmental Negotiating Committee (INC) Global Plastics Treaty—mandated to become a legally binding international treaty addressing the full lifecycle of plastics. At sea, MARPOL Annex V under the International Maritime Organization strictly prohibits commercial vessels from discharging any plastics into the marine environment.</w:t>
       </w:r>
     </w:p>
     <w:p>
@@ -601,18 +378,19 @@
           <w:b/>
           <w:color w:val="E11D48"/>
         </w:rPr>
-        <w:t xml:space="preserve">Handoff Cue: </w:t>
+        <w:t xml:space="preserve">🤝 Transition / Handoff Cue: </w:t>
       </w:r>
       <w:r>
         <w:rPr>
           <w:b/>
+          <w:i/>
         </w:rPr>
-        <w:t>"I now hand over to Speaker 4 to examine marine ecosystem resilience and Target 14.2."</w:t>
+        <w:t>"I now pass the floor to Speaker 3 to dive into Target 14.2 on living coastal ecosystems."</w:t>
       </w:r>
     </w:p>
     <w:p>
       <w:r>
-        <w:br w:type="page"/>
+        <w:t>―――――――――――――――――――――――――――――――――――――――――――――――――――――――</w:t>
       </w:r>
     </w:p>
     <w:p>
@@ -624,168 +402,141 @@
           <w:rFonts w:ascii="Arial" w:hAnsi="Arial"/>
           <w:b/>
           <w:color w:val="0284C7"/>
-          <w:sz w:val="28"/>
+          <w:sz w:val="32"/>
         </w:rPr>
-        <w:t>TAB / SECTION: SPEAKER 4: TARGET 14.2 &amp; THE CRITICAL BLINDSPOT</w:t>
-      </w:r>
-    </w:p>
-    <w:tbl>
-      <w:tblPr>
-        <w:tblW w:type="auto" w:w="0"/>
-        <w:jc w:val="center"/>
-        <w:tblLayout w:type="fixed"/>
-        <w:tblLook w:firstColumn="1" w:firstRow="1" w:lastColumn="0" w:lastRow="0" w:noHBand="0" w:noVBand="1" w:val="04A0"/>
-      </w:tblPr>
-      <w:tblGrid>
-        <w:gridCol w:w="4824"/>
-        <w:gridCol w:w="4824"/>
-      </w:tblGrid>
-      <w:tr>
-        <w:tc>
-          <w:tcPr>
-            <w:tcW w:type="dxa" w:w="2592"/>
-            <w:shd w:fill="F1F5F9"/>
-          </w:tcPr>
-          <w:p>
-            <w:r>
-              <w:rPr>
-                <w:b/>
-              </w:rPr>
-              <w:t>Allocated Time:</w:t>
-            </w:r>
-          </w:p>
-        </w:tc>
-        <w:tc>
-          <w:tcPr>
-            <w:tcW w:type="dxa" w:w="7488"/>
-            <w:shd w:fill="FFFFFF"/>
-          </w:tcPr>
-          <w:p>
-            <w:r>
-              <w:t>07:30 - 10:00 (Target: 2 min 20 sec)</w:t>
-            </w:r>
-          </w:p>
-        </w:tc>
-      </w:tr>
-      <w:tr>
-        <w:tc>
-          <w:tcPr>
-            <w:tcW w:type="dxa" w:w="2592"/>
-            <w:shd w:fill="F1F5F9"/>
-          </w:tcPr>
-          <w:p>
-            <w:r>
-              <w:rPr>
-                <w:b/>
-              </w:rPr>
-              <w:t>Slides Covered:</w:t>
-            </w:r>
-          </w:p>
-        </w:tc>
-        <w:tc>
-          <w:tcPr>
-            <w:tcW w:type="dxa" w:w="7488"/>
-            <w:shd w:fill="FFFFFF"/>
-          </w:tcPr>
-          <w:p>
-            <w:r>
-              <w:t>Slide 7 &amp; Slide 8</w:t>
-            </w:r>
-          </w:p>
-        </w:tc>
-      </w:tr>
-      <w:tr>
-        <w:tc>
-          <w:tcPr>
-            <w:tcW w:type="dxa" w:w="2592"/>
-            <w:shd w:fill="F1F5F9"/>
-          </w:tcPr>
-          <w:p>
-            <w:r>
-              <w:rPr>
-                <w:b/>
-              </w:rPr>
-              <w:t>Core Focus:</w:t>
-            </w:r>
-          </w:p>
-        </w:tc>
-        <w:tc>
-          <w:tcPr>
-            <w:tcW w:type="dxa" w:w="7488"/>
-            <w:shd w:fill="FFFFFF"/>
-          </w:tcPr>
-          <w:p>
-            <w:r>
-              <w:t>Target 14.2 Mandate, Ecosystem-Based Management (EBM), Indicator 14.2.1, Critical Evaluation (Process vs Outcome Metric)</w:t>
-            </w:r>
-          </w:p>
-        </w:tc>
-      </w:tr>
-    </w:tbl>
-    <w:p>
-      <w:pPr>
-        <w:spacing w:after="160"/>
-      </w:pPr>
-    </w:p>
-    <w:p>
-      <w:pPr>
-        <w:pStyle w:val="Heading2"/>
-      </w:pPr>
-      <w:r>
-        <w:rPr>
-          <w:rFonts w:ascii="Arial" w:hAnsi="Arial"/>
-          <w:color w:val="0F172A"/>
-          <w:sz w:val="24"/>
-        </w:rPr>
-        <w:t>Verbatim Spoken English Script (Read Naturally):</w:t>
-      </w:r>
-    </w:p>
-    <w:p>
-      <w:pPr>
-        <w:spacing w:line="300" w:lineRule="auto" w:after="240"/>
-      </w:pPr>
-      <w:r>
-        <w:rPr>
-          <w:rFonts w:ascii="Arial" w:hAnsi="Arial"/>
-          <w:sz w:val="21"/>
-        </w:rPr>
-        <w:t>Thank you, Speaker 3. Hello everyone, I am Speaker 4.</w:t>
-        <w:br/>
-        <w:br/>
-        <w:t>Target 14.2 shifts our focus from waste management to living ecological resilience. Its mandate is to sustainably manage and protect marine and coastal ecosystems to avoid significant adverse impacts, and take action for their restoration.</w:t>
-        <w:br/>
-        <w:br/>
-        <w:t>The core philosophy of Target 14.2 is Ecosystem-Based Management, or EBM. Historically, humans managed oceans in isolated silos: fishing ministries regulated fish, transport ministries regulated shipping, and energy departments leased offshore oil. EBM breaks down these silos. It recognizes that corals, seagrasses, mangroves, fish stocks, and human coastal economies are all part of one interconnected living web.</w:t>
-        <w:br/>
-        <w:br/>
-        <w:t>[PAUSE — ADVANCE TO SLIDE 8]</w:t>
-        <w:br/>
-        <w:br/>
-        <w:t>To monitor progress, the UN established Indicator 14.2.1: the number of countries using ecosystem-based approaches to manage marine areas.</w:t>
-        <w:br/>
-        <w:br/>
-        <w:t>Measurement is conducted through national self-reporting surveys verified by UNEP. Countries receive credit if they enact legally recognized Marine Spatial Plans and establish Marine Protected Areas.</w:t>
-        <w:br/>
-        <w:br/>
-        <w:t>However, our team must highlight a critical analytical limitation: Indicator 14.2.1 is a process indicator, not an outcome indicator. It measures whether a government passed a planning policy on paper. It does not prove whether coral cover increased, whether fish biomass recovered, or whether enforcement actually stops illegal bottom trawling. Many designated zones risk remaining 'paper parks'.</w:t>
-        <w:br/>
-        <w:br/>
-        <w:t>Speaker 5 will now explore the global treaties governing 14.2 and introduce the chemistry of Target 14.3.</w:t>
+        <w:t>Speaker 3 — Target 14.2 Aim &amp; Indicators (Slides 5 &amp; 6)</w:t>
       </w:r>
     </w:p>
     <w:p>
       <w:r>
         <w:rPr>
           <w:b/>
-          <w:color w:val="0284C7"/>
+          <w:color w:val="475569"/>
+          <w:sz w:val="20"/>
         </w:rPr>
-        <w:t xml:space="preserve">Pronunciation Quick Guide: </w:t>
+        <w:t>Time Window: 05:00 to 07:30 (02:30 Target) • Role: Speaker 3 (Living Habitats &amp; Policy Evaluation)</w:t>
+      </w:r>
+    </w:p>
+    <w:p>
+      <w:r>
+        <w:rPr>
+          <w:b/>
+          <w:sz w:val="20"/>
+        </w:rPr>
+        <w:t xml:space="preserve">Pronunciation Guide: </w:t>
       </w:r>
       <w:r>
         <w:rPr>
           <w:i/>
+          <w:sz w:val="20"/>
         </w:rPr>
-        <w:t>Resilience -&gt; [rih-ZIL-yuhnss] | Biomass -&gt; [BY-oh-mass] | Ecosystem-based -&gt; [EE-koh-sis-tuhm bayst]</w:t>
+        <w:t>Resilience [rih-ZIL-yuhnss] | Ecosystem-based [EE-koh-sis-tuhm bayst] | Spatial [SPAY-shuhl]</w:t>
+      </w:r>
+    </w:p>
+    <w:p>
+      <w:pPr>
+        <w:spacing w:line="300" w:lineRule="auto" w:after="120"/>
+      </w:pPr>
+      <w:r>
+        <w:rPr>
+          <w:rFonts w:ascii="Arial" w:hAnsi="Arial"/>
+          <w:b/>
+          <w:color w:val="0284C7"/>
+          <w:sz w:val="22"/>
+        </w:rPr>
+        <w:t>[ON SLIDE 05 — TARGET 14.2 AIM]</w:t>
+      </w:r>
+    </w:p>
+    <w:p>
+      <w:pPr>
+        <w:spacing w:line="300" w:lineRule="auto" w:after="120"/>
+      </w:pPr>
+      <w:r>
+        <w:rPr>
+          <w:rFonts w:ascii="Arial" w:hAnsi="Arial"/>
+          <w:color w:val="0F172A"/>
+          <w:sz w:val="22"/>
+        </w:rPr>
+        <w:t>Thank you, Speaker 2. Hello everyone, I am Speaker 3.</w:t>
+      </w:r>
+    </w:p>
+    <w:p>
+      <w:pPr>
+        <w:spacing w:line="300" w:lineRule="auto" w:after="120"/>
+      </w:pPr>
+      <w:r>
+        <w:rPr>
+          <w:rFonts w:ascii="Arial" w:hAnsi="Arial"/>
+          <w:color w:val="0F172A"/>
+          <w:sz w:val="22"/>
+        </w:rPr>
+        <w:t>We now transition to Target 14.2: Marine Ecosystem Resilience. Question 1: What is the aim?</w:t>
+      </w:r>
+    </w:p>
+    <w:p>
+      <w:pPr>
+        <w:spacing w:line="300" w:lineRule="auto" w:after="120"/>
+      </w:pPr>
+      <w:r>
+        <w:rPr>
+          <w:rFonts w:ascii="Arial" w:hAnsi="Arial"/>
+          <w:color w:val="0F172A"/>
+          <w:sz w:val="22"/>
+        </w:rPr>
+        <w:t>The mandate requires countries to sustainably manage and protect marine and coastal ecosystems to avoid significant adverse impacts, including by strengthening their resilience and taking action for their restoration. The core principle is Ecosystem-Based Management (EBM). Historically, humans managed oceans in silos: fisheries departments regulated fish, while transport ministries regulated shipping. EBM breaks these silos down, managing corals, seagrass meadows, mangroves, and fishing as one interconnected biological web.</w:t>
+      </w:r>
+    </w:p>
+    <w:p>
+      <w:pPr>
+        <w:spacing w:line="300" w:lineRule="auto" w:after="120"/>
+      </w:pPr>
+      <w:r>
+        <w:rPr>
+          <w:rFonts w:ascii="Arial" w:hAnsi="Arial"/>
+          <w:b/>
+          <w:color w:val="0284C7"/>
+          <w:sz w:val="22"/>
+        </w:rPr>
+        <w:t>[ADVANCE TO SLIDE 06 — INDICATOR 14.2.1]</w:t>
+      </w:r>
+    </w:p>
+    <w:p>
+      <w:pPr>
+        <w:spacing w:line="300" w:lineRule="auto" w:after="120"/>
+      </w:pPr>
+      <w:r>
+        <w:rPr>
+          <w:rFonts w:ascii="Arial" w:hAnsi="Arial"/>
+          <w:color w:val="0F172A"/>
+          <w:sz w:val="22"/>
+        </w:rPr>
+        <w:t>Question 2: What is the official indicator?</w:t>
+      </w:r>
+    </w:p>
+    <w:p>
+      <w:pPr>
+        <w:spacing w:line="300" w:lineRule="auto" w:after="120"/>
+      </w:pPr>
+      <w:r>
+        <w:rPr>
+          <w:rFonts w:ascii="Arial" w:hAnsi="Arial"/>
+          <w:color w:val="0F172A"/>
+          <w:sz w:val="22"/>
+        </w:rPr>
+        <w:t>The UN established Indicator 14.2.1: the number of countries using ecosystem-based approaches to manage marine areas. Governments report whether they have established Marine Spatial Planning (MSP) and Integrated Coastal Zone Management (ICZM) frameworks.</w:t>
+      </w:r>
+    </w:p>
+    <w:p>
+      <w:pPr>
+        <w:spacing w:line="300" w:lineRule="auto" w:after="120"/>
+      </w:pPr>
+      <w:r>
+        <w:rPr>
+          <w:rFonts w:ascii="Arial" w:hAnsi="Arial"/>
+          <w:color w:val="0F172A"/>
+          <w:sz w:val="22"/>
+        </w:rPr>
+        <w:t>However, our team highlights a major analytical limitation: Indicator 14.2.1 is a process indicator, not an outcome metric. It records whether a government enacted a management law on paper. It does not verify whether coral cover grew, whether fish biomass recovered, or whether patrol boats stop illegal trawling. This creates the acute risk of 'paper parks'—zones protected on maps but neglected in reality.</w:t>
       </w:r>
     </w:p>
     <w:p>
@@ -794,18 +545,19 @@
           <w:b/>
           <w:color w:val="E11D48"/>
         </w:rPr>
-        <w:t xml:space="preserve">Handoff Cue: </w:t>
+        <w:t xml:space="preserve">🤝 Transition / Handoff Cue: </w:t>
       </w:r>
       <w:r>
         <w:rPr>
           <w:b/>
+          <w:i/>
         </w:rPr>
-        <w:t>"Speaker 5 will now explain the 30x30 global target and take us into the deep chemical shift of Target 14.3."</w:t>
+        <w:t>"Speaker 4 will now examine how scientists audit real marine ecology and the global treaties enforcing 14.2."</w:t>
       </w:r>
     </w:p>
     <w:p>
       <w:r>
-        <w:br w:type="page"/>
+        <w:t>―――――――――――――――――――――――――――――――――――――――――――――――――――――――</w:t>
       </w:r>
     </w:p>
     <w:p>
@@ -817,168 +569,154 @@
           <w:rFonts w:ascii="Arial" w:hAnsi="Arial"/>
           <w:b/>
           <w:color w:val="0284C7"/>
-          <w:sz w:val="28"/>
+          <w:sz w:val="32"/>
         </w:rPr>
-        <w:t>TAB / SECTION: SPEAKER 5: GOVERNANCE OF 14.2 &amp; TARGET 14.3 ACIDIFICATION</w:t>
-      </w:r>
-    </w:p>
-    <w:tbl>
-      <w:tblPr>
-        <w:tblW w:type="auto" w:w="0"/>
-        <w:jc w:val="center"/>
-        <w:tblLayout w:type="fixed"/>
-        <w:tblLook w:firstColumn="1" w:firstRow="1" w:lastColumn="0" w:lastRow="0" w:noHBand="0" w:noVBand="1" w:val="04A0"/>
-      </w:tblPr>
-      <w:tblGrid>
-        <w:gridCol w:w="4824"/>
-        <w:gridCol w:w="4824"/>
-      </w:tblGrid>
-      <w:tr>
-        <w:tc>
-          <w:tcPr>
-            <w:tcW w:type="dxa" w:w="2592"/>
-            <w:shd w:fill="F1F5F9"/>
-          </w:tcPr>
-          <w:p>
-            <w:r>
-              <w:rPr>
-                <w:b/>
-              </w:rPr>
-              <w:t>Allocated Time:</w:t>
-            </w:r>
-          </w:p>
-        </w:tc>
-        <w:tc>
-          <w:tcPr>
-            <w:tcW w:type="dxa" w:w="7488"/>
-            <w:shd w:fill="FFFFFF"/>
-          </w:tcPr>
-          <w:p>
-            <w:r>
-              <w:t>10:00 - 12:30 (Target: 2 min 20 sec)</w:t>
-            </w:r>
-          </w:p>
-        </w:tc>
-      </w:tr>
-      <w:tr>
-        <w:tc>
-          <w:tcPr>
-            <w:tcW w:type="dxa" w:w="2592"/>
-            <w:shd w:fill="F1F5F9"/>
-          </w:tcPr>
-          <w:p>
-            <w:r>
-              <w:rPr>
-                <w:b/>
-              </w:rPr>
-              <w:t>Slides Covered:</w:t>
-            </w:r>
-          </w:p>
-        </w:tc>
-        <w:tc>
-          <w:tcPr>
-            <w:tcW w:type="dxa" w:w="7488"/>
-            <w:shd w:fill="FFFFFF"/>
-          </w:tcPr>
-          <w:p>
-            <w:r>
-              <w:t>Slide 9 &amp; Slide 10</w:t>
-            </w:r>
-          </w:p>
-        </w:tc>
-      </w:tr>
-      <w:tr>
-        <w:tc>
-          <w:tcPr>
-            <w:tcW w:type="dxa" w:w="2592"/>
-            <w:shd w:fill="F1F5F9"/>
-          </w:tcPr>
-          <w:p>
-            <w:r>
-              <w:rPr>
-                <w:b/>
-              </w:rPr>
-              <w:t>Core Focus:</w:t>
-            </w:r>
-          </w:p>
-        </w:tc>
-        <w:tc>
-          <w:tcPr>
-            <w:tcW w:type="dxa" w:w="7488"/>
-            <w:shd w:fill="FFFFFF"/>
-          </w:tcPr>
-          <w:p>
-            <w:r>
-              <w:t>Kunming-Montreal 30x30 Target, BBNJ High Seas Treaty, Target 14.3 Mandate, The 30% Acidity Surge, CO2 Chemical Mechanics</w:t>
-            </w:r>
-          </w:p>
-        </w:tc>
-      </w:tr>
-    </w:tbl>
-    <w:p>
-      <w:pPr>
-        <w:spacing w:after="160"/>
-      </w:pPr>
-    </w:p>
-    <w:p>
-      <w:pPr>
-        <w:pStyle w:val="Heading2"/>
-      </w:pPr>
-      <w:r>
-        <w:rPr>
-          <w:rFonts w:ascii="Arial" w:hAnsi="Arial"/>
-          <w:color w:val="0F172A"/>
-          <w:sz w:val="24"/>
-        </w:rPr>
-        <w:t>Verbatim Spoken English Script (Read Naturally):</w:t>
-      </w:r>
-    </w:p>
-    <w:p>
-      <w:pPr>
-        <w:spacing w:line="300" w:lineRule="auto" w:after="240"/>
-      </w:pPr>
-      <w:r>
-        <w:rPr>
-          <w:rFonts w:ascii="Arial" w:hAnsi="Arial"/>
-          <w:sz w:val="21"/>
-        </w:rPr>
-        <w:t>Thank you, Speaker 4. Hello everyone, I am Speaker 5.</w:t>
-        <w:br/>
-        <w:br/>
-        <w:t>Target 14.2 is anchored by the historic Kunming-Montreal Global Biodiversity Framework, specifically Target 3—widely known as the '30 by 30' commitment. Over 190 countries have pledged to effectively conserve at least 30 percent of coastal and marine areas by the year 2030.</w:t>
-        <w:br/>
-        <w:br/>
-        <w:t>Equally historic is the newly adopted BBNJ Treaty—the Biodiversity Beyond National Jurisdiction treaty. For the first time in human history, the international community has a legal mechanism to designate high-seas marine protected areas in international waters outside any single country's jurisdiction.</w:t>
-        <w:br/>
-        <w:br/>
-        <w:t>[PAUSE — ADVANCE TO SLIDE 10]</w:t>
-        <w:br/>
-        <w:br/>
-        <w:t>Now, we descend into the profound chemical shift of Target 14.3: Ocean Acidification.</w:t>
-        <w:br/>
-        <w:br/>
-        <w:t>The ocean has acted as humanity's greatest climate buffer, absorbing roughly 25 percent of all atmospheric carbon dioxide emissions every year. But that protection comes at an immense chemical price. When CO2 dissolves in seawater, it forms carbonic acid, releasing hydrogen ions.</w:t>
-        <w:br/>
-        <w:br/>
-        <w:t>Since the pre-industrial era, surface ocean pH has dropped by approximately 0.1 units. Because pH is logarithmic, a 0.1 drop represents a 30 percent surge in acidity. Seawater is not turning into vinegar—it remains alkaline—but this drop strips away the carbonate ions that corals, oysters, pteropods, and shellfish need to build their skeletons.</w:t>
-        <w:br/>
-        <w:br/>
-        <w:t>Speaker 6 will now conclude our presentation with how scientists measure ocean pH and how global institutions coordinate action.</w:t>
+        <w:t>Speaker 4 — Target 14.2 Measurement &amp; Governance (Slides 7 &amp; 8)</w:t>
       </w:r>
     </w:p>
     <w:p>
       <w:r>
         <w:rPr>
           <w:b/>
-          <w:color w:val="0284C7"/>
+          <w:color w:val="475569"/>
+          <w:sz w:val="20"/>
         </w:rPr>
-        <w:t xml:space="preserve">Pronunciation Quick Guide: </w:t>
+        <w:t>Time Window: 07:30 to 10:00 (02:30 Target) • Role: Speaker 4 (Biological Auditing &amp; International Treaties)</w:t>
+      </w:r>
+    </w:p>
+    <w:p>
+      <w:r>
+        <w:rPr>
+          <w:b/>
+          <w:sz w:val="20"/>
+        </w:rPr>
+        <w:t xml:space="preserve">Pronunciation Guide: </w:t>
       </w:r>
       <w:r>
         <w:rPr>
           <w:i/>
+          <w:sz w:val="20"/>
         </w:rPr>
-        <w:t>Kunming-Montreal -&gt; [Koon-ming Mon-tree-AWL] | Logarithmic -&gt; [log-uh-RITH-mik] | Pteropods -&gt; [TEH-ruh-pods (silent p)]</w:t>
+        <w:t>Kunming-Montreal [Koon-ming Mon-tree-AWL] | Bathymetry [buh-THIM-uh-tree] | Genomics [juh-NOH-miks]</w:t>
+      </w:r>
+    </w:p>
+    <w:p>
+      <w:pPr>
+        <w:spacing w:line="300" w:lineRule="auto" w:after="120"/>
+      </w:pPr>
+      <w:r>
+        <w:rPr>
+          <w:rFonts w:ascii="Arial" w:hAnsi="Arial"/>
+          <w:b/>
+          <w:color w:val="0284C7"/>
+          <w:sz w:val="22"/>
+        </w:rPr>
+        <w:t>[ON SLIDE 07 — MEASUREMENT 14.2]</w:t>
+      </w:r>
+    </w:p>
+    <w:p>
+      <w:pPr>
+        <w:spacing w:line="300" w:lineRule="auto" w:after="120"/>
+      </w:pPr>
+      <w:r>
+        <w:rPr>
+          <w:rFonts w:ascii="Arial" w:hAnsi="Arial"/>
+          <w:color w:val="0F172A"/>
+          <w:sz w:val="22"/>
+        </w:rPr>
+        <w:t>Thank you, Speaker 3. Hello everyone, I am Speaker 4.</w:t>
+      </w:r>
+    </w:p>
+    <w:p>
+      <w:pPr>
+        <w:spacing w:line="300" w:lineRule="auto" w:after="120"/>
+      </w:pPr>
+      <w:r>
+        <w:rPr>
+          <w:rFonts w:ascii="Arial" w:hAnsi="Arial"/>
+          <w:color w:val="0F172A"/>
+          <w:sz w:val="22"/>
+        </w:rPr>
+        <w:t>Question 3: How do scientists measure real ecological health beyond paperwork?</w:t>
+      </w:r>
+    </w:p>
+    <w:p>
+      <w:pPr>
+        <w:spacing w:line="300" w:lineRule="auto" w:after="120"/>
+      </w:pPr>
+      <w:r>
+        <w:rPr>
+          <w:rFonts w:ascii="Arial" w:hAnsi="Arial"/>
+          <w:color w:val="0F172A"/>
+          <w:sz w:val="22"/>
+        </w:rPr>
+        <w:t>Marine biologists deploy three direct empirical techniques: First, the Global Coral Reef Monitoring Network (GCRMN) conducts standardized scuba transects to measure hard coral cover, structural rugosity, and bleaching mortality.</w:t>
+      </w:r>
+    </w:p>
+    <w:p>
+      <w:pPr>
+        <w:spacing w:line="300" w:lineRule="auto" w:after="120"/>
+      </w:pPr>
+      <w:r>
+        <w:rPr>
+          <w:rFonts w:ascii="Arial" w:hAnsi="Arial"/>
+          <w:color w:val="0F172A"/>
+          <w:sz w:val="22"/>
+        </w:rPr>
+        <w:t>Second, environmental DNA (eDNA) sampling allows scientists to filter a liter of seawater and sequence genetic traces shed by marine organisms, auditing entire fish populations without destructive netting. Third, multibeam sonar bathymetry and airborne LiDAR map the exact boundaries and density of seagrass meadows and mangrove roots.</w:t>
+      </w:r>
+    </w:p>
+    <w:p>
+      <w:pPr>
+        <w:spacing w:line="300" w:lineRule="auto" w:after="120"/>
+      </w:pPr>
+      <w:r>
+        <w:rPr>
+          <w:rFonts w:ascii="Arial" w:hAnsi="Arial"/>
+          <w:b/>
+          <w:color w:val="0284C7"/>
+          <w:sz w:val="22"/>
+        </w:rPr>
+        <w:t>[ADVANCE TO SLIDE 08 — GOVERNANCE 14.2]</w:t>
+      </w:r>
+    </w:p>
+    <w:p>
+      <w:pPr>
+        <w:spacing w:line="300" w:lineRule="auto" w:after="120"/>
+      </w:pPr>
+      <w:r>
+        <w:rPr>
+          <w:rFonts w:ascii="Arial" w:hAnsi="Arial"/>
+          <w:color w:val="0F172A"/>
+          <w:sz w:val="22"/>
+        </w:rPr>
+        <w:t>Question 4: What global governance frameworks enforce Target 14.2?</w:t>
+      </w:r>
+    </w:p>
+    <w:p>
+      <w:pPr>
+        <w:spacing w:line="300" w:lineRule="auto" w:after="120"/>
+      </w:pPr>
+      <w:r>
+        <w:rPr>
+          <w:rFonts w:ascii="Arial" w:hAnsi="Arial"/>
+          <w:color w:val="0F172A"/>
+          <w:sz w:val="22"/>
+        </w:rPr>
+        <w:t>Target 14.2 is driven by two landmark international accords. First is the Kunming-Montreal Global Biodiversity Framework, specifically Target 3—the '30 by 30' commitment, where 190 nations pledged to protect 30 percent of marine and coastal domains by 2030.</w:t>
+      </w:r>
+    </w:p>
+    <w:p>
+      <w:pPr>
+        <w:spacing w:line="300" w:lineRule="auto" w:after="120"/>
+      </w:pPr>
+      <w:r>
+        <w:rPr>
+          <w:rFonts w:ascii="Arial" w:hAnsi="Arial"/>
+          <w:color w:val="0F172A"/>
+          <w:sz w:val="22"/>
+        </w:rPr>
+        <w:t>Second is the historic BBNJ Treaty—Biodiversity Beyond National Jurisdiction. For the first time in legal history, the international community possesses a binding mechanism to establish and enforce Marine Protected Areas in international waters—the High Seas—which cover two-thirds of the global ocean.</w:t>
       </w:r>
     </w:p>
     <w:p>
@@ -987,18 +725,19 @@
           <w:b/>
           <w:color w:val="E11D48"/>
         </w:rPr>
-        <w:t xml:space="preserve">Handoff Cue: </w:t>
+        <w:t xml:space="preserve">🤝 Transition / Handoff Cue: </w:t>
       </w:r>
       <w:r>
         <w:rPr>
           <w:b/>
+          <w:i/>
         </w:rPr>
-        <w:t>"I now hand over to Speaker 6 to conclude with the precision measurement of Target 14.3 and our final synthesis."</w:t>
+        <w:t>"I now hand over to Speaker 5 to investigate Target 14.3 and the invisible chemical crisis of ocean acidification."</w:t>
       </w:r>
     </w:p>
     <w:p>
       <w:r>
-        <w:br w:type="page"/>
+        <w:t>―――――――――――――――――――――――――――――――――――――――――――――――――――――――</w:t>
       </w:r>
     </w:p>
     <w:p>
@@ -1010,168 +749,154 @@
           <w:rFonts w:ascii="Arial" w:hAnsi="Arial"/>
           <w:b/>
           <w:color w:val="0284C7"/>
-          <w:sz w:val="28"/>
+          <w:sz w:val="32"/>
         </w:rPr>
-        <w:t>TAB / SECTION: SPEAKER 6: PRECISION SENSORS, UNESCO &amp; FINAL SYNTHESIS</w:t>
-      </w:r>
-    </w:p>
-    <w:tbl>
-      <w:tblPr>
-        <w:tblW w:type="auto" w:w="0"/>
-        <w:jc w:val="center"/>
-        <w:tblLayout w:type="fixed"/>
-        <w:tblLook w:firstColumn="1" w:firstRow="1" w:lastColumn="0" w:lastRow="0" w:noHBand="0" w:noVBand="1" w:val="04A0"/>
-      </w:tblPr>
-      <w:tblGrid>
-        <w:gridCol w:w="4824"/>
-        <w:gridCol w:w="4824"/>
-      </w:tblGrid>
-      <w:tr>
-        <w:tc>
-          <w:tcPr>
-            <w:tcW w:type="dxa" w:w="2592"/>
-            <w:shd w:fill="F1F5F9"/>
-          </w:tcPr>
-          <w:p>
-            <w:r>
-              <w:rPr>
-                <w:b/>
-              </w:rPr>
-              <w:t>Allocated Time:</w:t>
-            </w:r>
-          </w:p>
-        </w:tc>
-        <w:tc>
-          <w:tcPr>
-            <w:tcW w:type="dxa" w:w="7488"/>
-            <w:shd w:fill="FFFFFF"/>
-          </w:tcPr>
-          <w:p>
-            <w:r>
-              <w:t>12:30 - 15:00 (Target: 2 min 20 sec)</w:t>
-            </w:r>
-          </w:p>
-        </w:tc>
-      </w:tr>
-      <w:tr>
-        <w:tc>
-          <w:tcPr>
-            <w:tcW w:type="dxa" w:w="2592"/>
-            <w:shd w:fill="F1F5F9"/>
-          </w:tcPr>
-          <w:p>
-            <w:r>
-              <w:rPr>
-                <w:b/>
-              </w:rPr>
-              <w:t>Slides Covered:</w:t>
-            </w:r>
-          </w:p>
-        </w:tc>
-        <w:tc>
-          <w:tcPr>
-            <w:tcW w:type="dxa" w:w="7488"/>
-            <w:shd w:fill="FFFFFF"/>
-          </w:tcPr>
-          <w:p>
-            <w:r>
-              <w:t>Slide 11 &amp; Slide 12</w:t>
-            </w:r>
-          </w:p>
-        </w:tc>
-      </w:tr>
-      <w:tr>
-        <w:tc>
-          <w:tcPr>
-            <w:tcW w:type="dxa" w:w="2592"/>
-            <w:shd w:fill="F1F5F9"/>
-          </w:tcPr>
-          <w:p>
-            <w:r>
-              <w:rPr>
-                <w:b/>
-              </w:rPr>
-              <w:t>Core Focus:</w:t>
-            </w:r>
-          </w:p>
-        </w:tc>
-        <w:tc>
-          <w:tcPr>
-            <w:tcW w:type="dxa" w:w="7488"/>
-            <w:shd w:fill="FFFFFF"/>
-          </w:tcPr>
-          <w:p>
-            <w:r>
-              <w:t>Indicator 14.3.1, GOA-ON Autonomous Sensor Network, Total pH Scale, UNESCO-IOC Custodianship, UN Ocean Decade, Conclusion</w:t>
-            </w:r>
-          </w:p>
-        </w:tc>
-      </w:tr>
-    </w:tbl>
-    <w:p>
-      <w:pPr>
-        <w:spacing w:after="160"/>
-      </w:pPr>
-    </w:p>
-    <w:p>
-      <w:pPr>
-        <w:pStyle w:val="Heading2"/>
-      </w:pPr>
-      <w:r>
-        <w:rPr>
-          <w:rFonts w:ascii="Arial" w:hAnsi="Arial"/>
-          <w:color w:val="0F172A"/>
-          <w:sz w:val="24"/>
-        </w:rPr>
-        <w:t>Verbatim Spoken English Script (Read Naturally):</w:t>
-      </w:r>
-    </w:p>
-    <w:p>
-      <w:pPr>
-        <w:spacing w:line="300" w:lineRule="auto" w:after="240"/>
-      </w:pPr>
-      <w:r>
-        <w:rPr>
-          <w:rFonts w:ascii="Arial" w:hAnsi="Arial"/>
-          <w:sz w:val="21"/>
-        </w:rPr>
-        <w:t>Thank you, Speaker 5. Hello everyone, I am Speaker 6, and I will deliver our final synthesis.</w:t>
-        <w:br/>
-        <w:br/>
-        <w:t>Target 14.3 is tracked through Indicator 14.3.1: Average marine acidity measured at representative sampling stations. Measuring ocean acidity is far more complex than dipping litmus paper into water. Seawater pH naturally fluctuates with depth, temperature, water currents, and seasonal plankton blooms.</w:t>
-        <w:br/>
-        <w:br/>
-        <w:t>Under UN metadata, measurement must be conducted on the 'Total pH scale' alongside at least one other carbon parameter, such as Total Dissolved Inorganic Carbon or Total Alkalinity. Scientists deploy high-precision glass electrodes and spectrophotometric sensors mounted on autonomous ocean gliders, deep moorings, and Biogeochemical ARGO robotic floats through the Global Ocean Acidification Observing Network, or GOA-ON.</w:t>
-        <w:br/>
-        <w:br/>
-        <w:t>[PAUSE — ADVANCE TO SLIDE 12]</w:t>
-        <w:br/>
-        <w:br/>
-        <w:t>Who governs Target 14.3? The official global custodian agency is UNESCO’s Intergovernmental Oceanographic Commission, or UNESCO-IOC. UNESCO-IOC coordinates global ocean observations and publishes the global progress reports.</w:t>
-        <w:br/>
-        <w:br/>
-        <w:t>The biggest operational challenge is the geographic data gap. Wealthy developed nations maintain hundreds of autonomous sensor stations, while small island developing states—who depend most heavily on coral reefs for survival—often have zero continuous monitoring buoys. Under the UN Decade of Ocean Science, UNESCO is distributing low-cost monitoring kits called 'Ocean Acidification in a Box' to bridge this divide.</w:t>
-        <w:br/>
-        <w:br/>
-        <w:t>In conclusion: SDG 14 teaches us that the ocean is one continuous, interconnected planetary system. Land pollution under 14.1, ecosystem resilience under 14.2, and ocean chemistry under 14.3 cannot be solved separately. Stopping plastic at the source, enforcing the 30x30 reserves, and slashing greenhouse gas emissions are three parts of a single mission: preserving life below water.</w:t>
-        <w:br/>
-        <w:br/>
-        <w:t>Thank you very much for your attention. Our team is now delighted to take your questions.</w:t>
+        <w:t>Speaker 5 — Target 14.3 Aim &amp; Indicators (Slides 9 &amp; 10)</w:t>
       </w:r>
     </w:p>
     <w:p>
       <w:r>
         <w:rPr>
           <w:b/>
-          <w:color w:val="0284C7"/>
+          <w:color w:val="475569"/>
+          <w:sz w:val="20"/>
         </w:rPr>
-        <w:t xml:space="preserve">Pronunciation Quick Guide: </w:t>
+        <w:t>Time Window: 10:00 to 12:30 (02:30 Target) • Role: Speaker 5 (Ocean Chemistry &amp; Carbon Sink Dynamics)</w:t>
+      </w:r>
+    </w:p>
+    <w:p>
+      <w:r>
+        <w:rPr>
+          <w:b/>
+          <w:sz w:val="20"/>
+        </w:rPr>
+        <w:t xml:space="preserve">Pronunciation Guide: </w:t>
       </w:r>
       <w:r>
         <w:rPr>
           <w:i/>
+          <w:sz w:val="20"/>
         </w:rPr>
-        <w:t>Spectrophotometric -&gt; [spek-troh-foh-toh-MET-rik] | Intergovernmental -&gt; [in-ter-guh-vern-MEN-tuhl] | Alkalinity -&gt; [al-kuh-LIN-uh-tee]</w:t>
+        <w:t>Acidification [uh-sid-uh-fuh-KAY-shun] | Logarithmic [log-uh-RITH-mik] | Aragonite [uh-RAG-uh-nyte]</w:t>
+      </w:r>
+    </w:p>
+    <w:p>
+      <w:pPr>
+        <w:spacing w:line="300" w:lineRule="auto" w:after="120"/>
+      </w:pPr>
+      <w:r>
+        <w:rPr>
+          <w:rFonts w:ascii="Arial" w:hAnsi="Arial"/>
+          <w:b/>
+          <w:color w:val="0284C7"/>
+          <w:sz w:val="22"/>
+        </w:rPr>
+        <w:t>[ON SLIDE 09 — TARGET 14.3 AIM]</w:t>
+      </w:r>
+    </w:p>
+    <w:p>
+      <w:pPr>
+        <w:spacing w:line="300" w:lineRule="auto" w:after="120"/>
+      </w:pPr>
+      <w:r>
+        <w:rPr>
+          <w:rFonts w:ascii="Arial" w:hAnsi="Arial"/>
+          <w:color w:val="0F172A"/>
+          <w:sz w:val="22"/>
+        </w:rPr>
+        <w:t>Thank you, Speaker 4. Hello everyone, I am Speaker 5.</w:t>
+      </w:r>
+    </w:p>
+    <w:p>
+      <w:pPr>
+        <w:spacing w:line="300" w:lineRule="auto" w:after="120"/>
+      </w:pPr>
+      <w:r>
+        <w:rPr>
+          <w:rFonts w:ascii="Arial" w:hAnsi="Arial"/>
+          <w:color w:val="0F172A"/>
+          <w:sz w:val="22"/>
+        </w:rPr>
+        <w:t>We descend into Target 14.3: Ocean Acidification. Question 1: What is the aim?</w:t>
+      </w:r>
+    </w:p>
+    <w:p>
+      <w:pPr>
+        <w:spacing w:line="300" w:lineRule="auto" w:after="120"/>
+      </w:pPr>
+      <w:r>
+        <w:rPr>
+          <w:rFonts w:ascii="Arial" w:hAnsi="Arial"/>
+          <w:color w:val="0F172A"/>
+          <w:sz w:val="22"/>
+        </w:rPr>
+        <w:t>The mandate requires humanity to minimize and address the impacts of ocean acidification, including through enhanced scientific cooperation at all levels. The ocean has served as Earth's primary climate shield, absorbing roughly 25 percent of all human-generated CO2 emissions. But this protection carries a grave chemical cost.</w:t>
+      </w:r>
+    </w:p>
+    <w:p>
+      <w:pPr>
+        <w:spacing w:line="300" w:lineRule="auto" w:after="120"/>
+      </w:pPr>
+      <w:r>
+        <w:rPr>
+          <w:rFonts w:ascii="Arial" w:hAnsi="Arial"/>
+          <w:color w:val="0F172A"/>
+          <w:sz w:val="22"/>
+        </w:rPr>
+        <w:t>When CO2 dissolves in seawater, it forms carbonic acid, releasing hydrogen ions. Since the industrial revolution, surface ocean pH has declined by 0.1 units. Because pH is on a logarithmic scale, a 0.1 decline represents a 30 percent surge in hydrogen ion acidity, stripping away the carbonate ions that shellfish, pteropods, and corals require to construct their protective shells.</w:t>
+      </w:r>
+    </w:p>
+    <w:p>
+      <w:pPr>
+        <w:spacing w:line="300" w:lineRule="auto" w:after="120"/>
+      </w:pPr>
+      <w:r>
+        <w:rPr>
+          <w:rFonts w:ascii="Arial" w:hAnsi="Arial"/>
+          <w:b/>
+          <w:color w:val="0284C7"/>
+          <w:sz w:val="22"/>
+        </w:rPr>
+        <w:t>[ADVANCE TO SLIDE 10 — INDICATOR 14.3.1]</w:t>
+      </w:r>
+    </w:p>
+    <w:p>
+      <w:pPr>
+        <w:spacing w:line="300" w:lineRule="auto" w:after="120"/>
+      </w:pPr>
+      <w:r>
+        <w:rPr>
+          <w:rFonts w:ascii="Arial" w:hAnsi="Arial"/>
+          <w:color w:val="0F172A"/>
+          <w:sz w:val="22"/>
+        </w:rPr>
+        <w:t>Question 2: What is the official indicator?</w:t>
+      </w:r>
+    </w:p>
+    <w:p>
+      <w:pPr>
+        <w:spacing w:line="300" w:lineRule="auto" w:after="120"/>
+      </w:pPr>
+      <w:r>
+        <w:rPr>
+          <w:rFonts w:ascii="Arial" w:hAnsi="Arial"/>
+          <w:color w:val="0F172A"/>
+          <w:sz w:val="22"/>
+        </w:rPr>
+        <w:t>The UN designated Indicator 14.3.1: Average marine acidity (pH) measured at an agreed suite of representative sampling stations. Measuring pH requires extraordinary scientific precision—down to 0.002 pH units on the 'Total pH scale' (pHT).</w:t>
+      </w:r>
+    </w:p>
+    <w:p>
+      <w:pPr>
+        <w:spacing w:line="300" w:lineRule="auto" w:after="120"/>
+      </w:pPr>
+      <w:r>
+        <w:rPr>
+          <w:rFonts w:ascii="Arial" w:hAnsi="Arial"/>
+          <w:color w:val="0F172A"/>
+          <w:sz w:val="22"/>
+        </w:rPr>
+        <w:t>Crucially, UN metadata mandates that pH must be reported alongside at least one co-parameter: Total Dissolved Inorganic Carbon (DIC) or Total Alkalinity. This enables calculation of the Aragonite Saturation State (Omega), determining the exact threshold where seawater transitions from nourishing shells to actively corroding them.</w:t>
       </w:r>
     </w:p>
     <w:p>
@@ -1180,23 +905,204 @@
           <w:b/>
           <w:color w:val="E11D48"/>
         </w:rPr>
-        <w:t xml:space="preserve">Handoff Cue: </w:t>
+        <w:t xml:space="preserve">🤝 Transition / Handoff Cue: </w:t>
       </w:r>
       <w:r>
         <w:rPr>
           <w:b/>
+          <w:i/>
         </w:rPr>
-        <w:t>"Thank you everyone. We invite our professor and classmates to share your feedback and questions."</w:t>
+        <w:t>"Speaker 6 will now conclude with autonomous robotic sensors, UNESCO governance, and our team's final synthesis."</w:t>
       </w:r>
     </w:p>
     <w:p>
       <w:r>
-        <w:br w:type="page"/>
+        <w:t>―――――――――――――――――――――――――――――――――――――――――――――――――――――――</w:t>
+      </w:r>
+    </w:p>
+    <w:p>
+      <w:pPr>
+        <w:pStyle w:val="Heading1"/>
+      </w:pPr>
+      <w:r>
+        <w:rPr>
+          <w:rFonts w:ascii="Arial" w:hAnsi="Arial"/>
+          <w:b/>
+          <w:color w:val="0284C7"/>
+          <w:sz w:val="32"/>
+        </w:rPr>
+        <w:t>Speaker 6 — Target 14.3 Measurement, Governance &amp; Synthesis (Slides 11 &amp; 12)</w:t>
+      </w:r>
+    </w:p>
+    <w:p>
+      <w:r>
+        <w:rPr>
+          <w:b/>
+          <w:color w:val="475569"/>
+          <w:sz w:val="20"/>
+        </w:rPr>
+        <w:t>Time Window: 12:30 to 15:00 (02:30 Target) • Role: Speaker 6 (Robotic Profiling, UNESCO &amp; Team Synthesis)</w:t>
+      </w:r>
+    </w:p>
+    <w:p>
+      <w:r>
+        <w:rPr>
+          <w:b/>
+          <w:sz w:val="20"/>
+        </w:rPr>
+        <w:t xml:space="preserve">Pronunciation Guide: </w:t>
+      </w:r>
+      <w:r>
+        <w:rPr>
+          <w:i/>
+          <w:sz w:val="20"/>
+        </w:rPr>
+        <w:t>Spectrophotometric [spek-troh-foh-toh-MET-rik] | Intergovernmental [in-ter-guh-vern-MEN-tuhl] | Synthesis [SIN-thuh-sis]</w:t>
+      </w:r>
+    </w:p>
+    <w:p>
+      <w:pPr>
+        <w:spacing w:line="300" w:lineRule="auto" w:after="120"/>
+      </w:pPr>
+      <w:r>
+        <w:rPr>
+          <w:rFonts w:ascii="Arial" w:hAnsi="Arial"/>
+          <w:b/>
+          <w:color w:val="0284C7"/>
+          <w:sz w:val="22"/>
+        </w:rPr>
+        <w:t>[ON SLIDE 11 — MEASUREMENT 14.3]</w:t>
+      </w:r>
+    </w:p>
+    <w:p>
+      <w:pPr>
+        <w:spacing w:line="300" w:lineRule="auto" w:after="120"/>
+      </w:pPr>
+      <w:r>
+        <w:rPr>
+          <w:rFonts w:ascii="Arial" w:hAnsi="Arial"/>
+          <w:color w:val="0F172A"/>
+          <w:sz w:val="22"/>
+        </w:rPr>
+        <w:t>Thank you, Speaker 5. Hello everyone, I am Speaker 6, and I will deliver our final section and synthesis.</w:t>
+      </w:r>
+    </w:p>
+    <w:p>
+      <w:pPr>
+        <w:spacing w:line="300" w:lineRule="auto" w:after="120"/>
+      </w:pPr>
+      <w:r>
+        <w:rPr>
+          <w:rFonts w:ascii="Arial" w:hAnsi="Arial"/>
+          <w:color w:val="0F172A"/>
+          <w:sz w:val="22"/>
+        </w:rPr>
+        <w:t>Question 3: How is ocean acidity measured scientifically?</w:t>
+      </w:r>
+    </w:p>
+    <w:p>
+      <w:pPr>
+        <w:spacing w:line="300" w:lineRule="auto" w:after="120"/>
+      </w:pPr>
+      <w:r>
+        <w:rPr>
+          <w:rFonts w:ascii="Arial" w:hAnsi="Arial"/>
+          <w:color w:val="0F172A"/>
+          <w:sz w:val="22"/>
+        </w:rPr>
+        <w:t>Because ocean pH fluctuates with depth, temperature, and seasonal biology, scientists cannot rely on simple spot checks. Measurement is executed through the Global Ocean Acidification Observing Network (GOA-ON).</w:t>
+      </w:r>
+    </w:p>
+    <w:p>
+      <w:pPr>
+        <w:spacing w:line="300" w:lineRule="auto" w:after="120"/>
+      </w:pPr>
+      <w:r>
+        <w:rPr>
+          <w:rFonts w:ascii="Arial" w:hAnsi="Arial"/>
+          <w:color w:val="0F172A"/>
+          <w:sz w:val="22"/>
+        </w:rPr>
+        <w:t>Key technologies include autonomous Biogeochemical Argo profiling floats (BGC-Argo) that dive to 2,000 meters measuring pH with ion-sensitive field-effect transistors (ISFET), fixed deep-sea ocean moorings, and automated spectrophotometry using purified m-Cresol purple dye aboard oceanographic research vessels.</w:t>
+      </w:r>
+    </w:p>
+    <w:p>
+      <w:pPr>
+        <w:spacing w:line="300" w:lineRule="auto" w:after="120"/>
+      </w:pPr>
+      <w:r>
+        <w:rPr>
+          <w:rFonts w:ascii="Arial" w:hAnsi="Arial"/>
+          <w:b/>
+          <w:color w:val="0284C7"/>
+          <w:sz w:val="22"/>
+        </w:rPr>
+        <w:t>[ADVANCE TO SLIDE 12 — GOVERNANCE 14.3 &amp; SYNTHESIS]</w:t>
+      </w:r>
+    </w:p>
+    <w:p>
+      <w:pPr>
+        <w:spacing w:line="300" w:lineRule="auto" w:after="120"/>
+      </w:pPr>
+      <w:r>
+        <w:rPr>
+          <w:rFonts w:ascii="Arial" w:hAnsi="Arial"/>
+          <w:color w:val="0F172A"/>
+          <w:sz w:val="22"/>
+        </w:rPr>
+        <w:t>Question 4: Who governs Target 14.3 and what is the final synthesis?</w:t>
+      </w:r>
+    </w:p>
+    <w:p>
+      <w:pPr>
+        <w:spacing w:line="300" w:lineRule="auto" w:after="120"/>
+      </w:pPr>
+      <w:r>
+        <w:rPr>
+          <w:rFonts w:ascii="Arial" w:hAnsi="Arial"/>
+          <w:color w:val="0F172A"/>
+          <w:sz w:val="22"/>
+        </w:rPr>
+        <w:t>The custodian agency is UNESCO’s Intergovernmental Oceanographic Commission (IOC-UNESCO). IOC coordinates GOA-ON and maintains the global data repository. A major focus is resolving global equity: Small Island Developing States (SIDS) face the highest vulnerability but have historically had the fewest monitoring buoys. Through the UN Ocean Decade, UNESCO deploys 'Ocean Acidification in a Box' low-cost testing kits to close this gap.</w:t>
+      </w:r>
+    </w:p>
+    <w:p>
+      <w:pPr>
+        <w:spacing w:line="300" w:lineRule="auto" w:after="120"/>
+      </w:pPr>
+      <w:r>
+        <w:rPr>
+          <w:rFonts w:ascii="Arial" w:hAnsi="Arial"/>
+          <w:color w:val="0F172A"/>
+          <w:sz w:val="22"/>
+        </w:rPr>
+        <w:t>To conclude: SDG 14 demonstrates that the ocean is one indivisible planetary life-support system. Land-based pollution under 14.1, habitat resilience under 14.2, and ocean chemistry under 14.3 are deeply intertwined. Halting plastic and fertilizer runoff, enforcing the 30x30 marine reserves, and slashing greenhouse gas emissions under the Paris Agreement are not separate goals—they are three pillars of one unified mission: protecting life below water.</w:t>
+      </w:r>
+    </w:p>
+    <w:p>
+      <w:r>
+        <w:rPr>
+          <w:b/>
+          <w:color w:val="E11D48"/>
+        </w:rPr>
+        <w:t xml:space="preserve">🤝 Transition / Handoff Cue: </w:t>
+      </w:r>
+      <w:r>
+        <w:rPr>
+          <w:b/>
+          <w:i/>
+        </w:rPr>
+        <w:t>"Thank you for your attention. Our team is now delighted to take any questions from the class."</w:t>
+      </w:r>
+    </w:p>
+    <w:p>
+      <w:r>
+        <w:t>―――――――――――――――――――――――――――――――――――――――――――――――――――――――</w:t>
       </w:r>
     </w:p>
     <w:sectPr>
       <w:pgSz w:w="12240" w:h="15840"/>
-      <w:pgMar w:top="1152" w:right="1296" w:bottom="1152" w:left="1296" w:header="720" w:footer="720" w:gutter="0"/>
+      <w:pgMar w:top="1440" w:right="1440" w:bottom="1440" w:left="1440" w:header="720" w:footer="720" w:gutter="0"/>
       <w:cols w:space="720"/>
       <w:docGrid w:linePitch="360"/>
     </w:sectPr>

</xml_diff>